<commit_message>
Manuscript: preliminary framing, stability expectation, 2021-2026 references
Co-Authored-By: Claude Opus 5.5 <noreply@anthropic.com>
Claude-Session: https://claude.ai/code/session_01RKBYJsspEG8XXPu9eJdzD5
</commit_message>
<xml_diff>
--- a/Results/AGEM - Time series manuscript.docx
+++ b/Results/AGEM - Time series manuscript.docx
@@ -29,7 +29,7 @@
           <w:sz w:val="24"/>
           <w:szCs w:val="24"/>
         </w:rPr>
-        <w:t xml:space="preserve">2026-10-15 - 21:26</w:t>
+        <w:t xml:space="preserve">2026-10-16 - 13:23</w:t>
       </w:r>
     </w:p>
     <w:p>
@@ -45,7 +45,7 @@
           <w:sz w:val="24"/>
           <w:szCs w:val="24"/>
         </w:rPr>
-        <w:t xml:space="preserve">Stability and Change in Psychosocial Risk Indicators Across Monitoring Waves in Two Brazilian Companies: A Repeated Cross Sectional Study</w:t>
+        <w:t xml:space="preserve">Stability and Change in Psychosocial Risk Indicators Across Monitoring Waves in Two Brazilian Companies: Preliminary Findings From a Repeated Cross Sectional Study</w:t>
       </w:r>
     </w:p>
     <w:p>
@@ -125,7 +125,7 @@
           <w:sz w:val="24"/>
           <w:szCs w:val="24"/>
         </w:rPr>
-        <w:t xml:space="preserve"> = 111 and 105). Analyses were restricted to items worded identically across waves: 8 leader items and 38 employee items. Change across waves was estimated for each item with proportional odds models adjusted for company. No leader item changed across the three waves. Among employees, 36 of 38 items were stable. Freedom to organize one’s activities (odds ratio = 0.52) and encouragement to use creativity and knowledge (odds ratio = 0.54) decreased between waves. Two of 46 tests reached </w:t>
+        <w:t xml:space="preserve"> = 111 and 105). Analyses were restricted to items worded identically across waves: 8 leader items and 38 employee items. Given the short interval between waves, stability was expected. Change across waves was estimated for each item with proportional odds models adjusted for company. No leader item changed across the three waves. Among employees, 36 of 38 items were stable. Freedom to organize one’s activities (odds ratio = 0.52) and encouragement to use creativity and knowledge (odds ratio = 0.54) decreased between waves. Two of 46 tests reached </w:t>
       </w:r>
       <w:r>
         <w:rPr>
@@ -143,7 +143,7 @@
           <w:sz w:val="24"/>
           <w:szCs w:val="24"/>
         </w:rPr>
-        <w:t xml:space="preserve"> &lt; .05, close to the number expected by chance. Psychosocial risk indicators were largely stable over four to eight months. The repeated cross sectional design, the small leader samples and the unvalidated items limit inference.</w:t>
+        <w:t xml:space="preserve"> &lt; .05, close to the number expected by chance. As expected, psychosocial risk indicators were largely stable over four to eight months. These findings are preliminary. The repeated cross sectional design, the small leader samples and the unvalidated items limit inference.</w:t>
       </w:r>
     </w:p>
     <w:p>
@@ -197,7 +197,7 @@
           <w:sz w:val="24"/>
           <w:szCs w:val="24"/>
         </w:rPr>
-        <w:t xml:space="preserve">Psychosocial hazards at work are associated with ill health, injury and losses in productivity, and their prevention depends on how work is organized and managed (Schulte et al., 2024; World Health Organization, 2022). In 2024, Brazil amended Regulatory Standard No. 1 (NR-1) to require employers to identify, evaluate and record psychosocial risk factors in the risk inventory of their occupational risk management program (Ministério do Trabalho e Emprego, 2024). The regulation does not specify how these factors should be assessed (Ministério do Trabalho e Emprego, 2024).</w:t>
+        <w:t xml:space="preserve">Psychosocial hazards at work are associated with ill health, injury and losses in productivity, and their prevention depends on how work is organized and managed (Schulte et al., 2024; World Health Organization, 2022). In a meta-review of 72 reviews with meta-analyses, job strain and long working hours were associated with depression (Niedhammer et al., 2021), and exposure to some working conditions increases the risk of the onset of depressive disorders (Rugulies et al., 2023). In Brazil, mental and behavioral disorders are among the main causes of absence from work (Bouzada et al., 2023). In 2024, Brazil amended Regulatory Standard No. 1 (NR-1) to require employers to identify, evaluate and record psychosocial risk factors in the risk inventory of their occupational risk management program (Ministério do Trabalho e Emprego, 2024). The regulation does not specify how these factors should be assessed (Ministério do Trabalho e Emprego, 2024). Despite this regulatory change, psychosocial factors at work have been described as insufficiently addressed in Brazil (de Lucca et al., 2025).</w:t>
       </w:r>
     </w:p>
     <w:p>
@@ -211,7 +211,7 @@
           <w:sz w:val="24"/>
           <w:szCs w:val="24"/>
         </w:rPr>
-        <w:t xml:space="preserve">Psychosocial risk factors are conditions of work design, organization and management that can cause harm, and mental health symptoms are one possible consequence of exposure to them (International Organization for Standardization, 2021; Teixeira et al., 2025). In the Job Demands-Resources model, strain develops when job demands are high and job resources such as autonomy and supervisory support are insufficient (Bakker &amp; Demerouti, 2007; Demerouti et al., 2001). Low work autonomy has been associated with poorer mental health (Lu et al., 2023), and poor quality of leadership has predicted later mental distress (Burr et al., 2025; Fløvik et al., 2020).</w:t>
+        <w:t xml:space="preserve">Psychosocial risk factors are conditions of work design, organization and management that can cause harm, and mental health symptoms are one possible consequence of exposure to them (International Organization for Standardization, 2021; Teixeira et al., 2025). In the Job Demands-Resources model, strain develops when job demands are high and job resources such as autonomy and supervisory support are insufficient (Bakker &amp; Demerouti, 2007; Demerouti et al., 2001). Low work autonomy has been associated with poorer mental health (Lu et al., 2023), and persistent low job control has predicted later major depression (Taouk et al., 2024). Low freedom at work has also predicted later mental health service use (Niedhammer et al., 2026), and poor quality of leadership has predicted later mental distress (Burr et al., 2025; Fløvik et al., 2020).</w:t>
       </w:r>
     </w:p>
     <w:p>
@@ -225,7 +225,7 @@
           <w:sz w:val="24"/>
           <w:szCs w:val="24"/>
         </w:rPr>
-        <w:t xml:space="preserve">Guidance on psychosocial risk management describes assessment as part of a continuing cycle of identification, action and review (International Organization for Standardization, 2021). Monitoring therefore requires that the same indicators be measured at successive points in time. Anonymous workforce surveys protect employees, but their responses cannot be linked over time, so successive waves describe the workforce rather than individuals ([Authors], under review). A recent review identified 66 mental health and well being assessments with utility for employers (Imboden et al., 2024). To our knowledge, few studies describe how psychosocial risk indicators evolve across monitoring waves in Brazilian companies.</w:t>
+        <w:t xml:space="preserve">Guidance on psychosocial risk management describes assessment as part of a continuing cycle of identification, action and review (International Organization for Standardization, 2021). Organizational level interventions can improve the psychosocial work environment and the health of employees (Aust et al., 2023; Rugulies et al., 2023). In Europe, national legislation on psychosocial risks has been associated with more enterprises having action plans for work related stress, and these plans with more job resources (Jain et al., 2022). Monitoring therefore requires that the same indicators be measured at successive points in time. Anonymous workforce surveys protect employees, but their responses cannot be linked over time, so successive waves describe the workforce rather than individuals ([Authors], under review). A recent review identified 66 mental health and well being assessments with utility for employers (Imboden et al., 2024). To our knowledge, few studies describe how psychosocial risk indicators evolve across monitoring waves in Brazilian companies.</w:t>
       </w:r>
     </w:p>
     <w:p>
@@ -255,7 +255,7 @@
           <w:sz w:val="24"/>
           <w:szCs w:val="24"/>
         </w:rPr>
-        <w:t xml:space="preserve">Companies subject to NR-1 need evidence on whether the indicators they collect remain stable or change between assessments. The goal of this study is to describe the evolution of psychosocial risk indicators across repeated anonymous monitoring waves among leaders, assessed at three waves, and employees, assessed at two waves, in two Brazilian companies. The analysis is exploratory, and no directional hypotheses were specified.</w:t>
+        <w:t xml:space="preserve">Companies subject to NR-1 need evidence on whether the indicators they collect remain stable or change between assessments. The goal of this study is to describe the evolution of psychosocial risk indicators across repeated anonymous monitoring waves among leaders, assessed at three waves, and employees, assessed at two waves, in two Brazilian companies. Psychosocial risk factors reflect conditions of work design, organization and management (International Organization for Standardization, 2021; Teixeira et al., 2025), which are unlikely to change substantially within a few months. Given the short interval between waves, we expected most indicators to remain stable. The analysis is exploratory, and its results are preliminary.</w:t>
       </w:r>
     </w:p>
     <w:p>
@@ -16519,7 +16519,7 @@
           <w:sz w:val="24"/>
           <w:szCs w:val="24"/>
         </w:rPr>
-        <w:t xml:space="preserve">Companies subject to NR-1 need to know whether the psychosocial risk indicators they collect remain stable between assessments. This study described the evolution of these indicators across anonymous monitoring waves among leaders and employees of two Brazilian companies. Most indicators were stable. No leader item changed over three waves, and 36 of 38 employee items did not change between two waves. The two changes concerned job resources: freedom to organize one’s activities and encouragement to use creativity and knowledge decreased among employees.</w:t>
+        <w:t xml:space="preserve">Companies subject to NR-1 need to know whether the psychosocial risk indicators they collect remain stable between assessments. This study described the evolution of these indicators across anonymous monitoring waves among leaders and employees of two Brazilian companies. As expected, most indicators were stable. No leader item changed over three waves, and 36 of 38 employee items did not change between two waves. The two changes concerned job resources: freedom to organize one’s activities and encouragement to use creativity and knowledge decreased among employees.</w:t>
       </w:r>
     </w:p>
     <w:p>
@@ -16533,7 +16533,7 @@
           <w:sz w:val="24"/>
           <w:szCs w:val="24"/>
         </w:rPr>
-        <w:t xml:space="preserve">The predominance of stability is consistent with the view of psychosocial risk factors as conditions of work design, organization and management (International Organization for Standardization, 2021; Teixeira et al., 2025), which may change slowly over a few months. [Cite studies reporting the stability of psychosocial work factor measures over repeated assessments.] Two significant results among 46 tests is close to the 2.3 expected by chance at </w:t>
+        <w:t xml:space="preserve">The predominance of stability is consistent with our expectation and with the view of psychosocial risk factors as conditions of work design, organization and management (International Organization for Standardization, 2021; Teixeira et al., 2025), which may change slowly over a few months. Scales of psychosocial work factors have shown acceptable test retest reliability among Brazilian workers (Gonçalves et al., 2021), so stable responses are expected when working conditions do not change. Two significant results among 46 tests is close to the 2.3 expected by chance at </w:t>
       </w:r>
       <w:r>
         <w:rPr>
@@ -16565,7 +16565,7 @@
           <w:sz w:val="24"/>
           <w:szCs w:val="24"/>
         </w:rPr>
-        <w:t xml:space="preserve">Both items that changed describe autonomy, a job resource in the Job Demands-Resources model (Bakker &amp; Demerouti, 2007; Demerouti et al., 2001). Low work autonomy has been associated with poorer mental health (Lu et al., 2023). In the present data, the decrease in autonomy items was not accompanied by changes in the symptom items. This pattern may indicate that a reduction in resources had not yet been reflected in symptoms, that the change was too small to affect them or that the two results are chance findings. [Cite longitudinal evidence on the time lag between changes in job resources and mental health.]</w:t>
+        <w:t xml:space="preserve">Both items that changed describe autonomy, a job resource in the Job Demands-Resources model (Bakker &amp; Demerouti, 2007; Demerouti et al., 2001). Low work autonomy has been associated with poorer mental health (Lu et al., 2023). In the present data, the decrease in autonomy items was not accompanied by changes in the symptom items. This pattern may indicate that a reduction in resources had not yet been reflected in symptoms, that the change was too small to affect them or that the two results are chance findings. In a prospective cohort, persistent low job control showed a stronger association with later major depression than intermittent low job control (Taouk et al., 2024). A short reduction in autonomy may therefore not be reflected in symptoms within a few months.</w:t>
       </w:r>
     </w:p>
     <w:p>
@@ -16623,7 +16623,7 @@
           <w:sz w:val="24"/>
           <w:szCs w:val="24"/>
         </w:rPr>
-        <w:t xml:space="preserve">The design was repeated cross sectional. Responses could not be linked across waves, so changes in the composition of the respondents cannot be separated from changes within individuals. Adjusting for company addresses differences between companies but not turnover within them; the share of employees with less than one year in their company rose from 61.8% to 69.0%. The leader samples were small, with 18 to 22 respondents per wave. The proportional odds assumption was not tested. The items have not been validated ([Authors], under review). The program delivered between waves and the absence of a comparison group prevent any causal interpretation of change or stability. All data were self reported, which exposes the comparisons to common method bias (Podsakoff et al., 2003).</w:t>
+        <w:t xml:space="preserve">The design was repeated cross sectional. Responses could not be linked across waves, so changes in the composition of the respondents cannot be separated from changes within individuals. Adjusting for company addresses differences between companies but not turnover within them; the share of employees with less than one year in their company rose from 61.8% to 69.0%. The leader samples were small, with 18 to 22 respondents per wave. The proportional odds assumption was not tested. The items have not been validated ([Authors], under review). The program delivered between waves and the absence of a comparison group prevent any causal interpretation of change or stability. All data were self reported, which exposes the comparisons to common method bias (Podsakoff et al., 2003). For these reasons, the results should be regarded as preliminary.</w:t>
       </w:r>
     </w:p>
     <w:p>
@@ -16683,7 +16683,7 @@
           <w:sz w:val="24"/>
           <w:szCs w:val="24"/>
         </w:rPr>
-        <w:t xml:space="preserve">Across four to eight months, psychosocial risk indicators among leaders and employees of two Brazilian companies were largely stable. The only changes were decreases in two job resource items among employees.</w:t>
+        <w:t xml:space="preserve">These preliminary results show that, across four to eight months, psychosocial risk indicators among leaders and employees of two Brazilian companies were largely stable, as expected given the short interval. The only changes were decreases in two job resource items among employees.</w:t>
       </w:r>
     </w:p>
     <w:p>
@@ -16738,7 +16738,7 @@
           <w:sz w:val="24"/>
           <w:szCs w:val="24"/>
         </w:rPr>
-        <w:t xml:space="preserve">Bakker, A. B., &amp; Demerouti, E. (2007). The Job Demands-Resources model: State of the art. </w:t>
+        <w:t xml:space="preserve">Aust, B., Møller, J. L., Nordentoft, M., Frydendall, K. B., Bengtsen, E., Jensen, A. B., Garde, A. H., Kompier, M., Semmer, N., Rugulies, R., &amp; Jaspers, S. Ø. (2023). How effective are organizational-level interventions in improving the psychosocial work environment, health, and retention of workers? A systematic overview of systematic reviews. </w:t>
       </w:r>
       <w:r>
         <w:rPr>
@@ -16748,15 +16748,15 @@
           <w:sz w:val="24"/>
           <w:szCs w:val="24"/>
         </w:rPr>
-        <w:t xml:space="preserve">Journal of Managerial Psychology, 22</w:t>
-      </w:r>
-      <w:r>
-        <w:rPr>
-          <w:rFonts w:ascii="Times New Roman" w:cs="Times New Roman" w:eastAsia="Times New Roman" w:hAnsi="Times New Roman"/>
-          <w:sz w:val="24"/>
-          <w:szCs w:val="24"/>
-        </w:rPr>
-        <w:t xml:space="preserve">(3), 309–328. https://doi.org/10.1108/02683940710733115</w:t>
+        <w:t xml:space="preserve">Scandinavian Journal of Work, Environment &amp; Health, 49</w:t>
+      </w:r>
+      <w:r>
+        <w:rPr>
+          <w:rFonts w:ascii="Times New Roman" w:cs="Times New Roman" w:eastAsia="Times New Roman" w:hAnsi="Times New Roman"/>
+          <w:sz w:val="24"/>
+          <w:szCs w:val="24"/>
+        </w:rPr>
+        <w:t xml:space="preserve">(5), 315–329. https://doi.org/10.5271/sjweh.4097</w:t>
       </w:r>
     </w:p>
     <w:p>
@@ -16770,7 +16770,7 @@
           <w:sz w:val="24"/>
           <w:szCs w:val="24"/>
         </w:rPr>
-        <w:t xml:space="preserve">Burr, H., Kersten, N., Sørensen, K., Sørensen, J. K., Dalsager, L., Madsen, I. E. H., Schöllgen, I., d’Errico, A., Rose, U., &amp; Rugulies, R. (2025). A comparison among employees in Germany and Denmark of associations between quality of leadership and subsequent 5-year development of mental distress. </w:t>
+        <w:t xml:space="preserve">Bakker, A. B., &amp; Demerouti, E. (2007). The Job Demands-Resources model: State of the art. </w:t>
       </w:r>
       <w:r>
         <w:rPr>
@@ -16780,15 +16780,15 @@
           <w:sz w:val="24"/>
           <w:szCs w:val="24"/>
         </w:rPr>
-        <w:t xml:space="preserve">Scientific Reports, 15</w:t>
-      </w:r>
-      <w:r>
-        <w:rPr>
-          <w:rFonts w:ascii="Times New Roman" w:cs="Times New Roman" w:eastAsia="Times New Roman" w:hAnsi="Times New Roman"/>
-          <w:sz w:val="24"/>
-          <w:szCs w:val="24"/>
-        </w:rPr>
-        <w:t xml:space="preserve">(1), 7802. https://doi.org/10.1038/s41598-025-92650-0</w:t>
+        <w:t xml:space="preserve">Journal of Managerial Psychology, 22</w:t>
+      </w:r>
+      <w:r>
+        <w:rPr>
+          <w:rFonts w:ascii="Times New Roman" w:cs="Times New Roman" w:eastAsia="Times New Roman" w:hAnsi="Times New Roman"/>
+          <w:sz w:val="24"/>
+          <w:szCs w:val="24"/>
+        </w:rPr>
+        <w:t xml:space="preserve">(3), 309–328. https://doi.org/10.1108/02683940710733115</w:t>
       </w:r>
     </w:p>
     <w:p>
@@ -16802,7 +16802,7 @@
           <w:sz w:val="24"/>
           <w:szCs w:val="24"/>
         </w:rPr>
-        <w:t xml:space="preserve">Conselho Nacional de Saúde. (2016). </w:t>
+        <w:t xml:space="preserve">Bouzada, D. F., Sol, N. A. A., &amp; da Silva, C. A. M. (2023). Absenteeism due to mental and behavioral disorder in employees of a federal university. </w:t>
       </w:r>
       <w:r>
         <w:rPr>
@@ -16812,15 +16812,15 @@
           <w:sz w:val="24"/>
           <w:szCs w:val="24"/>
         </w:rPr>
-        <w:t xml:space="preserve">Resolução nº 510, de 7 de abril de 2016. Dispõe sobre as normas aplicáveis a pesquisas em Ciências Humanas e Sociais.</w:t>
-      </w:r>
-      <w:r>
-        <w:rPr>
-          <w:rFonts w:ascii="Times New Roman" w:cs="Times New Roman" w:eastAsia="Times New Roman" w:hAnsi="Times New Roman"/>
-          <w:sz w:val="24"/>
-          <w:szCs w:val="24"/>
-        </w:rPr>
-        <w:t xml:space="preserve"> Diário Oficial da União. https://bvsms.saude.gov.br/bvs/saudelegis/cns/2016/res0510_07_04_2016.html</w:t>
+        <w:t xml:space="preserve">Revista Brasileira de Medicina do Trabalho, 20</w:t>
+      </w:r>
+      <w:r>
+        <w:rPr>
+          <w:rFonts w:ascii="Times New Roman" w:cs="Times New Roman" w:eastAsia="Times New Roman" w:hAnsi="Times New Roman"/>
+          <w:sz w:val="24"/>
+          <w:szCs w:val="24"/>
+        </w:rPr>
+        <w:t xml:space="preserve">(4), 515–523. https://doi.org/10.47626/1679-4435-2022-763</w:t>
       </w:r>
     </w:p>
     <w:p>
@@ -16834,7 +16834,7 @@
           <w:sz w:val="24"/>
           <w:szCs w:val="24"/>
         </w:rPr>
-        <w:t xml:space="preserve">Demerouti, E., Bakker, A. B., Nachreiner, F., &amp; Schaufeli, W. B. (2001). The job demands-resources model of burnout. </w:t>
+        <w:t xml:space="preserve">Burr, H., Kersten, N., Sørensen, K., Sørensen, J. K., Dalsager, L., Madsen, I. E. H., Schöllgen, I., d’Errico, A., Rose, U., &amp; Rugulies, R. (2025). A comparison among employees in Germany and Denmark of associations between quality of leadership and subsequent 5-year development of mental distress. </w:t>
       </w:r>
       <w:r>
         <w:rPr>
@@ -16844,15 +16844,15 @@
           <w:sz w:val="24"/>
           <w:szCs w:val="24"/>
         </w:rPr>
-        <w:t xml:space="preserve">Journal of Applied Psychology, 86</w:t>
-      </w:r>
-      <w:r>
-        <w:rPr>
-          <w:rFonts w:ascii="Times New Roman" w:cs="Times New Roman" w:eastAsia="Times New Roman" w:hAnsi="Times New Roman"/>
-          <w:sz w:val="24"/>
-          <w:szCs w:val="24"/>
-        </w:rPr>
-        <w:t xml:space="preserve">(3), 499–512. https://doi.org/10.1037/0021-9010.86.3.499</w:t>
+        <w:t xml:space="preserve">Scientific Reports, 15</w:t>
+      </w:r>
+      <w:r>
+        <w:rPr>
+          <w:rFonts w:ascii="Times New Roman" w:cs="Times New Roman" w:eastAsia="Times New Roman" w:hAnsi="Times New Roman"/>
+          <w:sz w:val="24"/>
+          <w:szCs w:val="24"/>
+        </w:rPr>
+        <w:t xml:space="preserve">(1), 7802. https://doi.org/10.1038/s41598-025-92650-0</w:t>
       </w:r>
     </w:p>
     <w:p>
@@ -16866,7 +16866,7 @@
           <w:sz w:val="24"/>
           <w:szCs w:val="24"/>
         </w:rPr>
-        <w:t xml:space="preserve">Fløvik, L., Knardahl, S., &amp; Christensen, J. O. (2020). How leadership behaviors influence the effects of job predictability and perceived employability on employee mental health: A multilevel, prospective study. </w:t>
+        <w:t xml:space="preserve">Conselho Nacional de Saúde. (2016). </w:t>
       </w:r>
       <w:r>
         <w:rPr>
@@ -16876,15 +16876,15 @@
           <w:sz w:val="24"/>
           <w:szCs w:val="24"/>
         </w:rPr>
-        <w:t xml:space="preserve">Scandinavian Journal of Work, Environment &amp; Health, 46</w:t>
-      </w:r>
-      <w:r>
-        <w:rPr>
-          <w:rFonts w:ascii="Times New Roman" w:cs="Times New Roman" w:eastAsia="Times New Roman" w:hAnsi="Times New Roman"/>
-          <w:sz w:val="24"/>
-          <w:szCs w:val="24"/>
-        </w:rPr>
-        <w:t xml:space="preserve">(4), 392–401. https://doi.org/10.5271/sjweh.3880</w:t>
+        <w:t xml:space="preserve">Resolução nº 510, de 7 de abril de 2016. Dispõe sobre as normas aplicáveis a pesquisas em Ciências Humanas e Sociais.</w:t>
+      </w:r>
+      <w:r>
+        <w:rPr>
+          <w:rFonts w:ascii="Times New Roman" w:cs="Times New Roman" w:eastAsia="Times New Roman" w:hAnsi="Times New Roman"/>
+          <w:sz w:val="24"/>
+          <w:szCs w:val="24"/>
+        </w:rPr>
+        <w:t xml:space="preserve"> Diário Oficial da União. https://bvsms.saude.gov.br/bvs/saudelegis/cns/2016/res0510_07_04_2016.html</w:t>
       </w:r>
     </w:p>
     <w:p>
@@ -16898,7 +16898,7 @@
           <w:sz w:val="24"/>
           <w:szCs w:val="24"/>
         </w:rPr>
-        <w:t xml:space="preserve">Imboden, M. T., Wolfe, E., Evers, K., Ferrão, A., Mochari-Greenberger, H., Johnson, S., Kirsten, W., &amp; Seaverson, E. L. D. (2024). Evaluating workforce mental health and well-being: A review of assessments. </w:t>
+        <w:t xml:space="preserve">de Lucca, S. R., Silva Junior, J. S., &amp; Bandini, M. (2025). Critical analysis of psychosocial factors at work within the Risk Management Program of Regulatory Standard-1. </w:t>
       </w:r>
       <w:r>
         <w:rPr>
@@ -16908,15 +16908,15 @@
           <w:sz w:val="24"/>
           <w:szCs w:val="24"/>
         </w:rPr>
-        <w:t xml:space="preserve">American Journal of Health Promotion, 38</w:t>
-      </w:r>
-      <w:r>
-        <w:rPr>
-          <w:rFonts w:ascii="Times New Roman" w:cs="Times New Roman" w:eastAsia="Times New Roman" w:hAnsi="Times New Roman"/>
-          <w:sz w:val="24"/>
-          <w:szCs w:val="24"/>
-        </w:rPr>
-        <w:t xml:space="preserve">(4), 540–559. https://doi.org/10.1177/08901171231223786</w:t>
+        <w:t xml:space="preserve">Revista Brasileira de Medicina do Trabalho, 23</w:t>
+      </w:r>
+      <w:r>
+        <w:rPr>
+          <w:rFonts w:ascii="Times New Roman" w:cs="Times New Roman" w:eastAsia="Times New Roman" w:hAnsi="Times New Roman"/>
+          <w:sz w:val="24"/>
+          <w:szCs w:val="24"/>
+        </w:rPr>
+        <w:t xml:space="preserve">(1), e20251425. https://doi.org/10.47626/1679-4435-2025-1425</w:t>
       </w:r>
     </w:p>
     <w:p>
@@ -16930,7 +16930,7 @@
           <w:sz w:val="24"/>
           <w:szCs w:val="24"/>
         </w:rPr>
-        <w:t xml:space="preserve">International Organization for Standardization. (2021). </w:t>
+        <w:t xml:space="preserve">Demerouti, E., Bakker, A. B., Nachreiner, F., &amp; Schaufeli, W. B. (2001). The job demands-resources model of burnout. </w:t>
       </w:r>
       <w:r>
         <w:rPr>
@@ -16940,15 +16940,15 @@
           <w:sz w:val="24"/>
           <w:szCs w:val="24"/>
         </w:rPr>
-        <w:t xml:space="preserve">Occupational health and safety management: Psychological health and safety at work: Guidelines for managing psychosocial risks</w:t>
-      </w:r>
-      <w:r>
-        <w:rPr>
-          <w:rFonts w:ascii="Times New Roman" w:cs="Times New Roman" w:eastAsia="Times New Roman" w:hAnsi="Times New Roman"/>
-          <w:sz w:val="24"/>
-          <w:szCs w:val="24"/>
-        </w:rPr>
-        <w:t xml:space="preserve"> (ISO Standard No. 45003:2021). https://www.iso.org/standard/64283.html</w:t>
+        <w:t xml:space="preserve">Journal of Applied Psychology, 86</w:t>
+      </w:r>
+      <w:r>
+        <w:rPr>
+          <w:rFonts w:ascii="Times New Roman" w:cs="Times New Roman" w:eastAsia="Times New Roman" w:hAnsi="Times New Roman"/>
+          <w:sz w:val="24"/>
+          <w:szCs w:val="24"/>
+        </w:rPr>
+        <w:t xml:space="preserve">(3), 499–512. https://doi.org/10.1037/0021-9010.86.3.499</w:t>
       </w:r>
     </w:p>
     <w:p>
@@ -16962,7 +16962,7 @@
           <w:sz w:val="24"/>
           <w:szCs w:val="24"/>
         </w:rPr>
-        <w:t xml:space="preserve">Lu, Z., Wang, S., Li, Y., Liu, X., &amp; Olsen, W. (2023). Who gains mental health benefits from work autonomy? The roles of gender and occupational class. </w:t>
+        <w:t xml:space="preserve">Fløvik, L., Knardahl, S., &amp; Christensen, J. O. (2020). How leadership behaviors influence the effects of job predictability and perceived employability on employee mental health: A multilevel, prospective study. </w:t>
       </w:r>
       <w:r>
         <w:rPr>
@@ -16972,15 +16972,15 @@
           <w:sz w:val="24"/>
           <w:szCs w:val="24"/>
         </w:rPr>
-        <w:t xml:space="preserve">Applied Research in Quality of Life</w:t>
-      </w:r>
-      <w:r>
-        <w:rPr>
-          <w:rFonts w:ascii="Times New Roman" w:cs="Times New Roman" w:eastAsia="Times New Roman" w:hAnsi="Times New Roman"/>
-          <w:sz w:val="24"/>
-          <w:szCs w:val="24"/>
-        </w:rPr>
-        <w:t xml:space="preserve">, 1–23. https://doi.org/10.1007/s11482-023-10161-4</w:t>
+        <w:t xml:space="preserve">Scandinavian Journal of Work, Environment &amp; Health, 46</w:t>
+      </w:r>
+      <w:r>
+        <w:rPr>
+          <w:rFonts w:ascii="Times New Roman" w:cs="Times New Roman" w:eastAsia="Times New Roman" w:hAnsi="Times New Roman"/>
+          <w:sz w:val="24"/>
+          <w:szCs w:val="24"/>
+        </w:rPr>
+        <w:t xml:space="preserve">(4), 392–401. https://doi.org/10.5271/sjweh.3880</w:t>
       </w:r>
     </w:p>
     <w:p>
@@ -16994,7 +16994,7 @@
           <w:sz w:val="24"/>
           <w:szCs w:val="24"/>
         </w:rPr>
-        <w:t xml:space="preserve">Ministério do Trabalho e Emprego. (2024). </w:t>
+        <w:t xml:space="preserve">Gonçalves, J. S., Moriguchi, C. S., Chaves, T. C., &amp; Sato, T. O. (2021). Cross-cultural adaptation and psychometric properties of the short version of COPSOQ II-Brazil. </w:t>
       </w:r>
       <w:r>
         <w:rPr>
@@ -17004,15 +17004,15 @@
           <w:sz w:val="24"/>
           <w:szCs w:val="24"/>
         </w:rPr>
-        <w:t xml:space="preserve">Portaria MTE nº 1.419, de 27 de agosto de 2024. Aprova a nova redação do capítulo 1.5 "Gerenciamento de Riscos Ocupacionais" e altera o Anexo I "Termos e Definições" da Norma Regulamentadora nº 1.</w:t>
-      </w:r>
-      <w:r>
-        <w:rPr>
-          <w:rFonts w:ascii="Times New Roman" w:cs="Times New Roman" w:eastAsia="Times New Roman" w:hAnsi="Times New Roman"/>
-          <w:sz w:val="24"/>
-          <w:szCs w:val="24"/>
-        </w:rPr>
-        <w:t xml:space="preserve"> Diário Oficial da União. https://www.gov.br/trabalho-e-emprego/pt-br/assuntos/inspecao-do-trabalho/seguranca-e-saude-no-trabalho/sst-portarias/2024/portaria-mte-no-1-419-nr-01-gro-nova-redacao.pdf</w:t>
+        <w:t xml:space="preserve">Revista de Saúde Pública, 55</w:t>
+      </w:r>
+      <w:r>
+        <w:rPr>
+          <w:rFonts w:ascii="Times New Roman" w:cs="Times New Roman" w:eastAsia="Times New Roman" w:hAnsi="Times New Roman"/>
+          <w:sz w:val="24"/>
+          <w:szCs w:val="24"/>
+        </w:rPr>
+        <w:t xml:space="preserve">, 69. https://doi.org/10.11606/s1518-8787.2021055003123</w:t>
       </w:r>
     </w:p>
     <w:p>
@@ -17026,7 +17026,7 @@
           <w:sz w:val="24"/>
           <w:szCs w:val="24"/>
         </w:rPr>
-        <w:t xml:space="preserve">Podsakoff, P. M., MacKenzie, S. B., Lee, J.-Y., &amp; Podsakoff, N. P. (2003). Common method biases in behavioral research: A critical review of the literature and recommended remedies. </w:t>
+        <w:t xml:space="preserve">Imboden, M. T., Wolfe, E., Evers, K., Ferrão, A., Mochari-Greenberger, H., Johnson, S., Kirsten, W., &amp; Seaverson, E. L. D. (2024). Evaluating workforce mental health and well-being: A review of assessments. </w:t>
       </w:r>
       <w:r>
         <w:rPr>
@@ -17036,15 +17036,15 @@
           <w:sz w:val="24"/>
           <w:szCs w:val="24"/>
         </w:rPr>
-        <w:t xml:space="preserve">Journal of Applied Psychology, 88</w:t>
-      </w:r>
-      <w:r>
-        <w:rPr>
-          <w:rFonts w:ascii="Times New Roman" w:cs="Times New Roman" w:eastAsia="Times New Roman" w:hAnsi="Times New Roman"/>
-          <w:sz w:val="24"/>
-          <w:szCs w:val="24"/>
-        </w:rPr>
-        <w:t xml:space="preserve">(5), 879–903. https://doi.org/10.1037/0021-9010.88.5.879</w:t>
+        <w:t xml:space="preserve">American Journal of Health Promotion, 38</w:t>
+      </w:r>
+      <w:r>
+        <w:rPr>
+          <w:rFonts w:ascii="Times New Roman" w:cs="Times New Roman" w:eastAsia="Times New Roman" w:hAnsi="Times New Roman"/>
+          <w:sz w:val="24"/>
+          <w:szCs w:val="24"/>
+        </w:rPr>
+        <w:t xml:space="preserve">(4), 540–559. https://doi.org/10.1177/08901171231223786</w:t>
       </w:r>
     </w:p>
     <w:p>
@@ -17058,7 +17058,7 @@
           <w:sz w:val="24"/>
           <w:szCs w:val="24"/>
         </w:rPr>
-        <w:t xml:space="preserve">Schulte, P. A., Sauter, S. L., Pandalai, S. P., Tiesman, H. M., Chosewood, L. C., Cunningham, T. R., Wurzelbacher, S. J., Pana-Cryan, R., Swanson, N. G., Chang, C.-C., Nigam, J. A. S., Reissman, D. B., Ray, T. K., &amp; Howard, J. (2024). An urgent call to address work-related psychosocial hazards and improve worker well-being. </w:t>
+        <w:t xml:space="preserve">International Organization for Standardization. (2021). </w:t>
       </w:r>
       <w:r>
         <w:rPr>
@@ -17068,6 +17068,262 @@
           <w:sz w:val="24"/>
           <w:szCs w:val="24"/>
         </w:rPr>
+        <w:t xml:space="preserve">Occupational health and safety management: Psychological health and safety at work: Guidelines for managing psychosocial risks</w:t>
+      </w:r>
+      <w:r>
+        <w:rPr>
+          <w:rFonts w:ascii="Times New Roman" w:cs="Times New Roman" w:eastAsia="Times New Roman" w:hAnsi="Times New Roman"/>
+          <w:sz w:val="24"/>
+          <w:szCs w:val="24"/>
+        </w:rPr>
+        <w:t xml:space="preserve"> (ISO Standard No. 45003:2021). https://www.iso.org/standard/64283.html</w:t>
+      </w:r>
+    </w:p>
+    <w:p>
+      <w:pPr>
+        <w:spacing w:line="480"/>
+        <w:ind w:left="720" w:hanging="720"/>
+      </w:pPr>
+      <w:r>
+        <w:rPr>
+          <w:rFonts w:ascii="Times New Roman" w:cs="Times New Roman" w:eastAsia="Times New Roman" w:hAnsi="Times New Roman"/>
+          <w:sz w:val="24"/>
+          <w:szCs w:val="24"/>
+        </w:rPr>
+        <w:t xml:space="preserve">Jain, A., Torres, L. D., Teoh, K., &amp; Leka, S. (2022). The impact of national legislation on psychosocial risks on organisational action plans, psychosocial working conditions, and employee work-related stress in Europe. </w:t>
+      </w:r>
+      <w:r>
+        <w:rPr>
+          <w:rFonts w:ascii="Times New Roman" w:cs="Times New Roman" w:eastAsia="Times New Roman" w:hAnsi="Times New Roman"/>
+          <w:i/>
+          <w:iCs/>
+          <w:sz w:val="24"/>
+          <w:szCs w:val="24"/>
+        </w:rPr>
+        <w:t xml:space="preserve">Social Science &amp; Medicine, 302</w:t>
+      </w:r>
+      <w:r>
+        <w:rPr>
+          <w:rFonts w:ascii="Times New Roman" w:cs="Times New Roman" w:eastAsia="Times New Roman" w:hAnsi="Times New Roman"/>
+          <w:sz w:val="24"/>
+          <w:szCs w:val="24"/>
+        </w:rPr>
+        <w:t xml:space="preserve">, 114987. https://doi.org/10.1016/j.socscimed.2022.114987</w:t>
+      </w:r>
+    </w:p>
+    <w:p>
+      <w:pPr>
+        <w:spacing w:line="480"/>
+        <w:ind w:left="720" w:hanging="720"/>
+      </w:pPr>
+      <w:r>
+        <w:rPr>
+          <w:rFonts w:ascii="Times New Roman" w:cs="Times New Roman" w:eastAsia="Times New Roman" w:hAnsi="Times New Roman"/>
+          <w:sz w:val="24"/>
+          <w:szCs w:val="24"/>
+        </w:rPr>
+        <w:t xml:space="preserve">Lu, Z., Wang, S., Li, Y., Liu, X., &amp; Olsen, W. (2023). Who gains mental health benefits from work autonomy? The roles of gender and occupational class. </w:t>
+      </w:r>
+      <w:r>
+        <w:rPr>
+          <w:rFonts w:ascii="Times New Roman" w:cs="Times New Roman" w:eastAsia="Times New Roman" w:hAnsi="Times New Roman"/>
+          <w:i/>
+          <w:iCs/>
+          <w:sz w:val="24"/>
+          <w:szCs w:val="24"/>
+        </w:rPr>
+        <w:t xml:space="preserve">Applied Research in Quality of Life</w:t>
+      </w:r>
+      <w:r>
+        <w:rPr>
+          <w:rFonts w:ascii="Times New Roman" w:cs="Times New Roman" w:eastAsia="Times New Roman" w:hAnsi="Times New Roman"/>
+          <w:sz w:val="24"/>
+          <w:szCs w:val="24"/>
+        </w:rPr>
+        <w:t xml:space="preserve">, 1–23. https://doi.org/10.1007/s11482-023-10161-4</w:t>
+      </w:r>
+    </w:p>
+    <w:p>
+      <w:pPr>
+        <w:spacing w:line="480"/>
+        <w:ind w:left="720" w:hanging="720"/>
+      </w:pPr>
+      <w:r>
+        <w:rPr>
+          <w:rFonts w:ascii="Times New Roman" w:cs="Times New Roman" w:eastAsia="Times New Roman" w:hAnsi="Times New Roman"/>
+          <w:sz w:val="24"/>
+          <w:szCs w:val="24"/>
+        </w:rPr>
+        <w:t xml:space="preserve">Ministério do Trabalho e Emprego. (2024). </w:t>
+      </w:r>
+      <w:r>
+        <w:rPr>
+          <w:rFonts w:ascii="Times New Roman" w:cs="Times New Roman" w:eastAsia="Times New Roman" w:hAnsi="Times New Roman"/>
+          <w:i/>
+          <w:iCs/>
+          <w:sz w:val="24"/>
+          <w:szCs w:val="24"/>
+        </w:rPr>
+        <w:t xml:space="preserve">Portaria MTE nº 1.419, de 27 de agosto de 2024. Aprova a nova redação do capítulo 1.5 "Gerenciamento de Riscos Ocupacionais" e altera o Anexo I "Termos e Definições" da Norma Regulamentadora nº 1.</w:t>
+      </w:r>
+      <w:r>
+        <w:rPr>
+          <w:rFonts w:ascii="Times New Roman" w:cs="Times New Roman" w:eastAsia="Times New Roman" w:hAnsi="Times New Roman"/>
+          <w:sz w:val="24"/>
+          <w:szCs w:val="24"/>
+        </w:rPr>
+        <w:t xml:space="preserve"> Diário Oficial da União. https://www.gov.br/trabalho-e-emprego/pt-br/assuntos/inspecao-do-trabalho/seguranca-e-saude-no-trabalho/sst-portarias/2024/portaria-mte-no-1-419-nr-01-gro-nova-redacao.pdf</w:t>
+      </w:r>
+    </w:p>
+    <w:p>
+      <w:pPr>
+        <w:spacing w:line="480"/>
+        <w:ind w:left="720" w:hanging="720"/>
+      </w:pPr>
+      <w:r>
+        <w:rPr>
+          <w:rFonts w:ascii="Times New Roman" w:cs="Times New Roman" w:eastAsia="Times New Roman" w:hAnsi="Times New Roman"/>
+          <w:sz w:val="24"/>
+          <w:szCs w:val="24"/>
+        </w:rPr>
+        <w:t xml:space="preserve">Niedhammer, I., Bertrais, S., &amp; Witt, K. (2021). Psychosocial work exposures and health outcomes: A meta-review of 72 literature reviews with meta-analysis. </w:t>
+      </w:r>
+      <w:r>
+        <w:rPr>
+          <w:rFonts w:ascii="Times New Roman" w:cs="Times New Roman" w:eastAsia="Times New Roman" w:hAnsi="Times New Roman"/>
+          <w:i/>
+          <w:iCs/>
+          <w:sz w:val="24"/>
+          <w:szCs w:val="24"/>
+        </w:rPr>
+        <w:t xml:space="preserve">Scandinavian Journal of Work, Environment &amp; Health, 47</w:t>
+      </w:r>
+      <w:r>
+        <w:rPr>
+          <w:rFonts w:ascii="Times New Roman" w:cs="Times New Roman" w:eastAsia="Times New Roman" w:hAnsi="Times New Roman"/>
+          <w:sz w:val="24"/>
+          <w:szCs w:val="24"/>
+        </w:rPr>
+        <w:t xml:space="preserve">(7), 489–508. https://doi.org/10.5271/sjweh.3968</w:t>
+      </w:r>
+    </w:p>
+    <w:p>
+      <w:pPr>
+        <w:spacing w:line="480"/>
+        <w:ind w:left="720" w:hanging="720"/>
+      </w:pPr>
+      <w:r>
+        <w:rPr>
+          <w:rFonts w:ascii="Times New Roman" w:cs="Times New Roman" w:eastAsia="Times New Roman" w:hAnsi="Times New Roman"/>
+          <w:sz w:val="24"/>
+          <w:szCs w:val="24"/>
+        </w:rPr>
+        <w:t xml:space="preserve">Niedhammer, I., Quatrevaux, M., &amp; Bertrais, S. (2026). Psychosocial work factors and subsequent mental health service use: A prospective study using the national ESPS survey in France. </w:t>
+      </w:r>
+      <w:r>
+        <w:rPr>
+          <w:rFonts w:ascii="Times New Roman" w:cs="Times New Roman" w:eastAsia="Times New Roman" w:hAnsi="Times New Roman"/>
+          <w:i/>
+          <w:iCs/>
+          <w:sz w:val="24"/>
+          <w:szCs w:val="24"/>
+        </w:rPr>
+        <w:t xml:space="preserve">European Journal of Public Health, 36</w:t>
+      </w:r>
+      <w:r>
+        <w:rPr>
+          <w:rFonts w:ascii="Times New Roman" w:cs="Times New Roman" w:eastAsia="Times New Roman" w:hAnsi="Times New Roman"/>
+          <w:sz w:val="24"/>
+          <w:szCs w:val="24"/>
+        </w:rPr>
+        <w:t xml:space="preserve">(2). https://doi.org/10.1093/eurpub/ckag012</w:t>
+      </w:r>
+    </w:p>
+    <w:p>
+      <w:pPr>
+        <w:spacing w:line="480"/>
+        <w:ind w:left="720" w:hanging="720"/>
+      </w:pPr>
+      <w:r>
+        <w:rPr>
+          <w:rFonts w:ascii="Times New Roman" w:cs="Times New Roman" w:eastAsia="Times New Roman" w:hAnsi="Times New Roman"/>
+          <w:sz w:val="24"/>
+          <w:szCs w:val="24"/>
+        </w:rPr>
+        <w:t xml:space="preserve">Podsakoff, P. M., MacKenzie, S. B., Lee, J.-Y., &amp; Podsakoff, N. P. (2003). Common method biases in behavioral research: A critical review of the literature and recommended remedies. </w:t>
+      </w:r>
+      <w:r>
+        <w:rPr>
+          <w:rFonts w:ascii="Times New Roman" w:cs="Times New Roman" w:eastAsia="Times New Roman" w:hAnsi="Times New Roman"/>
+          <w:i/>
+          <w:iCs/>
+          <w:sz w:val="24"/>
+          <w:szCs w:val="24"/>
+        </w:rPr>
+        <w:t xml:space="preserve">Journal of Applied Psychology, 88</w:t>
+      </w:r>
+      <w:r>
+        <w:rPr>
+          <w:rFonts w:ascii="Times New Roman" w:cs="Times New Roman" w:eastAsia="Times New Roman" w:hAnsi="Times New Roman"/>
+          <w:sz w:val="24"/>
+          <w:szCs w:val="24"/>
+        </w:rPr>
+        <w:t xml:space="preserve">(5), 879–903. https://doi.org/10.1037/0021-9010.88.5.879</w:t>
+      </w:r>
+    </w:p>
+    <w:p>
+      <w:pPr>
+        <w:spacing w:line="480"/>
+        <w:ind w:left="720" w:hanging="720"/>
+      </w:pPr>
+      <w:r>
+        <w:rPr>
+          <w:rFonts w:ascii="Times New Roman" w:cs="Times New Roman" w:eastAsia="Times New Roman" w:hAnsi="Times New Roman"/>
+          <w:sz w:val="24"/>
+          <w:szCs w:val="24"/>
+        </w:rPr>
+        <w:t xml:space="preserve">Rugulies, R., Aust, B., Greiner, B. A., Arensman, E., Kawakami, N., LaMontagne, A. D., &amp; Madsen, I. E. H. (2023). Work-related causes of mental health conditions and interventions for their improvement in workplaces. </w:t>
+      </w:r>
+      <w:r>
+        <w:rPr>
+          <w:rFonts w:ascii="Times New Roman" w:cs="Times New Roman" w:eastAsia="Times New Roman" w:hAnsi="Times New Roman"/>
+          <w:i/>
+          <w:iCs/>
+          <w:sz w:val="24"/>
+          <w:szCs w:val="24"/>
+        </w:rPr>
+        <w:t xml:space="preserve">The Lancet, 402</w:t>
+      </w:r>
+      <w:r>
+        <w:rPr>
+          <w:rFonts w:ascii="Times New Roman" w:cs="Times New Roman" w:eastAsia="Times New Roman" w:hAnsi="Times New Roman"/>
+          <w:sz w:val="24"/>
+          <w:szCs w:val="24"/>
+        </w:rPr>
+        <w:t xml:space="preserve">(10410), 1368–1381. https://doi.org/10.1016/S0140-6736(23)00869-3</w:t>
+      </w:r>
+    </w:p>
+    <w:p>
+      <w:pPr>
+        <w:spacing w:line="480"/>
+        <w:ind w:left="720" w:hanging="720"/>
+      </w:pPr>
+      <w:r>
+        <w:rPr>
+          <w:rFonts w:ascii="Times New Roman" w:cs="Times New Roman" w:eastAsia="Times New Roman" w:hAnsi="Times New Roman"/>
+          <w:sz w:val="24"/>
+          <w:szCs w:val="24"/>
+        </w:rPr>
+        <w:t xml:space="preserve">Schulte, P. A., Sauter, S. L., Pandalai, S. P., Tiesman, H. M., Chosewood, L. C., Cunningham, T. R., Wurzelbacher, S. J., Pana-Cryan, R., Swanson, N. G., Chang, C.-C., Nigam, J. A. S., Reissman, D. B., Ray, T. K., &amp; Howard, J. (2024). An urgent call to address work-related psychosocial hazards and improve worker well-being. </w:t>
+      </w:r>
+      <w:r>
+        <w:rPr>
+          <w:rFonts w:ascii="Times New Roman" w:cs="Times New Roman" w:eastAsia="Times New Roman" w:hAnsi="Times New Roman"/>
+          <w:i/>
+          <w:iCs/>
+          <w:sz w:val="24"/>
+          <w:szCs w:val="24"/>
+        </w:rPr>
         <w:t xml:space="preserve">American Journal of Industrial Medicine, 67</w:t>
       </w:r>
       <w:r>
@@ -17077,6 +17333,38 @@
           <w:szCs w:val="24"/>
         </w:rPr>
         <w:t xml:space="preserve">(6), 499–514. https://doi.org/10.1002/ajim.23583</w:t>
+      </w:r>
+    </w:p>
+    <w:p>
+      <w:pPr>
+        <w:spacing w:line="480"/>
+        <w:ind w:left="720" w:hanging="720"/>
+      </w:pPr>
+      <w:r>
+        <w:rPr>
+          <w:rFonts w:ascii="Times New Roman" w:cs="Times New Roman" w:eastAsia="Times New Roman" w:hAnsi="Times New Roman"/>
+          <w:sz w:val="24"/>
+          <w:szCs w:val="24"/>
+        </w:rPr>
+        <w:t xml:space="preserve">Taouk, Y., Aitken, Z., LaMontagne, A. D., &amp; King, T. (2024). Persistent low job control and subsequent major depression: A prospective cohort study of Australian working males. </w:t>
+      </w:r>
+      <w:r>
+        <w:rPr>
+          <w:rFonts w:ascii="Times New Roman" w:cs="Times New Roman" w:eastAsia="Times New Roman" w:hAnsi="Times New Roman"/>
+          <w:i/>
+          <w:iCs/>
+          <w:sz w:val="24"/>
+          <w:szCs w:val="24"/>
+        </w:rPr>
+        <w:t xml:space="preserve">Social Science &amp; Medicine, 359</w:t>
+      </w:r>
+      <w:r>
+        <w:rPr>
+          <w:rFonts w:ascii="Times New Roman" w:cs="Times New Roman" w:eastAsia="Times New Roman" w:hAnsi="Times New Roman"/>
+          <w:sz w:val="24"/>
+          <w:szCs w:val="24"/>
+        </w:rPr>
+        <w:t xml:space="preserve">, 117283. https://doi.org/10.1016/j.socscimed.2024.117283</w:t>
       </w:r>
     </w:p>
     <w:p>

</xml_diff>

<commit_message>
Manuscript: Zotero fields, authors, no placeholders, duplicate figure sentences removed
Co-Authored-By: Claude Opus 5.5 <noreply@anthropic.com>
Claude-Session: https://claude.ai/code/session_01RKBYJsspEG8XXPu9eJdzD5
</commit_message>
<xml_diff>
--- a/Results/AGEM - Time series manuscript.docx
+++ b/Results/AGEM - Time series manuscript.docx
@@ -13,7 +13,6 @@
           <w:sz w:val="24"/>
           <w:szCs w:val="24"/>
           <w:highlight w:val="yellow"/>
-          <w:highlightCs w:val="yellow"/>
         </w:rPr>
         <w:t xml:space="preserve">Luis Anunciacao, PhD</w:t>
       </w:r>
@@ -29,7 +28,7 @@
           <w:sz w:val="24"/>
           <w:szCs w:val="24"/>
         </w:rPr>
-        <w:t xml:space="preserve">2026-10-16 - 13:23</w:t>
+        <w:t xml:space="preserve">2026-10-16 - 13:38</w:t>
       </w:r>
     </w:p>
     <w:p>
@@ -50,6 +49,20 @@
     </w:p>
     <w:p>
       <w:pPr>
+        <w:spacing w:line="480"/>
+        <w:jc w:val="center"/>
+      </w:pPr>
+      <w:r>
+        <w:rPr>
+          <w:rFonts w:ascii="Times New Roman" w:cs="Times New Roman" w:eastAsia="Times New Roman" w:hAnsi="Times New Roman"/>
+          <w:sz w:val="24"/>
+          <w:szCs w:val="24"/>
+        </w:rPr>
+        <w:t xml:space="preserve">Adriana Tomaz Lima, Diego Haas, Stella Torreão, Hanni Schiffer, and Luis Anunciação</w:t>
+      </w:r>
+    </w:p>
+    <w:p>
+      <w:pPr>
         <w:spacing w:after="480" w:line="480"/>
         <w:jc w:val="center"/>
       </w:pPr>
@@ -59,7 +72,7 @@
           <w:sz w:val="24"/>
           <w:szCs w:val="24"/>
         </w:rPr>
-        <w:t xml:space="preserve">[Authors and affiliations]</w:t>
+        <w:t xml:space="preserve">Pontifícia Universidade Católica do Rio de Janeiro (PUC-Rio), Rio de Janeiro, Brazil</w:t>
       </w:r>
     </w:p>
     <w:p>
@@ -197,7 +210,343 @@
           <w:sz w:val="24"/>
           <w:szCs w:val="24"/>
         </w:rPr>
-        <w:t xml:space="preserve">Psychosocial hazards at work are associated with ill health, injury and losses in productivity, and their prevention depends on how work is organized and managed (Schulte et al., 2024; World Health Organization, 2022). In a meta-review of 72 reviews with meta-analyses, job strain and long working hours were associated with depression (Niedhammer et al., 2021), and exposure to some working conditions increases the risk of the onset of depressive disorders (Rugulies et al., 2023). In Brazil, mental and behavioral disorders are among the main causes of absence from work (Bouzada et al., 2023). In 2024, Brazil amended Regulatory Standard No. 1 (NR-1) to require employers to identify, evaluate and record psychosocial risk factors in the risk inventory of their occupational risk management program (Ministério do Trabalho e Emprego, 2024). The regulation does not specify how these factors should be assessed (Ministério do Trabalho e Emprego, 2024). Despite this regulatory change, psychosocial factors at work have been described as insufficiently addressed in Brazil (de Lucca et al., 2025).</w:t>
+        <w:t xml:space="preserve">Psychosocial hazards at work are associated with ill health, injury and losses in productivity, and their prevention depends on how work is organized and managed </w:t>
+      </w:r>
+      <w:r>
+        <w:rPr>
+          <w:rFonts w:ascii="Times New Roman" w:cs="Times New Roman" w:eastAsia="Times New Roman" w:hAnsi="Times New Roman"/>
+          <w:sz w:val="24"/>
+          <w:szCs w:val="24"/>
+        </w:rPr>
+        <w:fldChar w:fldCharType="begin"/>
+      </w:r>
+      <w:r>
+        <w:rPr>
+          <w:rFonts w:ascii="Times New Roman" w:cs="Times New Roman" w:eastAsia="Times New Roman" w:hAnsi="Times New Roman"/>
+          <w:sz w:val="24"/>
+          <w:szCs w:val="24"/>
+        </w:rPr>
+        <w:instrText xml:space="preserve"> ADDIN ZOTERO_ITEM CSL_CITATION {"citationID": "AGEM1", "properties": {"formattedCitation": "(Schulte et al., 2024; World Health Organization, 2022)", "plainCitation": "(Schulte et al., 2024; World Health Organization, 2022)", "noteIndex": 0}, "citationItems": [{"id": "schulte", "uris": ["http://zotero.org/users/local/agemts/items/SCHULTE"], "itemData": {"id": "schulte", "type": "article-journal", "author": [{"family": "Schulte", "given": "PA"}, {"family": "Sauter", "given": "SL"}, {"family": "Pandalai", "given": "SP"}, {"family": "Tiesman", "given": "HM"}, {"family": "Chosewood", "given": "LC"}, {"family": "Cunningham", "given": "TR"}, {"family": "Wurzelbacher", "given": "SJ"}, {"family": "Pana-Cryan", "given": "R"}, {"family": "Swanson", "given": "NG"}, {"family": "Chang", "given": "CC"}, {"family": "Nigam", "given": "JAS"}, {"family": "Reissman", "given": "DB"}, {"family": "Ray", "given": "TK"}, {"family": "Howard", "given": "J"}], "title": "An urgent call to address work-related psychosocial hazards and improve worker well-being", "container-title": "American Journal of Industrial Medicine", "container-title-short": "Am J Ind Med", "issued": {"date-parts": [[2024]]}, "volume": "67", "issue": "6", "page": "499-514", "DOI": "10.1002/ajim.23583"}}, {"id": "who", "uris": ["http://zotero.org/users/local/agemts/items/WHO"], "itemData": {"id": "who", "type": "report", "author": [{"literal": "World Health Organization"}], "title": "WHO guidelines on mental health at work", "publisher": "World Health Organization", "publisher-place": "Geneva", "issued": {"date-parts": [[2022]]}, "URL": "https://www.who.int/publications/i/item/9789240053052"}}], "schema": "https://github.com/citation-style-language/schema/raw/master/csl-citation.json"} </w:instrText>
+      </w:r>
+      <w:r>
+        <w:rPr>
+          <w:rFonts w:ascii="Times New Roman" w:cs="Times New Roman" w:eastAsia="Times New Roman" w:hAnsi="Times New Roman"/>
+          <w:sz w:val="24"/>
+          <w:szCs w:val="24"/>
+        </w:rPr>
+        <w:fldChar w:fldCharType="separate"/>
+      </w:r>
+      <w:r>
+        <w:rPr>
+          <w:rFonts w:ascii="Times New Roman" w:cs="Times New Roman" w:eastAsia="Times New Roman" w:hAnsi="Times New Roman"/>
+          <w:sz w:val="24"/>
+          <w:szCs w:val="24"/>
+        </w:rPr>
+        <w:t xml:space="preserve">(Schulte et al., 2024; World Health Organization, 2022)</w:t>
+      </w:r>
+      <w:r>
+        <w:rPr>
+          <w:rFonts w:ascii="Times New Roman" w:cs="Times New Roman" w:eastAsia="Times New Roman" w:hAnsi="Times New Roman"/>
+          <w:sz w:val="24"/>
+          <w:szCs w:val="24"/>
+        </w:rPr>
+        <w:fldChar w:fldCharType="end"/>
+      </w:r>
+      <w:r>
+        <w:rPr>
+          <w:rFonts w:ascii="Times New Roman" w:cs="Times New Roman" w:eastAsia="Times New Roman" w:hAnsi="Times New Roman"/>
+          <w:sz w:val="24"/>
+          <w:szCs w:val="24"/>
+        </w:rPr>
+        <w:t xml:space="preserve">. In a meta-review of 72 reviews with meta-analyses, job strain and long working hours were associated with depression </w:t>
+      </w:r>
+      <w:r>
+        <w:rPr>
+          <w:rFonts w:ascii="Times New Roman" w:cs="Times New Roman" w:eastAsia="Times New Roman" w:hAnsi="Times New Roman"/>
+          <w:sz w:val="24"/>
+          <w:szCs w:val="24"/>
+        </w:rPr>
+        <w:fldChar w:fldCharType="begin"/>
+      </w:r>
+      <w:r>
+        <w:rPr>
+          <w:rFonts w:ascii="Times New Roman" w:cs="Times New Roman" w:eastAsia="Times New Roman" w:hAnsi="Times New Roman"/>
+          <w:sz w:val="24"/>
+          <w:szCs w:val="24"/>
+        </w:rPr>
+        <w:instrText xml:space="preserve"> ADDIN ZOTERO_ITEM CSL_CITATION {"citationID": "AGEM2", "properties": {"formattedCitation": "(Niedhammer et al., 2021)", "plainCitation": "(Niedhammer et al., 2021)", "noteIndex": 0}, "citationItems": [{"id": "niedhammer2021", "uris": ["http://zotero.org/users/local/agemts/items/NIEDHAMMER2021"], "itemData": {"type": "article-journal", "author": [{"family": "Niedhammer", "given": "I"}, {"family": "Bertrais", "given": "S"}, {"family": "Witt", "given": "K"}], "title": "Psychosocial work exposures and health outcomes: a meta-review of 72 literature reviews with meta-analysis", "container-title": "Scandinavian Journal of Work, Environment &amp; Health", "issued": {"date-parts": [[2021]]}, "volume": "47", "issue": "7", "page": "489-508", "DOI": "10.5271/sjweh.3968", "PMID": "34042163", "id": "niedhammer2021"}}], "schema": "https://github.com/citation-style-language/schema/raw/master/csl-citation.json"} </w:instrText>
+      </w:r>
+      <w:r>
+        <w:rPr>
+          <w:rFonts w:ascii="Times New Roman" w:cs="Times New Roman" w:eastAsia="Times New Roman" w:hAnsi="Times New Roman"/>
+          <w:sz w:val="24"/>
+          <w:szCs w:val="24"/>
+        </w:rPr>
+        <w:fldChar w:fldCharType="separate"/>
+      </w:r>
+      <w:r>
+        <w:rPr>
+          <w:rFonts w:ascii="Times New Roman" w:cs="Times New Roman" w:eastAsia="Times New Roman" w:hAnsi="Times New Roman"/>
+          <w:sz w:val="24"/>
+          <w:szCs w:val="24"/>
+        </w:rPr>
+        <w:t xml:space="preserve">(Niedhammer et al., 2021)</w:t>
+      </w:r>
+      <w:r>
+        <w:rPr>
+          <w:rFonts w:ascii="Times New Roman" w:cs="Times New Roman" w:eastAsia="Times New Roman" w:hAnsi="Times New Roman"/>
+          <w:sz w:val="24"/>
+          <w:szCs w:val="24"/>
+        </w:rPr>
+        <w:fldChar w:fldCharType="end"/>
+      </w:r>
+      <w:r>
+        <w:rPr>
+          <w:rFonts w:ascii="Times New Roman" w:cs="Times New Roman" w:eastAsia="Times New Roman" w:hAnsi="Times New Roman"/>
+          <w:sz w:val="24"/>
+          <w:szCs w:val="24"/>
+        </w:rPr>
+        <w:t xml:space="preserve">, and exposure to some working conditions increases the risk of the onset of depressive disorders </w:t>
+      </w:r>
+      <w:r>
+        <w:rPr>
+          <w:rFonts w:ascii="Times New Roman" w:cs="Times New Roman" w:eastAsia="Times New Roman" w:hAnsi="Times New Roman"/>
+          <w:sz w:val="24"/>
+          <w:szCs w:val="24"/>
+        </w:rPr>
+        <w:fldChar w:fldCharType="begin"/>
+      </w:r>
+      <w:r>
+        <w:rPr>
+          <w:rFonts w:ascii="Times New Roman" w:cs="Times New Roman" w:eastAsia="Times New Roman" w:hAnsi="Times New Roman"/>
+          <w:sz w:val="24"/>
+          <w:szCs w:val="24"/>
+        </w:rPr>
+        <w:instrText xml:space="preserve"> ADDIN ZOTERO_ITEM CSL_CITATION {"citationID": "AGEM3", "properties": {"formattedCitation": "(Rugulies et al., 2023)", "plainCitation": "(Rugulies et al., 2023)", "noteIndex": 0}, "citationItems": [{"id": "rugulies", "uris": ["http://zotero.org/users/local/agemts/items/RUGULIES"], "itemData": {"type": "article-journal", "author": [{"family": "Rugulies", "given": "R"}, {"family": "Aust", "given": "B"}, {"family": "Greiner", "given": "BA"}, {"family": "Arensman", "given": "E"}, {"family": "Kawakami", "given": "N"}, {"family": "LaMontagne", "given": "AD"}, {"family": "Madsen", "given": "IEH"}], "title": "Work-related causes of mental health conditions and interventions for their improvement in workplaces", "container-title": "The Lancet", "issued": {"date-parts": [[2023]]}, "volume": "402", "issue": "10410", "page": "1368-1381", "DOI": "10.1016/S0140-6736(23)00869-3", "PMID": "37838442", "id": "rugulies"}}], "schema": "https://github.com/citation-style-language/schema/raw/master/csl-citation.json"} </w:instrText>
+      </w:r>
+      <w:r>
+        <w:rPr>
+          <w:rFonts w:ascii="Times New Roman" w:cs="Times New Roman" w:eastAsia="Times New Roman" w:hAnsi="Times New Roman"/>
+          <w:sz w:val="24"/>
+          <w:szCs w:val="24"/>
+        </w:rPr>
+        <w:fldChar w:fldCharType="separate"/>
+      </w:r>
+      <w:r>
+        <w:rPr>
+          <w:rFonts w:ascii="Times New Roman" w:cs="Times New Roman" w:eastAsia="Times New Roman" w:hAnsi="Times New Roman"/>
+          <w:sz w:val="24"/>
+          <w:szCs w:val="24"/>
+        </w:rPr>
+        <w:t xml:space="preserve">(Rugulies et al., 2023)</w:t>
+      </w:r>
+      <w:r>
+        <w:rPr>
+          <w:rFonts w:ascii="Times New Roman" w:cs="Times New Roman" w:eastAsia="Times New Roman" w:hAnsi="Times New Roman"/>
+          <w:sz w:val="24"/>
+          <w:szCs w:val="24"/>
+        </w:rPr>
+        <w:fldChar w:fldCharType="end"/>
+      </w:r>
+      <w:r>
+        <w:rPr>
+          <w:rFonts w:ascii="Times New Roman" w:cs="Times New Roman" w:eastAsia="Times New Roman" w:hAnsi="Times New Roman"/>
+          <w:sz w:val="24"/>
+          <w:szCs w:val="24"/>
+        </w:rPr>
+        <w:t xml:space="preserve">. In Brazil, mental and behavioral disorders are among the main causes of absence from work </w:t>
+      </w:r>
+      <w:r>
+        <w:rPr>
+          <w:rFonts w:ascii="Times New Roman" w:cs="Times New Roman" w:eastAsia="Times New Roman" w:hAnsi="Times New Roman"/>
+          <w:sz w:val="24"/>
+          <w:szCs w:val="24"/>
+        </w:rPr>
+        <w:fldChar w:fldCharType="begin"/>
+      </w:r>
+      <w:r>
+        <w:rPr>
+          <w:rFonts w:ascii="Times New Roman" w:cs="Times New Roman" w:eastAsia="Times New Roman" w:hAnsi="Times New Roman"/>
+          <w:sz w:val="24"/>
+          <w:szCs w:val="24"/>
+        </w:rPr>
+        <w:instrText xml:space="preserve"> ADDIN ZOTERO_ITEM CSL_CITATION {"citationID": "AGEM4", "properties": {"formattedCitation": "(Bouzada et al., 2023)", "plainCitation": "(Bouzada et al., 2023)", "noteIndex": 0}, "citationItems": [{"id": "bouzada", "uris": ["http://zotero.org/users/local/agemts/items/BOUZADA"], "itemData": {"type": "article-journal", "author": [{"family": "Bouzada", "given": "DF"}, {"family": "Sol", "given": "NAA"}, {"family": "da Silva", "given": "CAM"}], "title": "Absenteeism due to mental and behavioral disorder in employees of a federal university", "container-title": "Revista Brasileira de Medicina do Trabalho", "issued": {"date-parts": [[2023]]}, "volume": "20", "issue": "4", "page": "515-523", "DOI": "10.47626/1679-4435-2022-763", "PMID": "37101449", "id": "bouzada"}}], "schema": "https://github.com/citation-style-language/schema/raw/master/csl-citation.json"} </w:instrText>
+      </w:r>
+      <w:r>
+        <w:rPr>
+          <w:rFonts w:ascii="Times New Roman" w:cs="Times New Roman" w:eastAsia="Times New Roman" w:hAnsi="Times New Roman"/>
+          <w:sz w:val="24"/>
+          <w:szCs w:val="24"/>
+        </w:rPr>
+        <w:fldChar w:fldCharType="separate"/>
+      </w:r>
+      <w:r>
+        <w:rPr>
+          <w:rFonts w:ascii="Times New Roman" w:cs="Times New Roman" w:eastAsia="Times New Roman" w:hAnsi="Times New Roman"/>
+          <w:sz w:val="24"/>
+          <w:szCs w:val="24"/>
+        </w:rPr>
+        <w:t xml:space="preserve">(Bouzada et al., 2023)</w:t>
+      </w:r>
+      <w:r>
+        <w:rPr>
+          <w:rFonts w:ascii="Times New Roman" w:cs="Times New Roman" w:eastAsia="Times New Roman" w:hAnsi="Times New Roman"/>
+          <w:sz w:val="24"/>
+          <w:szCs w:val="24"/>
+        </w:rPr>
+        <w:fldChar w:fldCharType="end"/>
+      </w:r>
+      <w:r>
+        <w:rPr>
+          <w:rFonts w:ascii="Times New Roman" w:cs="Times New Roman" w:eastAsia="Times New Roman" w:hAnsi="Times New Roman"/>
+          <w:sz w:val="24"/>
+          <w:szCs w:val="24"/>
+        </w:rPr>
+        <w:t xml:space="preserve">. In 2024, Brazil amended Regulatory Standard No. 1 (NR-1) to require employers to identify, evaluate and record psychosocial risk factors in the risk inventory of their occupational risk management program </w:t>
+      </w:r>
+      <w:r>
+        <w:rPr>
+          <w:rFonts w:ascii="Times New Roman" w:cs="Times New Roman" w:eastAsia="Times New Roman" w:hAnsi="Times New Roman"/>
+          <w:sz w:val="24"/>
+          <w:szCs w:val="24"/>
+        </w:rPr>
+        <w:fldChar w:fldCharType="begin"/>
+      </w:r>
+      <w:r>
+        <w:rPr>
+          <w:rFonts w:ascii="Times New Roman" w:cs="Times New Roman" w:eastAsia="Times New Roman" w:hAnsi="Times New Roman"/>
+          <w:sz w:val="24"/>
+          <w:szCs w:val="24"/>
+        </w:rPr>
+        <w:instrText xml:space="preserve"> ADDIN ZOTERO_ITEM CSL_CITATION {"citationID": "AGEM5", "properties": {"formattedCitation": "(Ministério do Trabalho e Emprego, 2024)", "plainCitation": "(Ministério do Trabalho e Emprego, 2024)", "noteIndex": 0}, "citationItems": [{"id": "portaria", "uris": ["http://zotero.org/users/local/agemts/items/PORTARIA"], "itemData": {"id": "portaria", "type": "legislation", "author": [{"literal": "Ministério do Trabalho e Emprego"}], "title": "Portaria MTE nº 1.419, de 27 de agosto de 2024. Aprova a nova redação do capítulo 1.5 \"Gerenciamento de Riscos Ocupacionais\" e altera o Anexo I \"Termos e Definições\" da Norma Regulamentadora nº 1", "container-title": "Diário Oficial da União", "publisher-place": "Brasília", "issued": {"date-parts": [[2024, 8, 27]]}, "URL": "https://www.gov.br/trabalho-e-emprego/pt-br/assuntos/inspecao-do-trabalho/seguranca-e-saude-no-trabalho/sst-portarias/2024/portaria-mte-no-1-419-nr-01-gro-nova-redacao.pdf"}}], "schema": "https://github.com/citation-style-language/schema/raw/master/csl-citation.json"} </w:instrText>
+      </w:r>
+      <w:r>
+        <w:rPr>
+          <w:rFonts w:ascii="Times New Roman" w:cs="Times New Roman" w:eastAsia="Times New Roman" w:hAnsi="Times New Roman"/>
+          <w:sz w:val="24"/>
+          <w:szCs w:val="24"/>
+        </w:rPr>
+        <w:fldChar w:fldCharType="separate"/>
+      </w:r>
+      <w:r>
+        <w:rPr>
+          <w:rFonts w:ascii="Times New Roman" w:cs="Times New Roman" w:eastAsia="Times New Roman" w:hAnsi="Times New Roman"/>
+          <w:sz w:val="24"/>
+          <w:szCs w:val="24"/>
+        </w:rPr>
+        <w:t xml:space="preserve">(Ministério do Trabalho e Emprego, 2024)</w:t>
+      </w:r>
+      <w:r>
+        <w:rPr>
+          <w:rFonts w:ascii="Times New Roman" w:cs="Times New Roman" w:eastAsia="Times New Roman" w:hAnsi="Times New Roman"/>
+          <w:sz w:val="24"/>
+          <w:szCs w:val="24"/>
+        </w:rPr>
+        <w:fldChar w:fldCharType="end"/>
+      </w:r>
+      <w:r>
+        <w:rPr>
+          <w:rFonts w:ascii="Times New Roman" w:cs="Times New Roman" w:eastAsia="Times New Roman" w:hAnsi="Times New Roman"/>
+          <w:sz w:val="24"/>
+          <w:szCs w:val="24"/>
+        </w:rPr>
+        <w:t xml:space="preserve">. The regulation does not specify how these factors should be assessed </w:t>
+      </w:r>
+      <w:r>
+        <w:rPr>
+          <w:rFonts w:ascii="Times New Roman" w:cs="Times New Roman" w:eastAsia="Times New Roman" w:hAnsi="Times New Roman"/>
+          <w:sz w:val="24"/>
+          <w:szCs w:val="24"/>
+        </w:rPr>
+        <w:fldChar w:fldCharType="begin"/>
+      </w:r>
+      <w:r>
+        <w:rPr>
+          <w:rFonts w:ascii="Times New Roman" w:cs="Times New Roman" w:eastAsia="Times New Roman" w:hAnsi="Times New Roman"/>
+          <w:sz w:val="24"/>
+          <w:szCs w:val="24"/>
+        </w:rPr>
+        <w:instrText xml:space="preserve"> ADDIN ZOTERO_ITEM CSL_CITATION {"citationID": "AGEM6", "properties": {"formattedCitation": "(Ministério do Trabalho e Emprego, 2024)", "plainCitation": "(Ministério do Trabalho e Emprego, 2024)", "noteIndex": 0}, "citationItems": [{"id": "portaria", "uris": ["http://zotero.org/users/local/agemts/items/PORTARIA"], "itemData": {"id": "portaria", "type": "legislation", "author": [{"literal": "Ministério do Trabalho e Emprego"}], "title": "Portaria MTE nº 1.419, de 27 de agosto de 2024. Aprova a nova redação do capítulo 1.5 \"Gerenciamento de Riscos Ocupacionais\" e altera o Anexo I \"Termos e Definições\" da Norma Regulamentadora nº 1", "container-title": "Diário Oficial da União", "publisher-place": "Brasília", "issued": {"date-parts": [[2024, 8, 27]]}, "URL": "https://www.gov.br/trabalho-e-emprego/pt-br/assuntos/inspecao-do-trabalho/seguranca-e-saude-no-trabalho/sst-portarias/2024/portaria-mte-no-1-419-nr-01-gro-nova-redacao.pdf"}}], "schema": "https://github.com/citation-style-language/schema/raw/master/csl-citation.json"} </w:instrText>
+      </w:r>
+      <w:r>
+        <w:rPr>
+          <w:rFonts w:ascii="Times New Roman" w:cs="Times New Roman" w:eastAsia="Times New Roman" w:hAnsi="Times New Roman"/>
+          <w:sz w:val="24"/>
+          <w:szCs w:val="24"/>
+        </w:rPr>
+        <w:fldChar w:fldCharType="separate"/>
+      </w:r>
+      <w:r>
+        <w:rPr>
+          <w:rFonts w:ascii="Times New Roman" w:cs="Times New Roman" w:eastAsia="Times New Roman" w:hAnsi="Times New Roman"/>
+          <w:sz w:val="24"/>
+          <w:szCs w:val="24"/>
+        </w:rPr>
+        <w:t xml:space="preserve">(Ministério do Trabalho e Emprego, 2024)</w:t>
+      </w:r>
+      <w:r>
+        <w:rPr>
+          <w:rFonts w:ascii="Times New Roman" w:cs="Times New Roman" w:eastAsia="Times New Roman" w:hAnsi="Times New Roman"/>
+          <w:sz w:val="24"/>
+          <w:szCs w:val="24"/>
+        </w:rPr>
+        <w:fldChar w:fldCharType="end"/>
+      </w:r>
+      <w:r>
+        <w:rPr>
+          <w:rFonts w:ascii="Times New Roman" w:cs="Times New Roman" w:eastAsia="Times New Roman" w:hAnsi="Times New Roman"/>
+          <w:sz w:val="24"/>
+          <w:szCs w:val="24"/>
+        </w:rPr>
+        <w:t xml:space="preserve">. Despite this regulatory change, psychosocial factors at work have been described as insufficiently addressed in Brazil </w:t>
+      </w:r>
+      <w:r>
+        <w:rPr>
+          <w:rFonts w:ascii="Times New Roman" w:cs="Times New Roman" w:eastAsia="Times New Roman" w:hAnsi="Times New Roman"/>
+          <w:sz w:val="24"/>
+          <w:szCs w:val="24"/>
+        </w:rPr>
+        <w:fldChar w:fldCharType="begin"/>
+      </w:r>
+      <w:r>
+        <w:rPr>
+          <w:rFonts w:ascii="Times New Roman" w:cs="Times New Roman" w:eastAsia="Times New Roman" w:hAnsi="Times New Roman"/>
+          <w:sz w:val="24"/>
+          <w:szCs w:val="24"/>
+        </w:rPr>
+        <w:instrText xml:space="preserve"> ADDIN ZOTERO_ITEM CSL_CITATION {"citationID": "AGEM7", "properties": {"formattedCitation": "(de Lucca et al., 2025)", "plainCitation": "(de Lucca et al., 2025)", "noteIndex": 0}, "citationItems": [{"id": "delucca", "uris": ["http://zotero.org/users/local/agemts/items/DELUCCA"], "itemData": {"type": "article-journal", "author": [{"family": "de Lucca", "given": "SR"}, {"family": "Silva Junior", "given": "JS"}, {"family": "Bandini", "given": "M"}], "title": "Critical analysis of psychosocial factors at work within the Risk Management Program of Regulatory Standard-1", "container-title": "Revista Brasileira de Medicina do Trabalho", "issued": {"date-parts": [[2025]]}, "volume": "23", "issue": "1", "page": "e20251425", "DOI": "10.47626/1679-4435-2025-1425", "PMID": "40861191", "id": "delucca"}}], "schema": "https://github.com/citation-style-language/schema/raw/master/csl-citation.json"} </w:instrText>
+      </w:r>
+      <w:r>
+        <w:rPr>
+          <w:rFonts w:ascii="Times New Roman" w:cs="Times New Roman" w:eastAsia="Times New Roman" w:hAnsi="Times New Roman"/>
+          <w:sz w:val="24"/>
+          <w:szCs w:val="24"/>
+        </w:rPr>
+        <w:fldChar w:fldCharType="separate"/>
+      </w:r>
+      <w:r>
+        <w:rPr>
+          <w:rFonts w:ascii="Times New Roman" w:cs="Times New Roman" w:eastAsia="Times New Roman" w:hAnsi="Times New Roman"/>
+          <w:sz w:val="24"/>
+          <w:szCs w:val="24"/>
+        </w:rPr>
+        <w:t xml:space="preserve">(de Lucca et al., 2025)</w:t>
+      </w:r>
+      <w:r>
+        <w:rPr>
+          <w:rFonts w:ascii="Times New Roman" w:cs="Times New Roman" w:eastAsia="Times New Roman" w:hAnsi="Times New Roman"/>
+          <w:sz w:val="24"/>
+          <w:szCs w:val="24"/>
+        </w:rPr>
+        <w:fldChar w:fldCharType="end"/>
+      </w:r>
+      <w:r>
+        <w:rPr>
+          <w:rFonts w:ascii="Times New Roman" w:cs="Times New Roman" w:eastAsia="Times New Roman" w:hAnsi="Times New Roman"/>
+          <w:sz w:val="24"/>
+          <w:szCs w:val="24"/>
+        </w:rPr>
+        <w:t xml:space="preserve">.</w:t>
       </w:r>
     </w:p>
     <w:p>
@@ -211,7 +560,295 @@
           <w:sz w:val="24"/>
           <w:szCs w:val="24"/>
         </w:rPr>
-        <w:t xml:space="preserve">Psychosocial risk factors are conditions of work design, organization and management that can cause harm, and mental health symptoms are one possible consequence of exposure to them (International Organization for Standardization, 2021; Teixeira et al., 2025). In the Job Demands-Resources model, strain develops when job demands are high and job resources such as autonomy and supervisory support are insufficient (Bakker &amp; Demerouti, 2007; Demerouti et al., 2001). Low work autonomy has been associated with poorer mental health (Lu et al., 2023), and persistent low job control has predicted later major depression (Taouk et al., 2024). Low freedom at work has also predicted later mental health service use (Niedhammer et al., 2026), and poor quality of leadership has predicted later mental distress (Burr et al., 2025; Fløvik et al., 2020).</w:t>
+        <w:t xml:space="preserve">Psychosocial risk factors are conditions of work design, organization and management that can cause harm, and mental health symptoms are one possible consequence of exposure to them </w:t>
+      </w:r>
+      <w:r>
+        <w:rPr>
+          <w:rFonts w:ascii="Times New Roman" w:cs="Times New Roman" w:eastAsia="Times New Roman" w:hAnsi="Times New Roman"/>
+          <w:sz w:val="24"/>
+          <w:szCs w:val="24"/>
+        </w:rPr>
+        <w:fldChar w:fldCharType="begin"/>
+      </w:r>
+      <w:r>
+        <w:rPr>
+          <w:rFonts w:ascii="Times New Roman" w:cs="Times New Roman" w:eastAsia="Times New Roman" w:hAnsi="Times New Roman"/>
+          <w:sz w:val="24"/>
+          <w:szCs w:val="24"/>
+        </w:rPr>
+        <w:instrText xml:space="preserve"> ADDIN ZOTERO_ITEM CSL_CITATION {"citationID": "AGEM8", "properties": {"formattedCitation": "(International Organization for Standardization, 2021; Teixeira et al., 2025)", "plainCitation": "(International Organization for Standardization, 2021; Teixeira et al., 2025)", "noteIndex": 0}, "citationItems": [{"id": "iso", "uris": ["http://zotero.org/users/local/agemts/items/ISO"], "itemData": {"id": "iso", "type": "standard", "author": [{"literal": "International Organization for Standardization"}], "title": "Occupational health and safety management: Psychological health and safety at work: Guidelines for managing psychosocial risks (ISO Standard No. 45003:2021)", "publisher": "ISO", "publisher-place": "Geneva", "issued": {"date-parts": [[2021]]}, "URL": "https://www.iso.org/standard/64283.html"}}, {"id": "teixeira", "uris": ["http://zotero.org/users/local/agemts/items/TEIXEIRA"], "itemData": {"id": "teixeira", "type": "article-journal", "author": [{"family": "Teixeira", "given": "IDN"}, {"family": "Silva", "given": "IS"}, {"family": "Cadime", "given": "IMD"}], "title": "Psychosocial risks at work: integrative review and conceptual perspectives", "container-title": "Revista Brasileira de Medicina do Trabalho", "container-title-short": "Rev Bras Med Trab", "issued": {"date-parts": [[2025]]}, "volume": "23", "issue": "2", "page": "e20251464", "DOI": "10.47626/1679-4435-2025-1464"}}], "schema": "https://github.com/citation-style-language/schema/raw/master/csl-citation.json"} </w:instrText>
+      </w:r>
+      <w:r>
+        <w:rPr>
+          <w:rFonts w:ascii="Times New Roman" w:cs="Times New Roman" w:eastAsia="Times New Roman" w:hAnsi="Times New Roman"/>
+          <w:sz w:val="24"/>
+          <w:szCs w:val="24"/>
+        </w:rPr>
+        <w:fldChar w:fldCharType="separate"/>
+      </w:r>
+      <w:r>
+        <w:rPr>
+          <w:rFonts w:ascii="Times New Roman" w:cs="Times New Roman" w:eastAsia="Times New Roman" w:hAnsi="Times New Roman"/>
+          <w:sz w:val="24"/>
+          <w:szCs w:val="24"/>
+        </w:rPr>
+        <w:t xml:space="preserve">(International Organization for Standardization, 2021; Teixeira et al., 2025)</w:t>
+      </w:r>
+      <w:r>
+        <w:rPr>
+          <w:rFonts w:ascii="Times New Roman" w:cs="Times New Roman" w:eastAsia="Times New Roman" w:hAnsi="Times New Roman"/>
+          <w:sz w:val="24"/>
+          <w:szCs w:val="24"/>
+        </w:rPr>
+        <w:fldChar w:fldCharType="end"/>
+      </w:r>
+      <w:r>
+        <w:rPr>
+          <w:rFonts w:ascii="Times New Roman" w:cs="Times New Roman" w:eastAsia="Times New Roman" w:hAnsi="Times New Roman"/>
+          <w:sz w:val="24"/>
+          <w:szCs w:val="24"/>
+        </w:rPr>
+        <w:t xml:space="preserve">. In the Job Demands-Resources model, strain develops when job demands are high and job resources such as autonomy and supervisory support are insufficient </w:t>
+      </w:r>
+      <w:r>
+        <w:rPr>
+          <w:rFonts w:ascii="Times New Roman" w:cs="Times New Roman" w:eastAsia="Times New Roman" w:hAnsi="Times New Roman"/>
+          <w:sz w:val="24"/>
+          <w:szCs w:val="24"/>
+        </w:rPr>
+        <w:fldChar w:fldCharType="begin"/>
+      </w:r>
+      <w:r>
+        <w:rPr>
+          <w:rFonts w:ascii="Times New Roman" w:cs="Times New Roman" w:eastAsia="Times New Roman" w:hAnsi="Times New Roman"/>
+          <w:sz w:val="24"/>
+          <w:szCs w:val="24"/>
+        </w:rPr>
+        <w:instrText xml:space="preserve"> ADDIN ZOTERO_ITEM CSL_CITATION {"citationID": "AGEM9", "properties": {"formattedCitation": "(Bakker &amp; Demerouti, 2007; Demerouti et al., 2001)", "plainCitation": "(Bakker &amp; Demerouti, 2007; Demerouti et al., 2001)", "noteIndex": 0}, "citationItems": [{"id": "bakker", "uris": ["http://zotero.org/users/local/agemts/items/BAKKER"], "itemData": {"id": "bakker", "type": "article-journal", "author": [{"family": "Bakker", "given": "AB"}, {"family": "Demerouti", "given": "E"}], "title": "The Job Demands-Resources model: state of the art", "container-title": "Journal of Managerial Psychology", "container-title-short": "J Manag Psychol", "issued": {"date-parts": [[2007]]}, "volume": "22", "issue": "3", "page": "309-328", "DOI": "10.1108/02683940710733115"}}, {"id": "demerouti", "uris": ["http://zotero.org/users/local/agemts/items/DEMEROUTI"], "itemData": {"id": "demerouti", "type": "article-journal", "author": [{"family": "Demerouti", "given": "E"}, {"family": "Bakker", "given": "AB"}, {"family": "Nachreiner", "given": "F"}, {"family": "Schaufeli", "given": "WB"}], "title": "The job demands-resources model of burnout", "container-title": "Journal of Applied Psychology", "container-title-short": "J Appl Psychol", "issued": {"date-parts": [[2001]]}, "volume": "86", "issue": "3", "page": "499-512", "DOI": "10.1037/0021-9010.86.3.499"}}], "schema": "https://github.com/citation-style-language/schema/raw/master/csl-citation.json"} </w:instrText>
+      </w:r>
+      <w:r>
+        <w:rPr>
+          <w:rFonts w:ascii="Times New Roman" w:cs="Times New Roman" w:eastAsia="Times New Roman" w:hAnsi="Times New Roman"/>
+          <w:sz w:val="24"/>
+          <w:szCs w:val="24"/>
+        </w:rPr>
+        <w:fldChar w:fldCharType="separate"/>
+      </w:r>
+      <w:r>
+        <w:rPr>
+          <w:rFonts w:ascii="Times New Roman" w:cs="Times New Roman" w:eastAsia="Times New Roman" w:hAnsi="Times New Roman"/>
+          <w:sz w:val="24"/>
+          <w:szCs w:val="24"/>
+        </w:rPr>
+        <w:t xml:space="preserve">(Bakker &amp; Demerouti, 2007; Demerouti et al., 2001)</w:t>
+      </w:r>
+      <w:r>
+        <w:rPr>
+          <w:rFonts w:ascii="Times New Roman" w:cs="Times New Roman" w:eastAsia="Times New Roman" w:hAnsi="Times New Roman"/>
+          <w:sz w:val="24"/>
+          <w:szCs w:val="24"/>
+        </w:rPr>
+        <w:fldChar w:fldCharType="end"/>
+      </w:r>
+      <w:r>
+        <w:rPr>
+          <w:rFonts w:ascii="Times New Roman" w:cs="Times New Roman" w:eastAsia="Times New Roman" w:hAnsi="Times New Roman"/>
+          <w:sz w:val="24"/>
+          <w:szCs w:val="24"/>
+        </w:rPr>
+        <w:t xml:space="preserve">. Low work autonomy has been associated with poorer mental health </w:t>
+      </w:r>
+      <w:r>
+        <w:rPr>
+          <w:rFonts w:ascii="Times New Roman" w:cs="Times New Roman" w:eastAsia="Times New Roman" w:hAnsi="Times New Roman"/>
+          <w:sz w:val="24"/>
+          <w:szCs w:val="24"/>
+        </w:rPr>
+        <w:fldChar w:fldCharType="begin"/>
+      </w:r>
+      <w:r>
+        <w:rPr>
+          <w:rFonts w:ascii="Times New Roman" w:cs="Times New Roman" w:eastAsia="Times New Roman" w:hAnsi="Times New Roman"/>
+          <w:sz w:val="24"/>
+          <w:szCs w:val="24"/>
+        </w:rPr>
+        <w:instrText xml:space="preserve"> ADDIN ZOTERO_ITEM CSL_CITATION {"citationID": "AGEM10", "properties": {"formattedCitation": "(Lu et al., 2023)", "plainCitation": "(Lu et al., 2023)", "noteIndex": 0}, "citationItems": [{"id": "lu", "uris": ["http://zotero.org/users/local/agemts/items/LU"], "itemData": {"id": "lu", "type": "article-journal", "author": [{"family": "Lu", "given": "Z"}, {"family": "Wang", "given": "S"}, {"family": "Li", "given": "Y"}, {"family": "Liu", "given": "X"}, {"family": "Olsen", "given": "W"}], "title": "Who gains mental health benefits from work autonomy? The roles of gender and occupational class", "container-title": "Applied Research in Quality of Life", "container-title-short": "Appl Res Qual Life", "issued": {"date-parts": [[2023]]}, "DOI": "10.1007/s11482-023-10161-4", "page": "1-23"}}], "schema": "https://github.com/citation-style-language/schema/raw/master/csl-citation.json"} </w:instrText>
+      </w:r>
+      <w:r>
+        <w:rPr>
+          <w:rFonts w:ascii="Times New Roman" w:cs="Times New Roman" w:eastAsia="Times New Roman" w:hAnsi="Times New Roman"/>
+          <w:sz w:val="24"/>
+          <w:szCs w:val="24"/>
+        </w:rPr>
+        <w:fldChar w:fldCharType="separate"/>
+      </w:r>
+      <w:r>
+        <w:rPr>
+          <w:rFonts w:ascii="Times New Roman" w:cs="Times New Roman" w:eastAsia="Times New Roman" w:hAnsi="Times New Roman"/>
+          <w:sz w:val="24"/>
+          <w:szCs w:val="24"/>
+        </w:rPr>
+        <w:t xml:space="preserve">(Lu et al., 2023)</w:t>
+      </w:r>
+      <w:r>
+        <w:rPr>
+          <w:rFonts w:ascii="Times New Roman" w:cs="Times New Roman" w:eastAsia="Times New Roman" w:hAnsi="Times New Roman"/>
+          <w:sz w:val="24"/>
+          <w:szCs w:val="24"/>
+        </w:rPr>
+        <w:fldChar w:fldCharType="end"/>
+      </w:r>
+      <w:r>
+        <w:rPr>
+          <w:rFonts w:ascii="Times New Roman" w:cs="Times New Roman" w:eastAsia="Times New Roman" w:hAnsi="Times New Roman"/>
+          <w:sz w:val="24"/>
+          <w:szCs w:val="24"/>
+        </w:rPr>
+        <w:t xml:space="preserve">, and persistent low job control has predicted later major depression </w:t>
+      </w:r>
+      <w:r>
+        <w:rPr>
+          <w:rFonts w:ascii="Times New Roman" w:cs="Times New Roman" w:eastAsia="Times New Roman" w:hAnsi="Times New Roman"/>
+          <w:sz w:val="24"/>
+          <w:szCs w:val="24"/>
+        </w:rPr>
+        <w:fldChar w:fldCharType="begin"/>
+      </w:r>
+      <w:r>
+        <w:rPr>
+          <w:rFonts w:ascii="Times New Roman" w:cs="Times New Roman" w:eastAsia="Times New Roman" w:hAnsi="Times New Roman"/>
+          <w:sz w:val="24"/>
+          <w:szCs w:val="24"/>
+        </w:rPr>
+        <w:instrText xml:space="preserve"> ADDIN ZOTERO_ITEM CSL_CITATION {"citationID": "AGEM11", "properties": {"formattedCitation": "(Taouk et al., 2024)", "plainCitation": "(Taouk et al., 2024)", "noteIndex": 0}, "citationItems": [{"id": "taouk", "uris": ["http://zotero.org/users/local/agemts/items/TAOUK"], "itemData": {"type": "article-journal", "author": [{"family": "Taouk", "given": "Y"}, {"family": "Aitken", "given": "Z"}, {"family": "LaMontagne", "given": "AD"}, {"family": "King", "given": "T"}], "title": "Persistent low job control and subsequent major depression: a prospective cohort study of Australian working males", "container-title": "Social Science &amp; Medicine", "issued": {"date-parts": [[2024]]}, "volume": "359", "page": "117283", "DOI": "10.1016/j.socscimed.2024.117283", "PMID": "39232379", "id": "taouk"}}], "schema": "https://github.com/citation-style-language/schema/raw/master/csl-citation.json"} </w:instrText>
+      </w:r>
+      <w:r>
+        <w:rPr>
+          <w:rFonts w:ascii="Times New Roman" w:cs="Times New Roman" w:eastAsia="Times New Roman" w:hAnsi="Times New Roman"/>
+          <w:sz w:val="24"/>
+          <w:szCs w:val="24"/>
+        </w:rPr>
+        <w:fldChar w:fldCharType="separate"/>
+      </w:r>
+      <w:r>
+        <w:rPr>
+          <w:rFonts w:ascii="Times New Roman" w:cs="Times New Roman" w:eastAsia="Times New Roman" w:hAnsi="Times New Roman"/>
+          <w:sz w:val="24"/>
+          <w:szCs w:val="24"/>
+        </w:rPr>
+        <w:t xml:space="preserve">(Taouk et al., 2024)</w:t>
+      </w:r>
+      <w:r>
+        <w:rPr>
+          <w:rFonts w:ascii="Times New Roman" w:cs="Times New Roman" w:eastAsia="Times New Roman" w:hAnsi="Times New Roman"/>
+          <w:sz w:val="24"/>
+          <w:szCs w:val="24"/>
+        </w:rPr>
+        <w:fldChar w:fldCharType="end"/>
+      </w:r>
+      <w:r>
+        <w:rPr>
+          <w:rFonts w:ascii="Times New Roman" w:cs="Times New Roman" w:eastAsia="Times New Roman" w:hAnsi="Times New Roman"/>
+          <w:sz w:val="24"/>
+          <w:szCs w:val="24"/>
+        </w:rPr>
+        <w:t xml:space="preserve">. Low freedom at work has also predicted later mental health service use </w:t>
+      </w:r>
+      <w:r>
+        <w:rPr>
+          <w:rFonts w:ascii="Times New Roman" w:cs="Times New Roman" w:eastAsia="Times New Roman" w:hAnsi="Times New Roman"/>
+          <w:sz w:val="24"/>
+          <w:szCs w:val="24"/>
+        </w:rPr>
+        <w:fldChar w:fldCharType="begin"/>
+      </w:r>
+      <w:r>
+        <w:rPr>
+          <w:rFonts w:ascii="Times New Roman" w:cs="Times New Roman" w:eastAsia="Times New Roman" w:hAnsi="Times New Roman"/>
+          <w:sz w:val="24"/>
+          <w:szCs w:val="24"/>
+        </w:rPr>
+        <w:instrText xml:space="preserve"> ADDIN ZOTERO_ITEM CSL_CITATION {"citationID": "AGEM12", "properties": {"formattedCitation": "(Niedhammer et al., 2026)", "plainCitation": "(Niedhammer et al., 2026)", "noteIndex": 0}, "citationItems": [{"id": "niedhammer2026", "uris": ["http://zotero.org/users/local/agemts/items/NIEDHAMMER2026"], "itemData": {"type": "article-journal", "author": [{"family": "Niedhammer", "given": "I"}, {"family": "Quatrevaux", "given": "M"}, {"family": "Bertrais", "given": "S"}], "title": "Psychosocial work factors and subsequent mental health service use: a prospective study using the national ESPS survey in France", "container-title": "European Journal of Public Health", "issued": {"date-parts": [[2026]]}, "volume": "36", "issue": "2", "DOI": "10.1093/eurpub/ckag012", "PMID": "41632690", "id": "niedhammer2026"}}], "schema": "https://github.com/citation-style-language/schema/raw/master/csl-citation.json"} </w:instrText>
+      </w:r>
+      <w:r>
+        <w:rPr>
+          <w:rFonts w:ascii="Times New Roman" w:cs="Times New Roman" w:eastAsia="Times New Roman" w:hAnsi="Times New Roman"/>
+          <w:sz w:val="24"/>
+          <w:szCs w:val="24"/>
+        </w:rPr>
+        <w:fldChar w:fldCharType="separate"/>
+      </w:r>
+      <w:r>
+        <w:rPr>
+          <w:rFonts w:ascii="Times New Roman" w:cs="Times New Roman" w:eastAsia="Times New Roman" w:hAnsi="Times New Roman"/>
+          <w:sz w:val="24"/>
+          <w:szCs w:val="24"/>
+        </w:rPr>
+        <w:t xml:space="preserve">(Niedhammer et al., 2026)</w:t>
+      </w:r>
+      <w:r>
+        <w:rPr>
+          <w:rFonts w:ascii="Times New Roman" w:cs="Times New Roman" w:eastAsia="Times New Roman" w:hAnsi="Times New Roman"/>
+          <w:sz w:val="24"/>
+          <w:szCs w:val="24"/>
+        </w:rPr>
+        <w:fldChar w:fldCharType="end"/>
+      </w:r>
+      <w:r>
+        <w:rPr>
+          <w:rFonts w:ascii="Times New Roman" w:cs="Times New Roman" w:eastAsia="Times New Roman" w:hAnsi="Times New Roman"/>
+          <w:sz w:val="24"/>
+          <w:szCs w:val="24"/>
+        </w:rPr>
+        <w:t xml:space="preserve">, and poor quality of leadership has predicted later mental distress </w:t>
+      </w:r>
+      <w:r>
+        <w:rPr>
+          <w:rFonts w:ascii="Times New Roman" w:cs="Times New Roman" w:eastAsia="Times New Roman" w:hAnsi="Times New Roman"/>
+          <w:sz w:val="24"/>
+          <w:szCs w:val="24"/>
+        </w:rPr>
+        <w:fldChar w:fldCharType="begin"/>
+      </w:r>
+      <w:r>
+        <w:rPr>
+          <w:rFonts w:ascii="Times New Roman" w:cs="Times New Roman" w:eastAsia="Times New Roman" w:hAnsi="Times New Roman"/>
+          <w:sz w:val="24"/>
+          <w:szCs w:val="24"/>
+        </w:rPr>
+        <w:instrText xml:space="preserve"> ADDIN ZOTERO_ITEM CSL_CITATION {"citationID": "AGEM13", "properties": {"formattedCitation": "(Burr et al., 2025; Fløvik et al., 2020)", "plainCitation": "(Burr et al., 2025; Fløvik et al., 2020)", "noteIndex": 0}, "citationItems": [{"id": "burr", "uris": ["http://zotero.org/users/local/agemts/items/BURR"], "itemData": {"id": "burr", "type": "article-journal", "author": [{"family": "Burr", "given": "H"}, {"family": "Kersten", "given": "N"}, {"family": "Sørensen", "given": "K"}, {"family": "Sørensen", "given": "JK"}, {"family": "Dalsager", "given": "L"}, {"family": "Madsen", "given": "IEH"}, {"family": "Schöllgen", "given": "I"}, {"family": "d'Errico", "given": "A"}, {"family": "Rose", "given": "U"}, {"family": "Rugulies", "given": "R"}], "title": "A comparison among employees in Germany and Denmark of associations between quality of leadership and subsequent 5-year development of mental distress", "container-title": "Scientific Reports", "container-title-short": "Sci Rep", "issued": {"date-parts": [[2025]]}, "volume": "15", "issue": "1", "page": "7802", "DOI": "10.1038/s41598-025-92650-0"}}, {"id": "flovik", "uris": ["http://zotero.org/users/local/agemts/items/FLOVIK"], "itemData": {"id": "flovik", "type": "article-journal", "author": [{"family": "Fløvik", "given": "L"}, {"family": "Knardahl", "given": "S"}, {"family": "Christensen", "given": "JO"}], "title": "How leadership behaviors influence the effects of job predictability and perceived employability on employee mental health – a multilevel, prospective study", "container-title": "Scandinavian Journal of Work, Environment &amp; Health", "container-title-short": "Scand J Work Environ Health", "issued": {"date-parts": [[2020]]}, "volume": "46", "issue": "4", "page": "392-401", "DOI": "10.5271/sjweh.3880"}}], "schema": "https://github.com/citation-style-language/schema/raw/master/csl-citation.json"} </w:instrText>
+      </w:r>
+      <w:r>
+        <w:rPr>
+          <w:rFonts w:ascii="Times New Roman" w:cs="Times New Roman" w:eastAsia="Times New Roman" w:hAnsi="Times New Roman"/>
+          <w:sz w:val="24"/>
+          <w:szCs w:val="24"/>
+        </w:rPr>
+        <w:fldChar w:fldCharType="separate"/>
+      </w:r>
+      <w:r>
+        <w:rPr>
+          <w:rFonts w:ascii="Times New Roman" w:cs="Times New Roman" w:eastAsia="Times New Roman" w:hAnsi="Times New Roman"/>
+          <w:sz w:val="24"/>
+          <w:szCs w:val="24"/>
+        </w:rPr>
+        <w:t xml:space="preserve">(Burr et al., 2025; Fløvik et al., 2020)</w:t>
+      </w:r>
+      <w:r>
+        <w:rPr>
+          <w:rFonts w:ascii="Times New Roman" w:cs="Times New Roman" w:eastAsia="Times New Roman" w:hAnsi="Times New Roman"/>
+          <w:sz w:val="24"/>
+          <w:szCs w:val="24"/>
+        </w:rPr>
+        <w:fldChar w:fldCharType="end"/>
+      </w:r>
+      <w:r>
+        <w:rPr>
+          <w:rFonts w:ascii="Times New Roman" w:cs="Times New Roman" w:eastAsia="Times New Roman" w:hAnsi="Times New Roman"/>
+          <w:sz w:val="24"/>
+          <w:szCs w:val="24"/>
+        </w:rPr>
+        <w:t xml:space="preserve">.</w:t>
       </w:r>
     </w:p>
     <w:p>
@@ -225,7 +862,247 @@
           <w:sz w:val="24"/>
           <w:szCs w:val="24"/>
         </w:rPr>
-        <w:t xml:space="preserve">Guidance on psychosocial risk management describes assessment as part of a continuing cycle of identification, action and review (International Organization for Standardization, 2021). Organizational level interventions can improve the psychosocial work environment and the health of employees (Aust et al., 2023; Rugulies et al., 2023). In Europe, national legislation on psychosocial risks has been associated with more enterprises having action plans for work related stress, and these plans with more job resources (Jain et al., 2022). Monitoring therefore requires that the same indicators be measured at successive points in time. Anonymous workforce surveys protect employees, but their responses cannot be linked over time, so successive waves describe the workforce rather than individuals ([Authors], under review). A recent review identified 66 mental health and well being assessments with utility for employers (Imboden et al., 2024). To our knowledge, few studies describe how psychosocial risk indicators evolve across monitoring waves in Brazilian companies.</w:t>
+        <w:t xml:space="preserve">Guidance on psychosocial risk management describes assessment as part of a continuing cycle of identification, action and review </w:t>
+      </w:r>
+      <w:r>
+        <w:rPr>
+          <w:rFonts w:ascii="Times New Roman" w:cs="Times New Roman" w:eastAsia="Times New Roman" w:hAnsi="Times New Roman"/>
+          <w:sz w:val="24"/>
+          <w:szCs w:val="24"/>
+        </w:rPr>
+        <w:fldChar w:fldCharType="begin"/>
+      </w:r>
+      <w:r>
+        <w:rPr>
+          <w:rFonts w:ascii="Times New Roman" w:cs="Times New Roman" w:eastAsia="Times New Roman" w:hAnsi="Times New Roman"/>
+          <w:sz w:val="24"/>
+          <w:szCs w:val="24"/>
+        </w:rPr>
+        <w:instrText xml:space="preserve"> ADDIN ZOTERO_ITEM CSL_CITATION {"citationID": "AGEM14", "properties": {"formattedCitation": "(International Organization for Standardization, 2021)", "plainCitation": "(International Organization for Standardization, 2021)", "noteIndex": 0}, "citationItems": [{"id": "iso", "uris": ["http://zotero.org/users/local/agemts/items/ISO"], "itemData": {"id": "iso", "type": "standard", "author": [{"literal": "International Organization for Standardization"}], "title": "Occupational health and safety management: Psychological health and safety at work: Guidelines for managing psychosocial risks (ISO Standard No. 45003:2021)", "publisher": "ISO", "publisher-place": "Geneva", "issued": {"date-parts": [[2021]]}, "URL": "https://www.iso.org/standard/64283.html"}}], "schema": "https://github.com/citation-style-language/schema/raw/master/csl-citation.json"} </w:instrText>
+      </w:r>
+      <w:r>
+        <w:rPr>
+          <w:rFonts w:ascii="Times New Roman" w:cs="Times New Roman" w:eastAsia="Times New Roman" w:hAnsi="Times New Roman"/>
+          <w:sz w:val="24"/>
+          <w:szCs w:val="24"/>
+        </w:rPr>
+        <w:fldChar w:fldCharType="separate"/>
+      </w:r>
+      <w:r>
+        <w:rPr>
+          <w:rFonts w:ascii="Times New Roman" w:cs="Times New Roman" w:eastAsia="Times New Roman" w:hAnsi="Times New Roman"/>
+          <w:sz w:val="24"/>
+          <w:szCs w:val="24"/>
+        </w:rPr>
+        <w:t xml:space="preserve">(International Organization for Standardization, 2021)</w:t>
+      </w:r>
+      <w:r>
+        <w:rPr>
+          <w:rFonts w:ascii="Times New Roman" w:cs="Times New Roman" w:eastAsia="Times New Roman" w:hAnsi="Times New Roman"/>
+          <w:sz w:val="24"/>
+          <w:szCs w:val="24"/>
+        </w:rPr>
+        <w:fldChar w:fldCharType="end"/>
+      </w:r>
+      <w:r>
+        <w:rPr>
+          <w:rFonts w:ascii="Times New Roman" w:cs="Times New Roman" w:eastAsia="Times New Roman" w:hAnsi="Times New Roman"/>
+          <w:sz w:val="24"/>
+          <w:szCs w:val="24"/>
+        </w:rPr>
+        <w:t xml:space="preserve">. Organizational level interventions can improve the psychosocial work environment and the health of employees </w:t>
+      </w:r>
+      <w:r>
+        <w:rPr>
+          <w:rFonts w:ascii="Times New Roman" w:cs="Times New Roman" w:eastAsia="Times New Roman" w:hAnsi="Times New Roman"/>
+          <w:sz w:val="24"/>
+          <w:szCs w:val="24"/>
+        </w:rPr>
+        <w:fldChar w:fldCharType="begin"/>
+      </w:r>
+      <w:r>
+        <w:rPr>
+          <w:rFonts w:ascii="Times New Roman" w:cs="Times New Roman" w:eastAsia="Times New Roman" w:hAnsi="Times New Roman"/>
+          <w:sz w:val="24"/>
+          <w:szCs w:val="24"/>
+        </w:rPr>
+        <w:instrText xml:space="preserve"> ADDIN ZOTERO_ITEM CSL_CITATION {"citationID": "AGEM15", "properties": {"formattedCitation": "(Aust et al., 2023; Rugulies et al., 2023)", "plainCitation": "(Aust et al., 2023; Rugulies et al., 2023)", "noteIndex": 0}, "citationItems": [{"id": "aust", "uris": ["http://zotero.org/users/local/agemts/items/AUST"], "itemData": {"type": "article-journal", "author": [{"family": "Aust", "given": "B"}, {"family": "Møller", "given": "JL"}, {"family": "Nordentoft", "given": "M"}, {"family": "Frydendall", "given": "KB"}, {"family": "Bengtsen", "given": "E"}, {"family": "Jensen", "given": "AB"}, {"family": "Garde", "given": "AH"}, {"family": "Kompier", "given": "M"}, {"family": "Semmer", "given": "N"}, {"family": "Rugulies", "given": "R"}, {"family": "Jaspers", "given": "SØ"}], "title": "How effective are organizational-level interventions in improving the psychosocial work environment, health, and retention of workers? A systematic overview of systematic reviews", "container-title": "Scandinavian Journal of Work, Environment &amp; Health", "issued": {"date-parts": [[2023]]}, "volume": "49", "issue": "5", "page": "315-329", "DOI": "10.5271/sjweh.4097", "PMID": "37158211", "id": "aust"}}, {"id": "rugulies", "uris": ["http://zotero.org/users/local/agemts/items/RUGULIES"], "itemData": {"type": "article-journal", "author": [{"family": "Rugulies", "given": "R"}, {"family": "Aust", "given": "B"}, {"family": "Greiner", "given": "BA"}, {"family": "Arensman", "given": "E"}, {"family": "Kawakami", "given": "N"}, {"family": "LaMontagne", "given": "AD"}, {"family": "Madsen", "given": "IEH"}], "title": "Work-related causes of mental health conditions and interventions for their improvement in workplaces", "container-title": "The Lancet", "issued": {"date-parts": [[2023]]}, "volume": "402", "issue": "10410", "page": "1368-1381", "DOI": "10.1016/S0140-6736(23)00869-3", "PMID": "37838442", "id": "rugulies"}}], "schema": "https://github.com/citation-style-language/schema/raw/master/csl-citation.json"} </w:instrText>
+      </w:r>
+      <w:r>
+        <w:rPr>
+          <w:rFonts w:ascii="Times New Roman" w:cs="Times New Roman" w:eastAsia="Times New Roman" w:hAnsi="Times New Roman"/>
+          <w:sz w:val="24"/>
+          <w:szCs w:val="24"/>
+        </w:rPr>
+        <w:fldChar w:fldCharType="separate"/>
+      </w:r>
+      <w:r>
+        <w:rPr>
+          <w:rFonts w:ascii="Times New Roman" w:cs="Times New Roman" w:eastAsia="Times New Roman" w:hAnsi="Times New Roman"/>
+          <w:sz w:val="24"/>
+          <w:szCs w:val="24"/>
+        </w:rPr>
+        <w:t xml:space="preserve">(Aust et al., 2023; Rugulies et al., 2023)</w:t>
+      </w:r>
+      <w:r>
+        <w:rPr>
+          <w:rFonts w:ascii="Times New Roman" w:cs="Times New Roman" w:eastAsia="Times New Roman" w:hAnsi="Times New Roman"/>
+          <w:sz w:val="24"/>
+          <w:szCs w:val="24"/>
+        </w:rPr>
+        <w:fldChar w:fldCharType="end"/>
+      </w:r>
+      <w:r>
+        <w:rPr>
+          <w:rFonts w:ascii="Times New Roman" w:cs="Times New Roman" w:eastAsia="Times New Roman" w:hAnsi="Times New Roman"/>
+          <w:sz w:val="24"/>
+          <w:szCs w:val="24"/>
+        </w:rPr>
+        <w:t xml:space="preserve">. In Europe, national legislation on psychosocial risks has been associated with more enterprises having action plans for work related stress, and these plans with more job resources </w:t>
+      </w:r>
+      <w:r>
+        <w:rPr>
+          <w:rFonts w:ascii="Times New Roman" w:cs="Times New Roman" w:eastAsia="Times New Roman" w:hAnsi="Times New Roman"/>
+          <w:sz w:val="24"/>
+          <w:szCs w:val="24"/>
+        </w:rPr>
+        <w:fldChar w:fldCharType="begin"/>
+      </w:r>
+      <w:r>
+        <w:rPr>
+          <w:rFonts w:ascii="Times New Roman" w:cs="Times New Roman" w:eastAsia="Times New Roman" w:hAnsi="Times New Roman"/>
+          <w:sz w:val="24"/>
+          <w:szCs w:val="24"/>
+        </w:rPr>
+        <w:instrText xml:space="preserve"> ADDIN ZOTERO_ITEM CSL_CITATION {"citationID": "AGEM16", "properties": {"formattedCitation": "(Jain et al., 2022)", "plainCitation": "(Jain et al., 2022)", "noteIndex": 0}, "citationItems": [{"id": "jain", "uris": ["http://zotero.org/users/local/agemts/items/JAIN"], "itemData": {"type": "article-journal", "author": [{"family": "Jain", "given": "A"}, {"family": "Torres", "given": "LD"}, {"family": "Teoh", "given": "K"}, {"family": "Leka", "given": "S"}], "title": "The impact of national legislation on psychosocial risks on organisational action plans, psychosocial working conditions, and employee work-related stress in Europe", "container-title": "Social Science &amp; Medicine", "issued": {"date-parts": [[2022]]}, "volume": "302", "page": "114987", "DOI": "10.1016/j.socscimed.2022.114987", "PMID": "35500313", "id": "jain"}}], "schema": "https://github.com/citation-style-language/schema/raw/master/csl-citation.json"} </w:instrText>
+      </w:r>
+      <w:r>
+        <w:rPr>
+          <w:rFonts w:ascii="Times New Roman" w:cs="Times New Roman" w:eastAsia="Times New Roman" w:hAnsi="Times New Roman"/>
+          <w:sz w:val="24"/>
+          <w:szCs w:val="24"/>
+        </w:rPr>
+        <w:fldChar w:fldCharType="separate"/>
+      </w:r>
+      <w:r>
+        <w:rPr>
+          <w:rFonts w:ascii="Times New Roman" w:cs="Times New Roman" w:eastAsia="Times New Roman" w:hAnsi="Times New Roman"/>
+          <w:sz w:val="24"/>
+          <w:szCs w:val="24"/>
+        </w:rPr>
+        <w:t xml:space="preserve">(Jain et al., 2022)</w:t>
+      </w:r>
+      <w:r>
+        <w:rPr>
+          <w:rFonts w:ascii="Times New Roman" w:cs="Times New Roman" w:eastAsia="Times New Roman" w:hAnsi="Times New Roman"/>
+          <w:sz w:val="24"/>
+          <w:szCs w:val="24"/>
+        </w:rPr>
+        <w:fldChar w:fldCharType="end"/>
+      </w:r>
+      <w:r>
+        <w:rPr>
+          <w:rFonts w:ascii="Times New Roman" w:cs="Times New Roman" w:eastAsia="Times New Roman" w:hAnsi="Times New Roman"/>
+          <w:sz w:val="24"/>
+          <w:szCs w:val="24"/>
+        </w:rPr>
+        <w:t xml:space="preserve">. Monitoring therefore requires that the same indicators be measured at successive points in time. Anonymous workforce surveys protect employees, but their responses cannot be linked over time, so successive waves describe the workforce rather than individuals </w:t>
+      </w:r>
+      <w:r>
+        <w:rPr>
+          <w:rFonts w:ascii="Times New Roman" w:cs="Times New Roman" w:eastAsia="Times New Roman" w:hAnsi="Times New Roman"/>
+          <w:sz w:val="24"/>
+          <w:szCs w:val="24"/>
+        </w:rPr>
+        <w:fldChar w:fldCharType="begin"/>
+      </w:r>
+      <w:r>
+        <w:rPr>
+          <w:rFonts w:ascii="Times New Roman" w:cs="Times New Roman" w:eastAsia="Times New Roman" w:hAnsi="Times New Roman"/>
+          <w:sz w:val="24"/>
+          <w:szCs w:val="24"/>
+        </w:rPr>
+        <w:instrText xml:space="preserve"> ADDIN ZOTERO_ITEM CSL_CITATION {"citationID": "AGEM17", "properties": {"formattedCitation": "(Lima et al., 2026)", "plainCitation": "(Lima et al., 2026)", "noteIndex": 0}, "citationItems": [{"id": "lima", "uris": ["http://zotero.org/users/local/agemts/items/LIMA"], "itemData": {"type": "manuscript", "author": [{"family": "Lima", "given": "AT"}, {"family": "Haas", "given": "D"}, {"family": "Torreão", "given": "S"}, {"family": "Schiffer", "given": "H"}, {"family": "Anunciação", "given": "L"}], "title": "Psychosocial work factors and mental health symptoms under NR-1: a feasibility study", "genre": "Manuscript submitted for publication", "publisher": "Departamento de Psicologia, Pontifícia Universidade Católica do Rio de Janeiro", "issued": {"date-parts": [[2026]]}, "id": "lima"}}], "schema": "https://github.com/citation-style-language/schema/raw/master/csl-citation.json"} </w:instrText>
+      </w:r>
+      <w:r>
+        <w:rPr>
+          <w:rFonts w:ascii="Times New Roman" w:cs="Times New Roman" w:eastAsia="Times New Roman" w:hAnsi="Times New Roman"/>
+          <w:sz w:val="24"/>
+          <w:szCs w:val="24"/>
+        </w:rPr>
+        <w:fldChar w:fldCharType="separate"/>
+      </w:r>
+      <w:r>
+        <w:rPr>
+          <w:rFonts w:ascii="Times New Roman" w:cs="Times New Roman" w:eastAsia="Times New Roman" w:hAnsi="Times New Roman"/>
+          <w:sz w:val="24"/>
+          <w:szCs w:val="24"/>
+        </w:rPr>
+        <w:t xml:space="preserve">(Lima et al., 2026)</w:t>
+      </w:r>
+      <w:r>
+        <w:rPr>
+          <w:rFonts w:ascii="Times New Roman" w:cs="Times New Roman" w:eastAsia="Times New Roman" w:hAnsi="Times New Roman"/>
+          <w:sz w:val="24"/>
+          <w:szCs w:val="24"/>
+        </w:rPr>
+        <w:fldChar w:fldCharType="end"/>
+      </w:r>
+      <w:r>
+        <w:rPr>
+          <w:rFonts w:ascii="Times New Roman" w:cs="Times New Roman" w:eastAsia="Times New Roman" w:hAnsi="Times New Roman"/>
+          <w:sz w:val="24"/>
+          <w:szCs w:val="24"/>
+        </w:rPr>
+        <w:t xml:space="preserve">. A recent review identified 66 mental health and well being assessments with utility for employers </w:t>
+      </w:r>
+      <w:r>
+        <w:rPr>
+          <w:rFonts w:ascii="Times New Roman" w:cs="Times New Roman" w:eastAsia="Times New Roman" w:hAnsi="Times New Roman"/>
+          <w:sz w:val="24"/>
+          <w:szCs w:val="24"/>
+        </w:rPr>
+        <w:fldChar w:fldCharType="begin"/>
+      </w:r>
+      <w:r>
+        <w:rPr>
+          <w:rFonts w:ascii="Times New Roman" w:cs="Times New Roman" w:eastAsia="Times New Roman" w:hAnsi="Times New Roman"/>
+          <w:sz w:val="24"/>
+          <w:szCs w:val="24"/>
+        </w:rPr>
+        <w:instrText xml:space="preserve"> ADDIN ZOTERO_ITEM CSL_CITATION {"citationID": "AGEM18", "properties": {"formattedCitation": "(Imboden et al., 2024)", "plainCitation": "(Imboden et al., 2024)", "noteIndex": 0}, "citationItems": [{"id": "imboden", "uris": ["http://zotero.org/users/local/agemts/items/IMBODEN"], "itemData": {"id": "imboden", "type": "article-journal", "author": [{"family": "Imboden", "given": "MT"}, {"family": "Wolfe", "given": "E"}, {"family": "Evers", "given": "K"}, {"family": "Ferrão", "given": "A"}, {"family": "Mochari-Greenberger", "given": "H"}, {"family": "Johnson", "given": "S"}, {"family": "Kirsten", "given": "W"}, {"family": "Seaverson", "given": "ELD"}], "title": "Evaluating workforce mental health and well-being: a review of assessments", "container-title": "American Journal of Health Promotion", "container-title-short": "Am J Health Promot", "issued": {"date-parts": [[2024]]}, "volume": "38", "issue": "4", "page": "540-559", "DOI": "10.1177/08901171231223786"}}], "schema": "https://github.com/citation-style-language/schema/raw/master/csl-citation.json"} </w:instrText>
+      </w:r>
+      <w:r>
+        <w:rPr>
+          <w:rFonts w:ascii="Times New Roman" w:cs="Times New Roman" w:eastAsia="Times New Roman" w:hAnsi="Times New Roman"/>
+          <w:sz w:val="24"/>
+          <w:szCs w:val="24"/>
+        </w:rPr>
+        <w:fldChar w:fldCharType="separate"/>
+      </w:r>
+      <w:r>
+        <w:rPr>
+          <w:rFonts w:ascii="Times New Roman" w:cs="Times New Roman" w:eastAsia="Times New Roman" w:hAnsi="Times New Roman"/>
+          <w:sz w:val="24"/>
+          <w:szCs w:val="24"/>
+        </w:rPr>
+        <w:t xml:space="preserve">(Imboden et al., 2024)</w:t>
+      </w:r>
+      <w:r>
+        <w:rPr>
+          <w:rFonts w:ascii="Times New Roman" w:cs="Times New Roman" w:eastAsia="Times New Roman" w:hAnsi="Times New Roman"/>
+          <w:sz w:val="24"/>
+          <w:szCs w:val="24"/>
+        </w:rPr>
+        <w:fldChar w:fldCharType="end"/>
+      </w:r>
+      <w:r>
+        <w:rPr>
+          <w:rFonts w:ascii="Times New Roman" w:cs="Times New Roman" w:eastAsia="Times New Roman" w:hAnsi="Times New Roman"/>
+          <w:sz w:val="24"/>
+          <w:szCs w:val="24"/>
+        </w:rPr>
+        <w:t xml:space="preserve">. To our knowledge, few studies describe how psychosocial risk indicators evolve across monitoring waves in Brazilian companies.</w:t>
       </w:r>
     </w:p>
     <w:p>
@@ -255,7 +1132,55 @@
           <w:sz w:val="24"/>
           <w:szCs w:val="24"/>
         </w:rPr>
-        <w:t xml:space="preserve">Companies subject to NR-1 need evidence on whether the indicators they collect remain stable or change between assessments. The goal of this study is to describe the evolution of psychosocial risk indicators across repeated anonymous monitoring waves among leaders, assessed at three waves, and employees, assessed at two waves, in two Brazilian companies. Psychosocial risk factors reflect conditions of work design, organization and management (International Organization for Standardization, 2021; Teixeira et al., 2025), which are unlikely to change substantially within a few months. Given the short interval between waves, we expected most indicators to remain stable. The analysis is exploratory, and its results are preliminary.</w:t>
+        <w:t xml:space="preserve">Companies subject to NR-1 need evidence on whether the indicators they collect remain stable or change between assessments. The goal of this study is to describe the evolution of psychosocial risk indicators across repeated anonymous monitoring waves among leaders, assessed at three waves, and employees, assessed at two waves, in two Brazilian companies. Psychosocial risk factors reflect conditions of work design, organization and management </w:t>
+      </w:r>
+      <w:r>
+        <w:rPr>
+          <w:rFonts w:ascii="Times New Roman" w:cs="Times New Roman" w:eastAsia="Times New Roman" w:hAnsi="Times New Roman"/>
+          <w:sz w:val="24"/>
+          <w:szCs w:val="24"/>
+        </w:rPr>
+        <w:fldChar w:fldCharType="begin"/>
+      </w:r>
+      <w:r>
+        <w:rPr>
+          <w:rFonts w:ascii="Times New Roman" w:cs="Times New Roman" w:eastAsia="Times New Roman" w:hAnsi="Times New Roman"/>
+          <w:sz w:val="24"/>
+          <w:szCs w:val="24"/>
+        </w:rPr>
+        <w:instrText xml:space="preserve"> ADDIN ZOTERO_ITEM CSL_CITATION {"citationID": "AGEM19", "properties": {"formattedCitation": "(International Organization for Standardization, 2021; Teixeira et al., 2025)", "plainCitation": "(International Organization for Standardization, 2021; Teixeira et al., 2025)", "noteIndex": 0}, "citationItems": [{"id": "iso", "uris": ["http://zotero.org/users/local/agemts/items/ISO"], "itemData": {"id": "iso", "type": "standard", "author": [{"literal": "International Organization for Standardization"}], "title": "Occupational health and safety management: Psychological health and safety at work: Guidelines for managing psychosocial risks (ISO Standard No. 45003:2021)", "publisher": "ISO", "publisher-place": "Geneva", "issued": {"date-parts": [[2021]]}, "URL": "https://www.iso.org/standard/64283.html"}}, {"id": "teixeira", "uris": ["http://zotero.org/users/local/agemts/items/TEIXEIRA"], "itemData": {"id": "teixeira", "type": "article-journal", "author": [{"family": "Teixeira", "given": "IDN"}, {"family": "Silva", "given": "IS"}, {"family": "Cadime", "given": "IMD"}], "title": "Psychosocial risks at work: integrative review and conceptual perspectives", "container-title": "Revista Brasileira de Medicina do Trabalho", "container-title-short": "Rev Bras Med Trab", "issued": {"date-parts": [[2025]]}, "volume": "23", "issue": "2", "page": "e20251464", "DOI": "10.47626/1679-4435-2025-1464"}}], "schema": "https://github.com/citation-style-language/schema/raw/master/csl-citation.json"} </w:instrText>
+      </w:r>
+      <w:r>
+        <w:rPr>
+          <w:rFonts w:ascii="Times New Roman" w:cs="Times New Roman" w:eastAsia="Times New Roman" w:hAnsi="Times New Roman"/>
+          <w:sz w:val="24"/>
+          <w:szCs w:val="24"/>
+        </w:rPr>
+        <w:fldChar w:fldCharType="separate"/>
+      </w:r>
+      <w:r>
+        <w:rPr>
+          <w:rFonts w:ascii="Times New Roman" w:cs="Times New Roman" w:eastAsia="Times New Roman" w:hAnsi="Times New Roman"/>
+          <w:sz w:val="24"/>
+          <w:szCs w:val="24"/>
+        </w:rPr>
+        <w:t xml:space="preserve">(International Organization for Standardization, 2021; Teixeira et al., 2025)</w:t>
+      </w:r>
+      <w:r>
+        <w:rPr>
+          <w:rFonts w:ascii="Times New Roman" w:cs="Times New Roman" w:eastAsia="Times New Roman" w:hAnsi="Times New Roman"/>
+          <w:sz w:val="24"/>
+          <w:szCs w:val="24"/>
+        </w:rPr>
+        <w:fldChar w:fldCharType="end"/>
+      </w:r>
+      <w:r>
+        <w:rPr>
+          <w:rFonts w:ascii="Times New Roman" w:cs="Times New Roman" w:eastAsia="Times New Roman" w:hAnsi="Times New Roman"/>
+          <w:sz w:val="24"/>
+          <w:szCs w:val="24"/>
+        </w:rPr>
+        <w:t xml:space="preserve">, which are unlikely to change substantially within a few months. Given the short interval between waves, we expected most indicators to remain stable. The analysis is exploratory, and its results are preliminary.</w:t>
       </w:r>
     </w:p>
     <w:p>
@@ -302,7 +1227,55 @@
           <w:sz w:val="24"/>
           <w:szCs w:val="24"/>
         </w:rPr>
-        <w:t xml:space="preserve">This is a repeated cross sectional study based on secondary analysis of anonymous data from psychosocial risk monitoring conducted during the evaluation of a workplace emotion management program (Academia de Gestão da Emoção para Empresas, AGEM). The program was delivered between waves. The study does not estimate program effects. Reporting follows the STROBE guidelines for cross sectional studies (von Elm et al., 2007).</w:t>
+        <w:t xml:space="preserve">This is a repeated cross sectional study based on secondary analysis of anonymous data from psychosocial risk monitoring conducted during the evaluation of a workplace emotion management program (Academia de Gestão da Emoção para Empresas, AGEM). The program was delivered between waves. The study does not estimate program effects. Reporting follows the STROBE guidelines for cross sectional studies </w:t>
+      </w:r>
+      <w:r>
+        <w:rPr>
+          <w:rFonts w:ascii="Times New Roman" w:cs="Times New Roman" w:eastAsia="Times New Roman" w:hAnsi="Times New Roman"/>
+          <w:sz w:val="24"/>
+          <w:szCs w:val="24"/>
+        </w:rPr>
+        <w:fldChar w:fldCharType="begin"/>
+      </w:r>
+      <w:r>
+        <w:rPr>
+          <w:rFonts w:ascii="Times New Roman" w:cs="Times New Roman" w:eastAsia="Times New Roman" w:hAnsi="Times New Roman"/>
+          <w:sz w:val="24"/>
+          <w:szCs w:val="24"/>
+        </w:rPr>
+        <w:instrText xml:space="preserve"> ADDIN ZOTERO_ITEM CSL_CITATION {"citationID": "AGEM20", "properties": {"formattedCitation": "(von Elm et al., 2007)", "plainCitation": "(von Elm et al., 2007)", "noteIndex": 0}, "citationItems": [{"id": "strobe", "uris": ["http://zotero.org/users/local/agemts/items/STROBE"], "itemData": {"id": "strobe", "type": "article-journal", "author": [{"family": "von Elm", "given": "E"}, {"family": "Altman", "given": "DG"}, {"family": "Egger", "given": "M"}, {"family": "Pocock", "given": "SJ"}, {"family": "Gøtzsche", "given": "PC"}, {"family": "Vandenbroucke", "given": "JP"}], "title": "The Strengthening the Reporting of Observational Studies in Epidemiology (STROBE) statement: guidelines for reporting observational studies", "container-title": "The Lancet", "container-title-short": "Lancet", "issued": {"date-parts": [[2007]]}, "volume": "370", "issue": "9596", "page": "1453-1457", "DOI": "10.1016/S0140-6736(07)61602-X"}}], "schema": "https://github.com/citation-style-language/schema/raw/master/csl-citation.json"} </w:instrText>
+      </w:r>
+      <w:r>
+        <w:rPr>
+          <w:rFonts w:ascii="Times New Roman" w:cs="Times New Roman" w:eastAsia="Times New Roman" w:hAnsi="Times New Roman"/>
+          <w:sz w:val="24"/>
+          <w:szCs w:val="24"/>
+        </w:rPr>
+        <w:fldChar w:fldCharType="separate"/>
+      </w:r>
+      <w:r>
+        <w:rPr>
+          <w:rFonts w:ascii="Times New Roman" w:cs="Times New Roman" w:eastAsia="Times New Roman" w:hAnsi="Times New Roman"/>
+          <w:sz w:val="24"/>
+          <w:szCs w:val="24"/>
+        </w:rPr>
+        <w:t xml:space="preserve">(von Elm et al., 2007)</w:t>
+      </w:r>
+      <w:r>
+        <w:rPr>
+          <w:rFonts w:ascii="Times New Roman" w:cs="Times New Roman" w:eastAsia="Times New Roman" w:hAnsi="Times New Roman"/>
+          <w:sz w:val="24"/>
+          <w:szCs w:val="24"/>
+        </w:rPr>
+        <w:fldChar w:fldCharType="end"/>
+      </w:r>
+      <w:r>
+        <w:rPr>
+          <w:rFonts w:ascii="Times New Roman" w:cs="Times New Roman" w:eastAsia="Times New Roman" w:hAnsi="Times New Roman"/>
+          <w:sz w:val="24"/>
+          <w:szCs w:val="24"/>
+        </w:rPr>
+        <w:t xml:space="preserve">.</w:t>
       </w:r>
     </w:p>
     <w:p>
@@ -332,7 +1305,103 @@
           <w:sz w:val="24"/>
           <w:szCs w:val="24"/>
         </w:rPr>
-        <w:t xml:space="preserve">Participants were leaders and employees of two Brazilian companies. Company A is a business technology company that sells consortium plans and related financial products, and Company B is an energy trading company ([Authors], under review). [Describe each company: workforce size, work organization, role of leaders, organizational values.] Because the research question concerns the evolution of risk in the workforce rather than differences between companies, the two companies were analyzed together, with company included as a covariate.</w:t>
+        <w:t xml:space="preserve">Participants were leaders and employees of two Brazilian companies. Company A is a business technology company that sells consortium plans and related financial products, and Company B is an energy trading company </w:t>
+      </w:r>
+      <w:r>
+        <w:rPr>
+          <w:rFonts w:ascii="Times New Roman" w:cs="Times New Roman" w:eastAsia="Times New Roman" w:hAnsi="Times New Roman"/>
+          <w:sz w:val="24"/>
+          <w:szCs w:val="24"/>
+        </w:rPr>
+        <w:fldChar w:fldCharType="begin"/>
+      </w:r>
+      <w:r>
+        <w:rPr>
+          <w:rFonts w:ascii="Times New Roman" w:cs="Times New Roman" w:eastAsia="Times New Roman" w:hAnsi="Times New Roman"/>
+          <w:sz w:val="24"/>
+          <w:szCs w:val="24"/>
+        </w:rPr>
+        <w:instrText xml:space="preserve"> ADDIN ZOTERO_ITEM CSL_CITATION {"citationID": "AGEM21", "properties": {"formattedCitation": "(Lima et al., 2026)", "plainCitation": "(Lima et al., 2026)", "noteIndex": 0}, "citationItems": [{"id": "lima", "uris": ["http://zotero.org/users/local/agemts/items/LIMA"], "itemData": {"type": "manuscript", "author": [{"family": "Lima", "given": "AT"}, {"family": "Haas", "given": "D"}, {"family": "Torreão", "given": "S"}, {"family": "Schiffer", "given": "H"}, {"family": "Anunciação", "given": "L"}], "title": "Psychosocial work factors and mental health symptoms under NR-1: a feasibility study", "genre": "Manuscript submitted for publication", "publisher": "Departamento de Psicologia, Pontifícia Universidade Católica do Rio de Janeiro", "issued": {"date-parts": [[2026]]}, "id": "lima"}}], "schema": "https://github.com/citation-style-language/schema/raw/master/csl-citation.json"} </w:instrText>
+      </w:r>
+      <w:r>
+        <w:rPr>
+          <w:rFonts w:ascii="Times New Roman" w:cs="Times New Roman" w:eastAsia="Times New Roman" w:hAnsi="Times New Roman"/>
+          <w:sz w:val="24"/>
+          <w:szCs w:val="24"/>
+        </w:rPr>
+        <w:fldChar w:fldCharType="separate"/>
+      </w:r>
+      <w:r>
+        <w:rPr>
+          <w:rFonts w:ascii="Times New Roman" w:cs="Times New Roman" w:eastAsia="Times New Roman" w:hAnsi="Times New Roman"/>
+          <w:sz w:val="24"/>
+          <w:szCs w:val="24"/>
+        </w:rPr>
+        <w:t xml:space="preserve">(Lima et al., 2026)</w:t>
+      </w:r>
+      <w:r>
+        <w:rPr>
+          <w:rFonts w:ascii="Times New Roman" w:cs="Times New Roman" w:eastAsia="Times New Roman" w:hAnsi="Times New Roman"/>
+          <w:sz w:val="24"/>
+          <w:szCs w:val="24"/>
+        </w:rPr>
+        <w:fldChar w:fldCharType="end"/>
+      </w:r>
+      <w:r>
+        <w:rPr>
+          <w:rFonts w:ascii="Times New Roman" w:cs="Times New Roman" w:eastAsia="Times New Roman" w:hAnsi="Times New Roman"/>
+          <w:sz w:val="24"/>
+          <w:szCs w:val="24"/>
+        </w:rPr>
+        <w:t xml:space="preserve">. At T1, all employees were invited </w:t>
+      </w:r>
+      <w:r>
+        <w:rPr>
+          <w:rFonts w:ascii="Times New Roman" w:cs="Times New Roman" w:eastAsia="Times New Roman" w:hAnsi="Times New Roman"/>
+          <w:sz w:val="24"/>
+          <w:szCs w:val="24"/>
+        </w:rPr>
+        <w:fldChar w:fldCharType="begin"/>
+      </w:r>
+      <w:r>
+        <w:rPr>
+          <w:rFonts w:ascii="Times New Roman" w:cs="Times New Roman" w:eastAsia="Times New Roman" w:hAnsi="Times New Roman"/>
+          <w:sz w:val="24"/>
+          <w:szCs w:val="24"/>
+        </w:rPr>
+        <w:instrText xml:space="preserve"> ADDIN ZOTERO_ITEM CSL_CITATION {"citationID": "AGEM22", "properties": {"formattedCitation": "(Lima et al., 2026)", "plainCitation": "(Lima et al., 2026)", "noteIndex": 0}, "citationItems": [{"id": "lima", "uris": ["http://zotero.org/users/local/agemts/items/LIMA"], "itemData": {"type": "manuscript", "author": [{"family": "Lima", "given": "AT"}, {"family": "Haas", "given": "D"}, {"family": "Torreão", "given": "S"}, {"family": "Schiffer", "given": "H"}, {"family": "Anunciação", "given": "L"}], "title": "Psychosocial work factors and mental health symptoms under NR-1: a feasibility study", "genre": "Manuscript submitted for publication", "publisher": "Departamento de Psicologia, Pontifícia Universidade Católica do Rio de Janeiro", "issued": {"date-parts": [[2026]]}, "id": "lima"}}], "schema": "https://github.com/citation-style-language/schema/raw/master/csl-citation.json"} </w:instrText>
+      </w:r>
+      <w:r>
+        <w:rPr>
+          <w:rFonts w:ascii="Times New Roman" w:cs="Times New Roman" w:eastAsia="Times New Roman" w:hAnsi="Times New Roman"/>
+          <w:sz w:val="24"/>
+          <w:szCs w:val="24"/>
+        </w:rPr>
+        <w:fldChar w:fldCharType="separate"/>
+      </w:r>
+      <w:r>
+        <w:rPr>
+          <w:rFonts w:ascii="Times New Roman" w:cs="Times New Roman" w:eastAsia="Times New Roman" w:hAnsi="Times New Roman"/>
+          <w:sz w:val="24"/>
+          <w:szCs w:val="24"/>
+        </w:rPr>
+        <w:t xml:space="preserve">(Lima et al., 2026)</w:t>
+      </w:r>
+      <w:r>
+        <w:rPr>
+          <w:rFonts w:ascii="Times New Roman" w:cs="Times New Roman" w:eastAsia="Times New Roman" w:hAnsi="Times New Roman"/>
+          <w:sz w:val="24"/>
+          <w:szCs w:val="24"/>
+        </w:rPr>
+        <w:fldChar w:fldCharType="end"/>
+      </w:r>
+      <w:r>
+        <w:rPr>
+          <w:rFonts w:ascii="Times New Roman" w:cs="Times New Roman" w:eastAsia="Times New Roman" w:hAnsi="Times New Roman"/>
+          <w:sz w:val="24"/>
+          <w:szCs w:val="24"/>
+        </w:rPr>
+        <w:t xml:space="preserve">. Because the research question concerns the evolution of risk in the workforce rather than differences between companies, the two companies were analyzed together, with company included as a covariate.</w:t>
       </w:r>
     </w:p>
     <w:p>
@@ -518,7 +1587,55 @@
           <w:sz w:val="24"/>
           <w:szCs w:val="24"/>
         </w:rPr>
-        <w:t xml:space="preserve"> The employee inventory included 16 psychosocial work factor items covering autonomy, relationships, organizational climate and leadership support, a checklist of mental health symptoms and additional items, all rated from 1 (never) to 5 (always) ([Authors], under review). An example item is “Are you free to organize your activities?” Tenure in the company was recorded in six categories at both waves. Among the stable items, Cronbach’s </w:t>
+        <w:t xml:space="preserve"> The employee inventory included 16 psychosocial work factor items covering autonomy, relationships, organizational climate and leadership support, a checklist of mental health symptoms and additional items, all rated from 1 (never) to 5 (always) </w:t>
+      </w:r>
+      <w:r>
+        <w:rPr>
+          <w:rFonts w:ascii="Times New Roman" w:cs="Times New Roman" w:eastAsia="Times New Roman" w:hAnsi="Times New Roman"/>
+          <w:sz w:val="24"/>
+          <w:szCs w:val="24"/>
+        </w:rPr>
+        <w:fldChar w:fldCharType="begin"/>
+      </w:r>
+      <w:r>
+        <w:rPr>
+          <w:rFonts w:ascii="Times New Roman" w:cs="Times New Roman" w:eastAsia="Times New Roman" w:hAnsi="Times New Roman"/>
+          <w:sz w:val="24"/>
+          <w:szCs w:val="24"/>
+        </w:rPr>
+        <w:instrText xml:space="preserve"> ADDIN ZOTERO_ITEM CSL_CITATION {"citationID": "AGEM23", "properties": {"formattedCitation": "(Lima et al., 2026)", "plainCitation": "(Lima et al., 2026)", "noteIndex": 0}, "citationItems": [{"id": "lima", "uris": ["http://zotero.org/users/local/agemts/items/LIMA"], "itemData": {"type": "manuscript", "author": [{"family": "Lima", "given": "AT"}, {"family": "Haas", "given": "D"}, {"family": "Torreão", "given": "S"}, {"family": "Schiffer", "given": "H"}, {"family": "Anunciação", "given": "L"}], "title": "Psychosocial work factors and mental health symptoms under NR-1: a feasibility study", "genre": "Manuscript submitted for publication", "publisher": "Departamento de Psicologia, Pontifícia Universidade Católica do Rio de Janeiro", "issued": {"date-parts": [[2026]]}, "id": "lima"}}], "schema": "https://github.com/citation-style-language/schema/raw/master/csl-citation.json"} </w:instrText>
+      </w:r>
+      <w:r>
+        <w:rPr>
+          <w:rFonts w:ascii="Times New Roman" w:cs="Times New Roman" w:eastAsia="Times New Roman" w:hAnsi="Times New Roman"/>
+          <w:sz w:val="24"/>
+          <w:szCs w:val="24"/>
+        </w:rPr>
+        <w:fldChar w:fldCharType="separate"/>
+      </w:r>
+      <w:r>
+        <w:rPr>
+          <w:rFonts w:ascii="Times New Roman" w:cs="Times New Roman" w:eastAsia="Times New Roman" w:hAnsi="Times New Roman"/>
+          <w:sz w:val="24"/>
+          <w:szCs w:val="24"/>
+        </w:rPr>
+        <w:t xml:space="preserve">(Lima et al., 2026)</w:t>
+      </w:r>
+      <w:r>
+        <w:rPr>
+          <w:rFonts w:ascii="Times New Roman" w:cs="Times New Roman" w:eastAsia="Times New Roman" w:hAnsi="Times New Roman"/>
+          <w:sz w:val="24"/>
+          <w:szCs w:val="24"/>
+        </w:rPr>
+        <w:fldChar w:fldCharType="end"/>
+      </w:r>
+      <w:r>
+        <w:rPr>
+          <w:rFonts w:ascii="Times New Roman" w:cs="Times New Roman" w:eastAsia="Times New Roman" w:hAnsi="Times New Roman"/>
+          <w:sz w:val="24"/>
+          <w:szCs w:val="24"/>
+        </w:rPr>
+        <w:t xml:space="preserve">. An example item is “Are you free to organize your activities?” Tenure in the company was recorded in six categories at both waves. Among the stable items, Cronbach’s </w:t>
       </w:r>
       <w:r>
         <w:rPr>
@@ -536,7 +1653,55 @@
           <w:sz w:val="24"/>
           <w:szCs w:val="24"/>
         </w:rPr>
-        <w:t xml:space="preserve"> was .92 at T1 and .90 at T2 for the 23 symptom and emotional regulation items, with positively worded items reversed, and .88 and .91 for the 14 work factor items. Both item sets were written to cover the hazard categories named in NR-1, and their validity has not been examined ([Authors], under review).</w:t>
+        <w:t xml:space="preserve"> was .92 at T1 and .90 at T2 for the 23 symptom and emotional regulation items, with positively worded items reversed, and .88 and .91 for the 14 work factor items. Both item sets were written to cover the hazard categories named in NR-1, and their validity has not been examined </w:t>
+      </w:r>
+      <w:r>
+        <w:rPr>
+          <w:rFonts w:ascii="Times New Roman" w:cs="Times New Roman" w:eastAsia="Times New Roman" w:hAnsi="Times New Roman"/>
+          <w:sz w:val="24"/>
+          <w:szCs w:val="24"/>
+        </w:rPr>
+        <w:fldChar w:fldCharType="begin"/>
+      </w:r>
+      <w:r>
+        <w:rPr>
+          <w:rFonts w:ascii="Times New Roman" w:cs="Times New Roman" w:eastAsia="Times New Roman" w:hAnsi="Times New Roman"/>
+          <w:sz w:val="24"/>
+          <w:szCs w:val="24"/>
+        </w:rPr>
+        <w:instrText xml:space="preserve"> ADDIN ZOTERO_ITEM CSL_CITATION {"citationID": "AGEM24", "properties": {"formattedCitation": "(Lima et al., 2026)", "plainCitation": "(Lima et al., 2026)", "noteIndex": 0}, "citationItems": [{"id": "lima", "uris": ["http://zotero.org/users/local/agemts/items/LIMA"], "itemData": {"type": "manuscript", "author": [{"family": "Lima", "given": "AT"}, {"family": "Haas", "given": "D"}, {"family": "Torreão", "given": "S"}, {"family": "Schiffer", "given": "H"}, {"family": "Anunciação", "given": "L"}], "title": "Psychosocial work factors and mental health symptoms under NR-1: a feasibility study", "genre": "Manuscript submitted for publication", "publisher": "Departamento de Psicologia, Pontifícia Universidade Católica do Rio de Janeiro", "issued": {"date-parts": [[2026]]}, "id": "lima"}}], "schema": "https://github.com/citation-style-language/schema/raw/master/csl-citation.json"} </w:instrText>
+      </w:r>
+      <w:r>
+        <w:rPr>
+          <w:rFonts w:ascii="Times New Roman" w:cs="Times New Roman" w:eastAsia="Times New Roman" w:hAnsi="Times New Roman"/>
+          <w:sz w:val="24"/>
+          <w:szCs w:val="24"/>
+        </w:rPr>
+        <w:fldChar w:fldCharType="separate"/>
+      </w:r>
+      <w:r>
+        <w:rPr>
+          <w:rFonts w:ascii="Times New Roman" w:cs="Times New Roman" w:eastAsia="Times New Roman" w:hAnsi="Times New Roman"/>
+          <w:sz w:val="24"/>
+          <w:szCs w:val="24"/>
+        </w:rPr>
+        <w:t xml:space="preserve">(Lima et al., 2026)</w:t>
+      </w:r>
+      <w:r>
+        <w:rPr>
+          <w:rFonts w:ascii="Times New Roman" w:cs="Times New Roman" w:eastAsia="Times New Roman" w:hAnsi="Times New Roman"/>
+          <w:sz w:val="24"/>
+          <w:szCs w:val="24"/>
+        </w:rPr>
+        <w:fldChar w:fldCharType="end"/>
+      </w:r>
+      <w:r>
+        <w:rPr>
+          <w:rFonts w:ascii="Times New Roman" w:cs="Times New Roman" w:eastAsia="Times New Roman" w:hAnsi="Times New Roman"/>
+          <w:sz w:val="24"/>
+          <w:szCs w:val="24"/>
+        </w:rPr>
+        <w:t xml:space="preserve">.</w:t>
       </w:r>
     </w:p>
     <w:p>
@@ -590,7 +1755,103 @@
           <w:sz w:val="24"/>
           <w:szCs w:val="24"/>
         </w:rPr>
-        <w:t xml:space="preserve">A meeting with employees presented the purpose and stages of the assessment and stated that participation was voluntary and anonymous. Participants then answered an online survey. No names, email addresses, job titles or work units were recorded, and results were returned to each company only in aggregate ([Authors], under review). [Confirm that the same procedure was used at T2 and T3.] The study was registered on Plataforma Brasil and approved by the Research Ethics Committee of the Instituto Nacional de Educação de Surdos (CAAE 96841525.4.0000.8137; approval number 8.651.901). Procedures followed the ethical guidelines for research in the Human and Social Sciences (Conselho Nacional de Saúde, 2016). [Consent statement.]</w:t>
+        <w:t xml:space="preserve">Before the first wave, a meeting with employees presented the purpose and stages of the assessment and stated that participation was voluntary and anonymous. At each wave, participants answered an anonymous online survey on SurveyMonkey. No names, email addresses, job titles or work units were recorded, and results were returned to each company only in aggregate </w:t>
+      </w:r>
+      <w:r>
+        <w:rPr>
+          <w:rFonts w:ascii="Times New Roman" w:cs="Times New Roman" w:eastAsia="Times New Roman" w:hAnsi="Times New Roman"/>
+          <w:sz w:val="24"/>
+          <w:szCs w:val="24"/>
+        </w:rPr>
+        <w:fldChar w:fldCharType="begin"/>
+      </w:r>
+      <w:r>
+        <w:rPr>
+          <w:rFonts w:ascii="Times New Roman" w:cs="Times New Roman" w:eastAsia="Times New Roman" w:hAnsi="Times New Roman"/>
+          <w:sz w:val="24"/>
+          <w:szCs w:val="24"/>
+        </w:rPr>
+        <w:instrText xml:space="preserve"> ADDIN ZOTERO_ITEM CSL_CITATION {"citationID": "AGEM25", "properties": {"formattedCitation": "(Lima et al., 2026)", "plainCitation": "(Lima et al., 2026)", "noteIndex": 0}, "citationItems": [{"id": "lima", "uris": ["http://zotero.org/users/local/agemts/items/LIMA"], "itemData": {"type": "manuscript", "author": [{"family": "Lima", "given": "AT"}, {"family": "Haas", "given": "D"}, {"family": "Torreão", "given": "S"}, {"family": "Schiffer", "given": "H"}, {"family": "Anunciação", "given": "L"}], "title": "Psychosocial work factors and mental health symptoms under NR-1: a feasibility study", "genre": "Manuscript submitted for publication", "publisher": "Departamento de Psicologia, Pontifícia Universidade Católica do Rio de Janeiro", "issued": {"date-parts": [[2026]]}, "id": "lima"}}], "schema": "https://github.com/citation-style-language/schema/raw/master/csl-citation.json"} </w:instrText>
+      </w:r>
+      <w:r>
+        <w:rPr>
+          <w:rFonts w:ascii="Times New Roman" w:cs="Times New Roman" w:eastAsia="Times New Roman" w:hAnsi="Times New Roman"/>
+          <w:sz w:val="24"/>
+          <w:szCs w:val="24"/>
+        </w:rPr>
+        <w:fldChar w:fldCharType="separate"/>
+      </w:r>
+      <w:r>
+        <w:rPr>
+          <w:rFonts w:ascii="Times New Roman" w:cs="Times New Roman" w:eastAsia="Times New Roman" w:hAnsi="Times New Roman"/>
+          <w:sz w:val="24"/>
+          <w:szCs w:val="24"/>
+        </w:rPr>
+        <w:t xml:space="preserve">(Lima et al., 2026)</w:t>
+      </w:r>
+      <w:r>
+        <w:rPr>
+          <w:rFonts w:ascii="Times New Roman" w:cs="Times New Roman" w:eastAsia="Times New Roman" w:hAnsi="Times New Roman"/>
+          <w:sz w:val="24"/>
+          <w:szCs w:val="24"/>
+        </w:rPr>
+        <w:fldChar w:fldCharType="end"/>
+      </w:r>
+      <w:r>
+        <w:rPr>
+          <w:rFonts w:ascii="Times New Roman" w:cs="Times New Roman" w:eastAsia="Times New Roman" w:hAnsi="Times New Roman"/>
+          <w:sz w:val="24"/>
+          <w:szCs w:val="24"/>
+        </w:rPr>
+        <w:t xml:space="preserve">. The study was registered on Plataforma Brasil and approved by the Research Ethics Committee of the Instituto Nacional de Educação de Surdos (CAAE 96841525.4.0000.8137; approval number 8.651.901). Procedures followed the ethical guidelines for research in the Human and Social Sciences </w:t>
+      </w:r>
+      <w:r>
+        <w:rPr>
+          <w:rFonts w:ascii="Times New Roman" w:cs="Times New Roman" w:eastAsia="Times New Roman" w:hAnsi="Times New Roman"/>
+          <w:sz w:val="24"/>
+          <w:szCs w:val="24"/>
+        </w:rPr>
+        <w:fldChar w:fldCharType="begin"/>
+      </w:r>
+      <w:r>
+        <w:rPr>
+          <w:rFonts w:ascii="Times New Roman" w:cs="Times New Roman" w:eastAsia="Times New Roman" w:hAnsi="Times New Roman"/>
+          <w:sz w:val="24"/>
+          <w:szCs w:val="24"/>
+        </w:rPr>
+        <w:instrText xml:space="preserve"> ADDIN ZOTERO_ITEM CSL_CITATION {"citationID": "AGEM26", "properties": {"formattedCitation": "(Conselho Nacional de Saúde, 2016)", "plainCitation": "(Conselho Nacional de Saúde, 2016)", "noteIndex": 0}, "citationItems": [{"id": "cns510", "uris": ["http://zotero.org/users/local/agemts/items/CNS510"], "itemData": {"id": "cns510", "type": "legislation", "author": [{"literal": "Conselho Nacional de Saúde"}], "title": "Resolução nº 510, de 7 de abril de 2016. Dispõe sobre as normas aplicáveis a pesquisas em Ciências Humanas e Sociais", "container-title": "Diário Oficial da União", "publisher-place": "Brasília", "issued": {"date-parts": [[2016, 4, 7]]}, "URL": "https://bvsms.saude.gov.br/bvs/saudelegis/cns/2016/res0510_07_04_2016.html"}}], "schema": "https://github.com/citation-style-language/schema/raw/master/csl-citation.json"} </w:instrText>
+      </w:r>
+      <w:r>
+        <w:rPr>
+          <w:rFonts w:ascii="Times New Roman" w:cs="Times New Roman" w:eastAsia="Times New Roman" w:hAnsi="Times New Roman"/>
+          <w:sz w:val="24"/>
+          <w:szCs w:val="24"/>
+        </w:rPr>
+        <w:fldChar w:fldCharType="separate"/>
+      </w:r>
+      <w:r>
+        <w:rPr>
+          <w:rFonts w:ascii="Times New Roman" w:cs="Times New Roman" w:eastAsia="Times New Roman" w:hAnsi="Times New Roman"/>
+          <w:sz w:val="24"/>
+          <w:szCs w:val="24"/>
+        </w:rPr>
+        <w:t xml:space="preserve">(Conselho Nacional de Saúde, 2016)</w:t>
+      </w:r>
+      <w:r>
+        <w:rPr>
+          <w:rFonts w:ascii="Times New Roman" w:cs="Times New Roman" w:eastAsia="Times New Roman" w:hAnsi="Times New Roman"/>
+          <w:sz w:val="24"/>
+          <w:szCs w:val="24"/>
+        </w:rPr>
+        <w:fldChar w:fldCharType="end"/>
+      </w:r>
+      <w:r>
+        <w:rPr>
+          <w:rFonts w:ascii="Times New Roman" w:cs="Times New Roman" w:eastAsia="Times New Roman" w:hAnsi="Times New Roman"/>
+          <w:sz w:val="24"/>
+          <w:szCs w:val="24"/>
+        </w:rPr>
+        <w:t xml:space="preserve">. The committee approved the informed consent form, which described the risks of participation as minimal and stated that workers could decline to participate without constraint or harm.</w:t>
       </w:r>
     </w:p>
     <w:p>
@@ -811,7 +2072,7 @@
           <w:sz w:val="24"/>
           <w:szCs w:val="24"/>
         </w:rPr>
-        <w:t xml:space="preserve"> = .521). Figure 1 shows the percentage of leaders agreeing with each item.</w:t>
+        <w:t xml:space="preserve"> = .521).</w:t>
       </w:r>
     </w:p>
     <w:p>
@@ -4416,7 +5677,7 @@
           <w:sz w:val="24"/>
           <w:szCs w:val="24"/>
         </w:rPr>
-        <w:t xml:space="preserve"> from .064 to .934). Figure 2 shows the percentage answering often or always to each item. Across leaders and employees, 2 of 46 tests had </w:t>
+        <w:t xml:space="preserve"> from .064 to .934). Across leaders and employees, 2 of 46 tests had </w:t>
       </w:r>
       <w:r>
         <w:rPr>
@@ -16533,7 +17794,103 @@
           <w:sz w:val="24"/>
           <w:szCs w:val="24"/>
         </w:rPr>
-        <w:t xml:space="preserve">The predominance of stability is consistent with our expectation and with the view of psychosocial risk factors as conditions of work design, organization and management (International Organization for Standardization, 2021; Teixeira et al., 2025), which may change slowly over a few months. Scales of psychosocial work factors have shown acceptable test retest reliability among Brazilian workers (Gonçalves et al., 2021), so stable responses are expected when working conditions do not change. Two significant results among 46 tests is close to the 2.3 expected by chance at </w:t>
+        <w:t xml:space="preserve">The predominance of stability is consistent with our expectation and with the view of psychosocial risk factors as conditions of work design, organization and management </w:t>
+      </w:r>
+      <w:r>
+        <w:rPr>
+          <w:rFonts w:ascii="Times New Roman" w:cs="Times New Roman" w:eastAsia="Times New Roman" w:hAnsi="Times New Roman"/>
+          <w:sz w:val="24"/>
+          <w:szCs w:val="24"/>
+        </w:rPr>
+        <w:fldChar w:fldCharType="begin"/>
+      </w:r>
+      <w:r>
+        <w:rPr>
+          <w:rFonts w:ascii="Times New Roman" w:cs="Times New Roman" w:eastAsia="Times New Roman" w:hAnsi="Times New Roman"/>
+          <w:sz w:val="24"/>
+          <w:szCs w:val="24"/>
+        </w:rPr>
+        <w:instrText xml:space="preserve"> ADDIN ZOTERO_ITEM CSL_CITATION {"citationID": "AGEM27", "properties": {"formattedCitation": "(International Organization for Standardization, 2021; Teixeira et al., 2025)", "plainCitation": "(International Organization for Standardization, 2021; Teixeira et al., 2025)", "noteIndex": 0}, "citationItems": [{"id": "iso", "uris": ["http://zotero.org/users/local/agemts/items/ISO"], "itemData": {"id": "iso", "type": "standard", "author": [{"literal": "International Organization for Standardization"}], "title": "Occupational health and safety management: Psychological health and safety at work: Guidelines for managing psychosocial risks (ISO Standard No. 45003:2021)", "publisher": "ISO", "publisher-place": "Geneva", "issued": {"date-parts": [[2021]]}, "URL": "https://www.iso.org/standard/64283.html"}}, {"id": "teixeira", "uris": ["http://zotero.org/users/local/agemts/items/TEIXEIRA"], "itemData": {"id": "teixeira", "type": "article-journal", "author": [{"family": "Teixeira", "given": "IDN"}, {"family": "Silva", "given": "IS"}, {"family": "Cadime", "given": "IMD"}], "title": "Psychosocial risks at work: integrative review and conceptual perspectives", "container-title": "Revista Brasileira de Medicina do Trabalho", "container-title-short": "Rev Bras Med Trab", "issued": {"date-parts": [[2025]]}, "volume": "23", "issue": "2", "page": "e20251464", "DOI": "10.47626/1679-4435-2025-1464"}}], "schema": "https://github.com/citation-style-language/schema/raw/master/csl-citation.json"} </w:instrText>
+      </w:r>
+      <w:r>
+        <w:rPr>
+          <w:rFonts w:ascii="Times New Roman" w:cs="Times New Roman" w:eastAsia="Times New Roman" w:hAnsi="Times New Roman"/>
+          <w:sz w:val="24"/>
+          <w:szCs w:val="24"/>
+        </w:rPr>
+        <w:fldChar w:fldCharType="separate"/>
+      </w:r>
+      <w:r>
+        <w:rPr>
+          <w:rFonts w:ascii="Times New Roman" w:cs="Times New Roman" w:eastAsia="Times New Roman" w:hAnsi="Times New Roman"/>
+          <w:sz w:val="24"/>
+          <w:szCs w:val="24"/>
+        </w:rPr>
+        <w:t xml:space="preserve">(International Organization for Standardization, 2021; Teixeira et al., 2025)</w:t>
+      </w:r>
+      <w:r>
+        <w:rPr>
+          <w:rFonts w:ascii="Times New Roman" w:cs="Times New Roman" w:eastAsia="Times New Roman" w:hAnsi="Times New Roman"/>
+          <w:sz w:val="24"/>
+          <w:szCs w:val="24"/>
+        </w:rPr>
+        <w:fldChar w:fldCharType="end"/>
+      </w:r>
+      <w:r>
+        <w:rPr>
+          <w:rFonts w:ascii="Times New Roman" w:cs="Times New Roman" w:eastAsia="Times New Roman" w:hAnsi="Times New Roman"/>
+          <w:sz w:val="24"/>
+          <w:szCs w:val="24"/>
+        </w:rPr>
+        <w:t xml:space="preserve">, which may change slowly over a few months. Scales of psychosocial work factors have shown acceptable test retest reliability among Brazilian workers </w:t>
+      </w:r>
+      <w:r>
+        <w:rPr>
+          <w:rFonts w:ascii="Times New Roman" w:cs="Times New Roman" w:eastAsia="Times New Roman" w:hAnsi="Times New Roman"/>
+          <w:sz w:val="24"/>
+          <w:szCs w:val="24"/>
+        </w:rPr>
+        <w:fldChar w:fldCharType="begin"/>
+      </w:r>
+      <w:r>
+        <w:rPr>
+          <w:rFonts w:ascii="Times New Roman" w:cs="Times New Roman" w:eastAsia="Times New Roman" w:hAnsi="Times New Roman"/>
+          <w:sz w:val="24"/>
+          <w:szCs w:val="24"/>
+        </w:rPr>
+        <w:instrText xml:space="preserve"> ADDIN ZOTERO_ITEM CSL_CITATION {"citationID": "AGEM28", "properties": {"formattedCitation": "(Gonçalves et al., 2021)", "plainCitation": "(Gonçalves et al., 2021)", "noteIndex": 0}, "citationItems": [{"id": "goncalves", "uris": ["http://zotero.org/users/local/agemts/items/GONCALVES"], "itemData": {"type": "article-journal", "author": [{"family": "Gonçalves", "given": "JS"}, {"family": "Moriguchi", "given": "CS"}, {"family": "Chaves", "given": "TC"}, {"family": "Sato", "given": "TO"}], "title": "Cross-cultural adaptation and psychometric properties of the short version of COPSOQ II-Brazil", "container-title": "Revista de Saúde Pública", "issued": {"date-parts": [[2021]]}, "volume": "55", "page": "69", "DOI": "10.11606/s1518-8787.2021055003123", "PMID": "34706043", "id": "goncalves"}}], "schema": "https://github.com/citation-style-language/schema/raw/master/csl-citation.json"} </w:instrText>
+      </w:r>
+      <w:r>
+        <w:rPr>
+          <w:rFonts w:ascii="Times New Roman" w:cs="Times New Roman" w:eastAsia="Times New Roman" w:hAnsi="Times New Roman"/>
+          <w:sz w:val="24"/>
+          <w:szCs w:val="24"/>
+        </w:rPr>
+        <w:fldChar w:fldCharType="separate"/>
+      </w:r>
+      <w:r>
+        <w:rPr>
+          <w:rFonts w:ascii="Times New Roman" w:cs="Times New Roman" w:eastAsia="Times New Roman" w:hAnsi="Times New Roman"/>
+          <w:sz w:val="24"/>
+          <w:szCs w:val="24"/>
+        </w:rPr>
+        <w:t xml:space="preserve">(Gonçalves et al., 2021)</w:t>
+      </w:r>
+      <w:r>
+        <w:rPr>
+          <w:rFonts w:ascii="Times New Roman" w:cs="Times New Roman" w:eastAsia="Times New Roman" w:hAnsi="Times New Roman"/>
+          <w:sz w:val="24"/>
+          <w:szCs w:val="24"/>
+        </w:rPr>
+        <w:fldChar w:fldCharType="end"/>
+      </w:r>
+      <w:r>
+        <w:rPr>
+          <w:rFonts w:ascii="Times New Roman" w:cs="Times New Roman" w:eastAsia="Times New Roman" w:hAnsi="Times New Roman"/>
+          <w:sz w:val="24"/>
+          <w:szCs w:val="24"/>
+        </w:rPr>
+        <w:t xml:space="preserve">, so stable responses are expected when working conditions do not change. Two significant results among 46 tests is close to the 2.3 expected by chance at </w:t>
       </w:r>
       <w:r>
         <w:rPr>
@@ -16565,7 +17922,151 @@
           <w:sz w:val="24"/>
           <w:szCs w:val="24"/>
         </w:rPr>
-        <w:t xml:space="preserve">Both items that changed describe autonomy, a job resource in the Job Demands-Resources model (Bakker &amp; Demerouti, 2007; Demerouti et al., 2001). Low work autonomy has been associated with poorer mental health (Lu et al., 2023). In the present data, the decrease in autonomy items was not accompanied by changes in the symptom items. This pattern may indicate that a reduction in resources had not yet been reflected in symptoms, that the change was too small to affect them or that the two results are chance findings. In a prospective cohort, persistent low job control showed a stronger association with later major depression than intermittent low job control (Taouk et al., 2024). A short reduction in autonomy may therefore not be reflected in symptoms within a few months.</w:t>
+        <w:t xml:space="preserve">Both items that changed describe autonomy, a job resource in the Job Demands-Resources model </w:t>
+      </w:r>
+      <w:r>
+        <w:rPr>
+          <w:rFonts w:ascii="Times New Roman" w:cs="Times New Roman" w:eastAsia="Times New Roman" w:hAnsi="Times New Roman"/>
+          <w:sz w:val="24"/>
+          <w:szCs w:val="24"/>
+        </w:rPr>
+        <w:fldChar w:fldCharType="begin"/>
+      </w:r>
+      <w:r>
+        <w:rPr>
+          <w:rFonts w:ascii="Times New Roman" w:cs="Times New Roman" w:eastAsia="Times New Roman" w:hAnsi="Times New Roman"/>
+          <w:sz w:val="24"/>
+          <w:szCs w:val="24"/>
+        </w:rPr>
+        <w:instrText xml:space="preserve"> ADDIN ZOTERO_ITEM CSL_CITATION {"citationID": "AGEM29", "properties": {"formattedCitation": "(Bakker &amp; Demerouti, 2007; Demerouti et al., 2001)", "plainCitation": "(Bakker &amp; Demerouti, 2007; Demerouti et al., 2001)", "noteIndex": 0}, "citationItems": [{"id": "bakker", "uris": ["http://zotero.org/users/local/agemts/items/BAKKER"], "itemData": {"id": "bakker", "type": "article-journal", "author": [{"family": "Bakker", "given": "AB"}, {"family": "Demerouti", "given": "E"}], "title": "The Job Demands-Resources model: state of the art", "container-title": "Journal of Managerial Psychology", "container-title-short": "J Manag Psychol", "issued": {"date-parts": [[2007]]}, "volume": "22", "issue": "3", "page": "309-328", "DOI": "10.1108/02683940710733115"}}, {"id": "demerouti", "uris": ["http://zotero.org/users/local/agemts/items/DEMEROUTI"], "itemData": {"id": "demerouti", "type": "article-journal", "author": [{"family": "Demerouti", "given": "E"}, {"family": "Bakker", "given": "AB"}, {"family": "Nachreiner", "given": "F"}, {"family": "Schaufeli", "given": "WB"}], "title": "The job demands-resources model of burnout", "container-title": "Journal of Applied Psychology", "container-title-short": "J Appl Psychol", "issued": {"date-parts": [[2001]]}, "volume": "86", "issue": "3", "page": "499-512", "DOI": "10.1037/0021-9010.86.3.499"}}], "schema": "https://github.com/citation-style-language/schema/raw/master/csl-citation.json"} </w:instrText>
+      </w:r>
+      <w:r>
+        <w:rPr>
+          <w:rFonts w:ascii="Times New Roman" w:cs="Times New Roman" w:eastAsia="Times New Roman" w:hAnsi="Times New Roman"/>
+          <w:sz w:val="24"/>
+          <w:szCs w:val="24"/>
+        </w:rPr>
+        <w:fldChar w:fldCharType="separate"/>
+      </w:r>
+      <w:r>
+        <w:rPr>
+          <w:rFonts w:ascii="Times New Roman" w:cs="Times New Roman" w:eastAsia="Times New Roman" w:hAnsi="Times New Roman"/>
+          <w:sz w:val="24"/>
+          <w:szCs w:val="24"/>
+        </w:rPr>
+        <w:t xml:space="preserve">(Bakker &amp; Demerouti, 2007; Demerouti et al., 2001)</w:t>
+      </w:r>
+      <w:r>
+        <w:rPr>
+          <w:rFonts w:ascii="Times New Roman" w:cs="Times New Roman" w:eastAsia="Times New Roman" w:hAnsi="Times New Roman"/>
+          <w:sz w:val="24"/>
+          <w:szCs w:val="24"/>
+        </w:rPr>
+        <w:fldChar w:fldCharType="end"/>
+      </w:r>
+      <w:r>
+        <w:rPr>
+          <w:rFonts w:ascii="Times New Roman" w:cs="Times New Roman" w:eastAsia="Times New Roman" w:hAnsi="Times New Roman"/>
+          <w:sz w:val="24"/>
+          <w:szCs w:val="24"/>
+        </w:rPr>
+        <w:t xml:space="preserve">. Low work autonomy has been associated with poorer mental health </w:t>
+      </w:r>
+      <w:r>
+        <w:rPr>
+          <w:rFonts w:ascii="Times New Roman" w:cs="Times New Roman" w:eastAsia="Times New Roman" w:hAnsi="Times New Roman"/>
+          <w:sz w:val="24"/>
+          <w:szCs w:val="24"/>
+        </w:rPr>
+        <w:fldChar w:fldCharType="begin"/>
+      </w:r>
+      <w:r>
+        <w:rPr>
+          <w:rFonts w:ascii="Times New Roman" w:cs="Times New Roman" w:eastAsia="Times New Roman" w:hAnsi="Times New Roman"/>
+          <w:sz w:val="24"/>
+          <w:szCs w:val="24"/>
+        </w:rPr>
+        <w:instrText xml:space="preserve"> ADDIN ZOTERO_ITEM CSL_CITATION {"citationID": "AGEM30", "properties": {"formattedCitation": "(Lu et al., 2023)", "plainCitation": "(Lu et al., 2023)", "noteIndex": 0}, "citationItems": [{"id": "lu", "uris": ["http://zotero.org/users/local/agemts/items/LU"], "itemData": {"id": "lu", "type": "article-journal", "author": [{"family": "Lu", "given": "Z"}, {"family": "Wang", "given": "S"}, {"family": "Li", "given": "Y"}, {"family": "Liu", "given": "X"}, {"family": "Olsen", "given": "W"}], "title": "Who gains mental health benefits from work autonomy? The roles of gender and occupational class", "container-title": "Applied Research in Quality of Life", "container-title-short": "Appl Res Qual Life", "issued": {"date-parts": [[2023]]}, "DOI": "10.1007/s11482-023-10161-4", "page": "1-23"}}], "schema": "https://github.com/citation-style-language/schema/raw/master/csl-citation.json"} </w:instrText>
+      </w:r>
+      <w:r>
+        <w:rPr>
+          <w:rFonts w:ascii="Times New Roman" w:cs="Times New Roman" w:eastAsia="Times New Roman" w:hAnsi="Times New Roman"/>
+          <w:sz w:val="24"/>
+          <w:szCs w:val="24"/>
+        </w:rPr>
+        <w:fldChar w:fldCharType="separate"/>
+      </w:r>
+      <w:r>
+        <w:rPr>
+          <w:rFonts w:ascii="Times New Roman" w:cs="Times New Roman" w:eastAsia="Times New Roman" w:hAnsi="Times New Roman"/>
+          <w:sz w:val="24"/>
+          <w:szCs w:val="24"/>
+        </w:rPr>
+        <w:t xml:space="preserve">(Lu et al., 2023)</w:t>
+      </w:r>
+      <w:r>
+        <w:rPr>
+          <w:rFonts w:ascii="Times New Roman" w:cs="Times New Roman" w:eastAsia="Times New Roman" w:hAnsi="Times New Roman"/>
+          <w:sz w:val="24"/>
+          <w:szCs w:val="24"/>
+        </w:rPr>
+        <w:fldChar w:fldCharType="end"/>
+      </w:r>
+      <w:r>
+        <w:rPr>
+          <w:rFonts w:ascii="Times New Roman" w:cs="Times New Roman" w:eastAsia="Times New Roman" w:hAnsi="Times New Roman"/>
+          <w:sz w:val="24"/>
+          <w:szCs w:val="24"/>
+        </w:rPr>
+        <w:t xml:space="preserve">. In the present data, the decrease in autonomy items was not accompanied by changes in the symptom items. This pattern may indicate that a reduction in resources had not yet been reflected in symptoms, that the change was too small to affect them or that the two results are chance findings. In a prospective cohort, persistent low job control showed a stronger association with later major depression than intermittent low job control </w:t>
+      </w:r>
+      <w:r>
+        <w:rPr>
+          <w:rFonts w:ascii="Times New Roman" w:cs="Times New Roman" w:eastAsia="Times New Roman" w:hAnsi="Times New Roman"/>
+          <w:sz w:val="24"/>
+          <w:szCs w:val="24"/>
+        </w:rPr>
+        <w:fldChar w:fldCharType="begin"/>
+      </w:r>
+      <w:r>
+        <w:rPr>
+          <w:rFonts w:ascii="Times New Roman" w:cs="Times New Roman" w:eastAsia="Times New Roman" w:hAnsi="Times New Roman"/>
+          <w:sz w:val="24"/>
+          <w:szCs w:val="24"/>
+        </w:rPr>
+        <w:instrText xml:space="preserve"> ADDIN ZOTERO_ITEM CSL_CITATION {"citationID": "AGEM31", "properties": {"formattedCitation": "(Taouk et al., 2024)", "plainCitation": "(Taouk et al., 2024)", "noteIndex": 0}, "citationItems": [{"id": "taouk", "uris": ["http://zotero.org/users/local/agemts/items/TAOUK"], "itemData": {"type": "article-journal", "author": [{"family": "Taouk", "given": "Y"}, {"family": "Aitken", "given": "Z"}, {"family": "LaMontagne", "given": "AD"}, {"family": "King", "given": "T"}], "title": "Persistent low job control and subsequent major depression: a prospective cohort study of Australian working males", "container-title": "Social Science &amp; Medicine", "issued": {"date-parts": [[2024]]}, "volume": "359", "page": "117283", "DOI": "10.1016/j.socscimed.2024.117283", "PMID": "39232379", "id": "taouk"}}], "schema": "https://github.com/citation-style-language/schema/raw/master/csl-citation.json"} </w:instrText>
+      </w:r>
+      <w:r>
+        <w:rPr>
+          <w:rFonts w:ascii="Times New Roman" w:cs="Times New Roman" w:eastAsia="Times New Roman" w:hAnsi="Times New Roman"/>
+          <w:sz w:val="24"/>
+          <w:szCs w:val="24"/>
+        </w:rPr>
+        <w:fldChar w:fldCharType="separate"/>
+      </w:r>
+      <w:r>
+        <w:rPr>
+          <w:rFonts w:ascii="Times New Roman" w:cs="Times New Roman" w:eastAsia="Times New Roman" w:hAnsi="Times New Roman"/>
+          <w:sz w:val="24"/>
+          <w:szCs w:val="24"/>
+        </w:rPr>
+        <w:t xml:space="preserve">(Taouk et al., 2024)</w:t>
+      </w:r>
+      <w:r>
+        <w:rPr>
+          <w:rFonts w:ascii="Times New Roman" w:cs="Times New Roman" w:eastAsia="Times New Roman" w:hAnsi="Times New Roman"/>
+          <w:sz w:val="24"/>
+          <w:szCs w:val="24"/>
+        </w:rPr>
+        <w:fldChar w:fldCharType="end"/>
+      </w:r>
+      <w:r>
+        <w:rPr>
+          <w:rFonts w:ascii="Times New Roman" w:cs="Times New Roman" w:eastAsia="Times New Roman" w:hAnsi="Times New Roman"/>
+          <w:sz w:val="24"/>
+          <w:szCs w:val="24"/>
+        </w:rPr>
+        <w:t xml:space="preserve">. A short reduction in autonomy may therefore not be reflected in symptoms within a few months.</w:t>
       </w:r>
     </w:p>
     <w:p>
@@ -16579,7 +18080,55 @@
           <w:sz w:val="24"/>
           <w:szCs w:val="24"/>
         </w:rPr>
-        <w:t xml:space="preserve">The absence of change among leaders should be read in light of the sample sizes. With about 20 leaders per wave, the confidence intervals of the odds ratios were wide, and only large shifts could be detected. The internal consistency of the leader items was also low and unstable across waves, which supports their analysis as separate indicators. Leadership quality has predicted later mental distress among employees (Burr et al., 2025; Fløvik et al., 2020), so monitoring the demands placed on leaders remains relevant even when small samples limit statistical inference.</w:t>
+        <w:t xml:space="preserve">The absence of change among leaders should be read in light of the sample sizes. With about 20 leaders per wave, the confidence intervals of the odds ratios were wide, and only large shifts could be detected. The internal consistency of the leader items was also low and unstable across waves, which supports their analysis as separate indicators. Leadership quality has predicted later mental distress among employees </w:t>
+      </w:r>
+      <w:r>
+        <w:rPr>
+          <w:rFonts w:ascii="Times New Roman" w:cs="Times New Roman" w:eastAsia="Times New Roman" w:hAnsi="Times New Roman"/>
+          <w:sz w:val="24"/>
+          <w:szCs w:val="24"/>
+        </w:rPr>
+        <w:fldChar w:fldCharType="begin"/>
+      </w:r>
+      <w:r>
+        <w:rPr>
+          <w:rFonts w:ascii="Times New Roman" w:cs="Times New Roman" w:eastAsia="Times New Roman" w:hAnsi="Times New Roman"/>
+          <w:sz w:val="24"/>
+          <w:szCs w:val="24"/>
+        </w:rPr>
+        <w:instrText xml:space="preserve"> ADDIN ZOTERO_ITEM CSL_CITATION {"citationID": "AGEM32", "properties": {"formattedCitation": "(Burr et al., 2025; Fløvik et al., 2020)", "plainCitation": "(Burr et al., 2025; Fløvik et al., 2020)", "noteIndex": 0}, "citationItems": [{"id": "burr", "uris": ["http://zotero.org/users/local/agemts/items/BURR"], "itemData": {"id": "burr", "type": "article-journal", "author": [{"family": "Burr", "given": "H"}, {"family": "Kersten", "given": "N"}, {"family": "Sørensen", "given": "K"}, {"family": "Sørensen", "given": "JK"}, {"family": "Dalsager", "given": "L"}, {"family": "Madsen", "given": "IEH"}, {"family": "Schöllgen", "given": "I"}, {"family": "d'Errico", "given": "A"}, {"family": "Rose", "given": "U"}, {"family": "Rugulies", "given": "R"}], "title": "A comparison among employees in Germany and Denmark of associations between quality of leadership and subsequent 5-year development of mental distress", "container-title": "Scientific Reports", "container-title-short": "Sci Rep", "issued": {"date-parts": [[2025]]}, "volume": "15", "issue": "1", "page": "7802", "DOI": "10.1038/s41598-025-92650-0"}}, {"id": "flovik", "uris": ["http://zotero.org/users/local/agemts/items/FLOVIK"], "itemData": {"id": "flovik", "type": "article-journal", "author": [{"family": "Fløvik", "given": "L"}, {"family": "Knardahl", "given": "S"}, {"family": "Christensen", "given": "JO"}], "title": "How leadership behaviors influence the effects of job predictability and perceived employability on employee mental health – a multilevel, prospective study", "container-title": "Scandinavian Journal of Work, Environment &amp; Health", "container-title-short": "Scand J Work Environ Health", "issued": {"date-parts": [[2020]]}, "volume": "46", "issue": "4", "page": "392-401", "DOI": "10.5271/sjweh.3880"}}], "schema": "https://github.com/citation-style-language/schema/raw/master/csl-citation.json"} </w:instrText>
+      </w:r>
+      <w:r>
+        <w:rPr>
+          <w:rFonts w:ascii="Times New Roman" w:cs="Times New Roman" w:eastAsia="Times New Roman" w:hAnsi="Times New Roman"/>
+          <w:sz w:val="24"/>
+          <w:szCs w:val="24"/>
+        </w:rPr>
+        <w:fldChar w:fldCharType="separate"/>
+      </w:r>
+      <w:r>
+        <w:rPr>
+          <w:rFonts w:ascii="Times New Roman" w:cs="Times New Roman" w:eastAsia="Times New Roman" w:hAnsi="Times New Roman"/>
+          <w:sz w:val="24"/>
+          <w:szCs w:val="24"/>
+        </w:rPr>
+        <w:t xml:space="preserve">(Burr et al., 2025; Fløvik et al., 2020)</w:t>
+      </w:r>
+      <w:r>
+        <w:rPr>
+          <w:rFonts w:ascii="Times New Roman" w:cs="Times New Roman" w:eastAsia="Times New Roman" w:hAnsi="Times New Roman"/>
+          <w:sz w:val="24"/>
+          <w:szCs w:val="24"/>
+        </w:rPr>
+        <w:fldChar w:fldCharType="end"/>
+      </w:r>
+      <w:r>
+        <w:rPr>
+          <w:rFonts w:ascii="Times New Roman" w:cs="Times New Roman" w:eastAsia="Times New Roman" w:hAnsi="Times New Roman"/>
+          <w:sz w:val="24"/>
+          <w:szCs w:val="24"/>
+        </w:rPr>
+        <w:t xml:space="preserve">, so monitoring the demands placed on leaders remains relevant even when small samples limit statistical inference.</w:t>
       </w:r>
     </w:p>
     <w:p>
@@ -16623,7 +18172,103 @@
           <w:sz w:val="24"/>
           <w:szCs w:val="24"/>
         </w:rPr>
-        <w:t xml:space="preserve">The design was repeated cross sectional. Responses could not be linked across waves, so changes in the composition of the respondents cannot be separated from changes within individuals. Adjusting for company addresses differences between companies but not turnover within them; the share of employees with less than one year in their company rose from 61.8% to 69.0%. The leader samples were small, with 18 to 22 respondents per wave. The proportional odds assumption was not tested. The items have not been validated ([Authors], under review). The program delivered between waves and the absence of a comparison group prevent any causal interpretation of change or stability. All data were self reported, which exposes the comparisons to common method bias (Podsakoff et al., 2003). For these reasons, the results should be regarded as preliminary.</w:t>
+        <w:t xml:space="preserve">The design was repeated cross sectional. Responses could not be linked across waves, so changes in the composition of the respondents cannot be separated from changes within individuals. Adjusting for company addresses differences between companies but not turnover within them; the share of employees with less than one year in their company rose from 61.8% to 69.0%. The leader samples were small, with 18 to 22 respondents per wave. The proportional odds assumption was not tested. The items have not been validated </w:t>
+      </w:r>
+      <w:r>
+        <w:rPr>
+          <w:rFonts w:ascii="Times New Roman" w:cs="Times New Roman" w:eastAsia="Times New Roman" w:hAnsi="Times New Roman"/>
+          <w:sz w:val="24"/>
+          <w:szCs w:val="24"/>
+        </w:rPr>
+        <w:fldChar w:fldCharType="begin"/>
+      </w:r>
+      <w:r>
+        <w:rPr>
+          <w:rFonts w:ascii="Times New Roman" w:cs="Times New Roman" w:eastAsia="Times New Roman" w:hAnsi="Times New Roman"/>
+          <w:sz w:val="24"/>
+          <w:szCs w:val="24"/>
+        </w:rPr>
+        <w:instrText xml:space="preserve"> ADDIN ZOTERO_ITEM CSL_CITATION {"citationID": "AGEM33", "properties": {"formattedCitation": "(Lima et al., 2026)", "plainCitation": "(Lima et al., 2026)", "noteIndex": 0}, "citationItems": [{"id": "lima", "uris": ["http://zotero.org/users/local/agemts/items/LIMA"], "itemData": {"type": "manuscript", "author": [{"family": "Lima", "given": "AT"}, {"family": "Haas", "given": "D"}, {"family": "Torreão", "given": "S"}, {"family": "Schiffer", "given": "H"}, {"family": "Anunciação", "given": "L"}], "title": "Psychosocial work factors and mental health symptoms under NR-1: a feasibility study", "genre": "Manuscript submitted for publication", "publisher": "Departamento de Psicologia, Pontifícia Universidade Católica do Rio de Janeiro", "issued": {"date-parts": [[2026]]}, "id": "lima"}}], "schema": "https://github.com/citation-style-language/schema/raw/master/csl-citation.json"} </w:instrText>
+      </w:r>
+      <w:r>
+        <w:rPr>
+          <w:rFonts w:ascii="Times New Roman" w:cs="Times New Roman" w:eastAsia="Times New Roman" w:hAnsi="Times New Roman"/>
+          <w:sz w:val="24"/>
+          <w:szCs w:val="24"/>
+        </w:rPr>
+        <w:fldChar w:fldCharType="separate"/>
+      </w:r>
+      <w:r>
+        <w:rPr>
+          <w:rFonts w:ascii="Times New Roman" w:cs="Times New Roman" w:eastAsia="Times New Roman" w:hAnsi="Times New Roman"/>
+          <w:sz w:val="24"/>
+          <w:szCs w:val="24"/>
+        </w:rPr>
+        <w:t xml:space="preserve">(Lima et al., 2026)</w:t>
+      </w:r>
+      <w:r>
+        <w:rPr>
+          <w:rFonts w:ascii="Times New Roman" w:cs="Times New Roman" w:eastAsia="Times New Roman" w:hAnsi="Times New Roman"/>
+          <w:sz w:val="24"/>
+          <w:szCs w:val="24"/>
+        </w:rPr>
+        <w:fldChar w:fldCharType="end"/>
+      </w:r>
+      <w:r>
+        <w:rPr>
+          <w:rFonts w:ascii="Times New Roman" w:cs="Times New Roman" w:eastAsia="Times New Roman" w:hAnsi="Times New Roman"/>
+          <w:sz w:val="24"/>
+          <w:szCs w:val="24"/>
+        </w:rPr>
+        <w:t xml:space="preserve">. The program delivered between waves and the absence of a comparison group prevent any causal interpretation of change or stability. All data were self reported, which exposes the comparisons to common method bias </w:t>
+      </w:r>
+      <w:r>
+        <w:rPr>
+          <w:rFonts w:ascii="Times New Roman" w:cs="Times New Roman" w:eastAsia="Times New Roman" w:hAnsi="Times New Roman"/>
+          <w:sz w:val="24"/>
+          <w:szCs w:val="24"/>
+        </w:rPr>
+        <w:fldChar w:fldCharType="begin"/>
+      </w:r>
+      <w:r>
+        <w:rPr>
+          <w:rFonts w:ascii="Times New Roman" w:cs="Times New Roman" w:eastAsia="Times New Roman" w:hAnsi="Times New Roman"/>
+          <w:sz w:val="24"/>
+          <w:szCs w:val="24"/>
+        </w:rPr>
+        <w:instrText xml:space="preserve"> ADDIN ZOTERO_ITEM CSL_CITATION {"citationID": "AGEM34", "properties": {"formattedCitation": "(Podsakoff et al., 2003)", "plainCitation": "(Podsakoff et al., 2003)", "noteIndex": 0}, "citationItems": [{"id": "podsakoff", "uris": ["http://zotero.org/users/local/agemts/items/PODSAKOFF"], "itemData": {"id": "podsakoff", "type": "article-journal", "author": [{"family": "Podsakoff", "given": "PM"}, {"family": "MacKenzie", "given": "SB"}, {"family": "Lee", "given": "JY"}, {"family": "Podsakoff", "given": "NP"}], "title": "Common method biases in behavioral research: a critical review of the literature and recommended remedies", "container-title": "Journal of Applied Psychology", "container-title-short": "J Appl Psychol", "issued": {"date-parts": [[2003]]}, "volume": "88", "issue": "5", "page": "879-903", "DOI": "10.1037/0021-9010.88.5.879"}}], "schema": "https://github.com/citation-style-language/schema/raw/master/csl-citation.json"} </w:instrText>
+      </w:r>
+      <w:r>
+        <w:rPr>
+          <w:rFonts w:ascii="Times New Roman" w:cs="Times New Roman" w:eastAsia="Times New Roman" w:hAnsi="Times New Roman"/>
+          <w:sz w:val="24"/>
+          <w:szCs w:val="24"/>
+        </w:rPr>
+        <w:fldChar w:fldCharType="separate"/>
+      </w:r>
+      <w:r>
+        <w:rPr>
+          <w:rFonts w:ascii="Times New Roman" w:cs="Times New Roman" w:eastAsia="Times New Roman" w:hAnsi="Times New Roman"/>
+          <w:sz w:val="24"/>
+          <w:szCs w:val="24"/>
+        </w:rPr>
+        <w:t xml:space="preserve">(Podsakoff et al., 2003)</w:t>
+      </w:r>
+      <w:r>
+        <w:rPr>
+          <w:rFonts w:ascii="Times New Roman" w:cs="Times New Roman" w:eastAsia="Times New Roman" w:hAnsi="Times New Roman"/>
+          <w:sz w:val="24"/>
+          <w:szCs w:val="24"/>
+        </w:rPr>
+        <w:fldChar w:fldCharType="end"/>
+      </w:r>
+      <w:r>
+        <w:rPr>
+          <w:rFonts w:ascii="Times New Roman" w:cs="Times New Roman" w:eastAsia="Times New Roman" w:hAnsi="Times New Roman"/>
+          <w:sz w:val="24"/>
+          <w:szCs w:val="24"/>
+        </w:rPr>
+        <w:t xml:space="preserve">. For these reasons, the results should be regarded as preliminary.</w:t>
       </w:r>
     </w:p>
     <w:p>
@@ -16714,7 +18359,31 @@
           <w:sz w:val="24"/>
           <w:szCs w:val="24"/>
         </w:rPr>
-        <w:t xml:space="preserve">[Authors]. (under review). </w:t>
+        <w:fldChar w:fldCharType="begin"/>
+      </w:r>
+      <w:r>
+        <w:rPr>
+          <w:rFonts w:ascii="Times New Roman" w:cs="Times New Roman" w:eastAsia="Times New Roman" w:hAnsi="Times New Roman"/>
+          <w:sz w:val="24"/>
+          <w:szCs w:val="24"/>
+        </w:rPr>
+        <w:instrText xml:space="preserve"> ADDIN ZOTERO_BIBL {"uncited":[],"omitted":[],"custom":[]} CSL_BIBLIOGRAPHY </w:instrText>
+      </w:r>
+      <w:r>
+        <w:rPr>
+          <w:rFonts w:ascii="Times New Roman" w:cs="Times New Roman" w:eastAsia="Times New Roman" w:hAnsi="Times New Roman"/>
+          <w:sz w:val="24"/>
+          <w:szCs w:val="24"/>
+        </w:rPr>
+        <w:fldChar w:fldCharType="separate"/>
+      </w:r>
+      <w:r>
+        <w:rPr>
+          <w:rFonts w:ascii="Times New Roman" w:cs="Times New Roman" w:eastAsia="Times New Roman" w:hAnsi="Times New Roman"/>
+          <w:sz w:val="24"/>
+          <w:szCs w:val="24"/>
+        </w:rPr>
+        <w:t xml:space="preserve">Aust, B., Møller, J. L., Nordentoft, M., Frydendall, K. B., Bengtsen, E., Jensen, A. B., Garde, A. H., Kompier, M., Semmer, N., Rugulies, R., &amp; Jaspers, S. Ø. (2023). How effective are organizational-level interventions in improving the psychosocial work environment, health, and retention of workers? A systematic overview of systematic reviews. </w:t>
       </w:r>
       <w:r>
         <w:rPr>
@@ -16724,7 +18393,15 @@
           <w:sz w:val="24"/>
           <w:szCs w:val="24"/>
         </w:rPr>
-        <w:t xml:space="preserve">Psychosocial work factors and mental health symptoms under NR-1: A feasibility study.</w:t>
+        <w:t xml:space="preserve">Scandinavian Journal of Work, Environment &amp; Health, 49</w:t>
+      </w:r>
+      <w:r>
+        <w:rPr>
+          <w:rFonts w:ascii="Times New Roman" w:cs="Times New Roman" w:eastAsia="Times New Roman" w:hAnsi="Times New Roman"/>
+          <w:sz w:val="24"/>
+          <w:szCs w:val="24"/>
+        </w:rPr>
+        <w:t xml:space="preserve">(5), 315–329. https://doi.org/10.5271/sjweh.4097</w:t>
       </w:r>
     </w:p>
     <w:p>
@@ -16738,7 +18415,7 @@
           <w:sz w:val="24"/>
           <w:szCs w:val="24"/>
         </w:rPr>
-        <w:t xml:space="preserve">Aust, B., Møller, J. L., Nordentoft, M., Frydendall, K. B., Bengtsen, E., Jensen, A. B., Garde, A. H., Kompier, M., Semmer, N., Rugulies, R., &amp; Jaspers, S. Ø. (2023). How effective are organizational-level interventions in improving the psychosocial work environment, health, and retention of workers? A systematic overview of systematic reviews. </w:t>
+        <w:t xml:space="preserve">Bakker, A. B., &amp; Demerouti, E. (2007). The Job Demands-Resources model: State of the art. </w:t>
       </w:r>
       <w:r>
         <w:rPr>
@@ -16748,15 +18425,15 @@
           <w:sz w:val="24"/>
           <w:szCs w:val="24"/>
         </w:rPr>
-        <w:t xml:space="preserve">Scandinavian Journal of Work, Environment &amp; Health, 49</w:t>
-      </w:r>
-      <w:r>
-        <w:rPr>
-          <w:rFonts w:ascii="Times New Roman" w:cs="Times New Roman" w:eastAsia="Times New Roman" w:hAnsi="Times New Roman"/>
-          <w:sz w:val="24"/>
-          <w:szCs w:val="24"/>
-        </w:rPr>
-        <w:t xml:space="preserve">(5), 315–329. https://doi.org/10.5271/sjweh.4097</w:t>
+        <w:t xml:space="preserve">Journal of Managerial Psychology, 22</w:t>
+      </w:r>
+      <w:r>
+        <w:rPr>
+          <w:rFonts w:ascii="Times New Roman" w:cs="Times New Roman" w:eastAsia="Times New Roman" w:hAnsi="Times New Roman"/>
+          <w:sz w:val="24"/>
+          <w:szCs w:val="24"/>
+        </w:rPr>
+        <w:t xml:space="preserve">(3), 309–328. https://doi.org/10.1108/02683940710733115</w:t>
       </w:r>
     </w:p>
     <w:p>
@@ -16770,7 +18447,7 @@
           <w:sz w:val="24"/>
           <w:szCs w:val="24"/>
         </w:rPr>
-        <w:t xml:space="preserve">Bakker, A. B., &amp; Demerouti, E. (2007). The Job Demands-Resources model: State of the art. </w:t>
+        <w:t xml:space="preserve">Bouzada, D. F., Sol, N. A. A., &amp; da Silva, C. A. M. (2023). Absenteeism due to mental and behavioral disorder in employees of a federal university. </w:t>
       </w:r>
       <w:r>
         <w:rPr>
@@ -16780,15 +18457,15 @@
           <w:sz w:val="24"/>
           <w:szCs w:val="24"/>
         </w:rPr>
-        <w:t xml:space="preserve">Journal of Managerial Psychology, 22</w:t>
-      </w:r>
-      <w:r>
-        <w:rPr>
-          <w:rFonts w:ascii="Times New Roman" w:cs="Times New Roman" w:eastAsia="Times New Roman" w:hAnsi="Times New Roman"/>
-          <w:sz w:val="24"/>
-          <w:szCs w:val="24"/>
-        </w:rPr>
-        <w:t xml:space="preserve">(3), 309–328. https://doi.org/10.1108/02683940710733115</w:t>
+        <w:t xml:space="preserve">Revista Brasileira de Medicina do Trabalho, 20</w:t>
+      </w:r>
+      <w:r>
+        <w:rPr>
+          <w:rFonts w:ascii="Times New Roman" w:cs="Times New Roman" w:eastAsia="Times New Roman" w:hAnsi="Times New Roman"/>
+          <w:sz w:val="24"/>
+          <w:szCs w:val="24"/>
+        </w:rPr>
+        <w:t xml:space="preserve">(4), 515–523. https://doi.org/10.47626/1679-4435-2022-763</w:t>
       </w:r>
     </w:p>
     <w:p>
@@ -16802,7 +18479,7 @@
           <w:sz w:val="24"/>
           <w:szCs w:val="24"/>
         </w:rPr>
-        <w:t xml:space="preserve">Bouzada, D. F., Sol, N. A. A., &amp; da Silva, C. A. M. (2023). Absenteeism due to mental and behavioral disorder in employees of a federal university. </w:t>
+        <w:t xml:space="preserve">Burr, H., Kersten, N., Sørensen, K., Sørensen, J. K., Dalsager, L., Madsen, I. E. H., Schöllgen, I., d’Errico, A., Rose, U., &amp; Rugulies, R. (2025). A comparison among employees in Germany and Denmark of associations between quality of leadership and subsequent 5-year development of mental distress. </w:t>
       </w:r>
       <w:r>
         <w:rPr>
@@ -16812,15 +18489,15 @@
           <w:sz w:val="24"/>
           <w:szCs w:val="24"/>
         </w:rPr>
-        <w:t xml:space="preserve">Revista Brasileira de Medicina do Trabalho, 20</w:t>
-      </w:r>
-      <w:r>
-        <w:rPr>
-          <w:rFonts w:ascii="Times New Roman" w:cs="Times New Roman" w:eastAsia="Times New Roman" w:hAnsi="Times New Roman"/>
-          <w:sz w:val="24"/>
-          <w:szCs w:val="24"/>
-        </w:rPr>
-        <w:t xml:space="preserve">(4), 515–523. https://doi.org/10.47626/1679-4435-2022-763</w:t>
+        <w:t xml:space="preserve">Scientific Reports, 15</w:t>
+      </w:r>
+      <w:r>
+        <w:rPr>
+          <w:rFonts w:ascii="Times New Roman" w:cs="Times New Roman" w:eastAsia="Times New Roman" w:hAnsi="Times New Roman"/>
+          <w:sz w:val="24"/>
+          <w:szCs w:val="24"/>
+        </w:rPr>
+        <w:t xml:space="preserve">(1), 7802. https://doi.org/10.1038/s41598-025-92650-0</w:t>
       </w:r>
     </w:p>
     <w:p>
@@ -16834,7 +18511,7 @@
           <w:sz w:val="24"/>
           <w:szCs w:val="24"/>
         </w:rPr>
-        <w:t xml:space="preserve">Burr, H., Kersten, N., Sørensen, K., Sørensen, J. K., Dalsager, L., Madsen, I. E. H., Schöllgen, I., d’Errico, A., Rose, U., &amp; Rugulies, R. (2025). A comparison among employees in Germany and Denmark of associations between quality of leadership and subsequent 5-year development of mental distress. </w:t>
+        <w:t xml:space="preserve">Conselho Nacional de Saúde. (2016). </w:t>
       </w:r>
       <w:r>
         <w:rPr>
@@ -16844,15 +18521,15 @@
           <w:sz w:val="24"/>
           <w:szCs w:val="24"/>
         </w:rPr>
-        <w:t xml:space="preserve">Scientific Reports, 15</w:t>
-      </w:r>
-      <w:r>
-        <w:rPr>
-          <w:rFonts w:ascii="Times New Roman" w:cs="Times New Roman" w:eastAsia="Times New Roman" w:hAnsi="Times New Roman"/>
-          <w:sz w:val="24"/>
-          <w:szCs w:val="24"/>
-        </w:rPr>
-        <w:t xml:space="preserve">(1), 7802. https://doi.org/10.1038/s41598-025-92650-0</w:t>
+        <w:t xml:space="preserve">Resolução nº 510, de 7 de abril de 2016. Dispõe sobre as normas aplicáveis a pesquisas em Ciências Humanas e Sociais.</w:t>
+      </w:r>
+      <w:r>
+        <w:rPr>
+          <w:rFonts w:ascii="Times New Roman" w:cs="Times New Roman" w:eastAsia="Times New Roman" w:hAnsi="Times New Roman"/>
+          <w:sz w:val="24"/>
+          <w:szCs w:val="24"/>
+        </w:rPr>
+        <w:t xml:space="preserve"> Diário Oficial da União. https://bvsms.saude.gov.br/bvs/saudelegis/cns/2016/res0510_07_04_2016.html</w:t>
       </w:r>
     </w:p>
     <w:p>
@@ -16866,7 +18543,7 @@
           <w:sz w:val="24"/>
           <w:szCs w:val="24"/>
         </w:rPr>
-        <w:t xml:space="preserve">Conselho Nacional de Saúde. (2016). </w:t>
+        <w:t xml:space="preserve">de Lucca, S. R., Silva Junior, J. S., &amp; Bandini, M. (2025). Critical analysis of psychosocial factors at work within the Risk Management Program of Regulatory Standard-1. </w:t>
       </w:r>
       <w:r>
         <w:rPr>
@@ -16876,15 +18553,15 @@
           <w:sz w:val="24"/>
           <w:szCs w:val="24"/>
         </w:rPr>
-        <w:t xml:space="preserve">Resolução nº 510, de 7 de abril de 2016. Dispõe sobre as normas aplicáveis a pesquisas em Ciências Humanas e Sociais.</w:t>
-      </w:r>
-      <w:r>
-        <w:rPr>
-          <w:rFonts w:ascii="Times New Roman" w:cs="Times New Roman" w:eastAsia="Times New Roman" w:hAnsi="Times New Roman"/>
-          <w:sz w:val="24"/>
-          <w:szCs w:val="24"/>
-        </w:rPr>
-        <w:t xml:space="preserve"> Diário Oficial da União. https://bvsms.saude.gov.br/bvs/saudelegis/cns/2016/res0510_07_04_2016.html</w:t>
+        <w:t xml:space="preserve">Revista Brasileira de Medicina do Trabalho, 23</w:t>
+      </w:r>
+      <w:r>
+        <w:rPr>
+          <w:rFonts w:ascii="Times New Roman" w:cs="Times New Roman" w:eastAsia="Times New Roman" w:hAnsi="Times New Roman"/>
+          <w:sz w:val="24"/>
+          <w:szCs w:val="24"/>
+        </w:rPr>
+        <w:t xml:space="preserve">(1), e20251425. https://doi.org/10.47626/1679-4435-2025-1425</w:t>
       </w:r>
     </w:p>
     <w:p>
@@ -16898,7 +18575,7 @@
           <w:sz w:val="24"/>
           <w:szCs w:val="24"/>
         </w:rPr>
-        <w:t xml:space="preserve">de Lucca, S. R., Silva Junior, J. S., &amp; Bandini, M. (2025). Critical analysis of psychosocial factors at work within the Risk Management Program of Regulatory Standard-1. </w:t>
+        <w:t xml:space="preserve">Demerouti, E., Bakker, A. B., Nachreiner, F., &amp; Schaufeli, W. B. (2001). The job demands-resources model of burnout. </w:t>
       </w:r>
       <w:r>
         <w:rPr>
@@ -16908,15 +18585,15 @@
           <w:sz w:val="24"/>
           <w:szCs w:val="24"/>
         </w:rPr>
-        <w:t xml:space="preserve">Revista Brasileira de Medicina do Trabalho, 23</w:t>
-      </w:r>
-      <w:r>
-        <w:rPr>
-          <w:rFonts w:ascii="Times New Roman" w:cs="Times New Roman" w:eastAsia="Times New Roman" w:hAnsi="Times New Roman"/>
-          <w:sz w:val="24"/>
-          <w:szCs w:val="24"/>
-        </w:rPr>
-        <w:t xml:space="preserve">(1), e20251425. https://doi.org/10.47626/1679-4435-2025-1425</w:t>
+        <w:t xml:space="preserve">Journal of Applied Psychology, 86</w:t>
+      </w:r>
+      <w:r>
+        <w:rPr>
+          <w:rFonts w:ascii="Times New Roman" w:cs="Times New Roman" w:eastAsia="Times New Roman" w:hAnsi="Times New Roman"/>
+          <w:sz w:val="24"/>
+          <w:szCs w:val="24"/>
+        </w:rPr>
+        <w:t xml:space="preserve">(3), 499–512. https://doi.org/10.1037/0021-9010.86.3.499</w:t>
       </w:r>
     </w:p>
     <w:p>
@@ -16930,7 +18607,7 @@
           <w:sz w:val="24"/>
           <w:szCs w:val="24"/>
         </w:rPr>
-        <w:t xml:space="preserve">Demerouti, E., Bakker, A. B., Nachreiner, F., &amp; Schaufeli, W. B. (2001). The job demands-resources model of burnout. </w:t>
+        <w:t xml:space="preserve">Fløvik, L., Knardahl, S., &amp; Christensen, J. O. (2020). How leadership behaviors influence the effects of job predictability and perceived employability on employee mental health: A multilevel, prospective study. </w:t>
       </w:r>
       <w:r>
         <w:rPr>
@@ -16940,15 +18617,15 @@
           <w:sz w:val="24"/>
           <w:szCs w:val="24"/>
         </w:rPr>
-        <w:t xml:space="preserve">Journal of Applied Psychology, 86</w:t>
-      </w:r>
-      <w:r>
-        <w:rPr>
-          <w:rFonts w:ascii="Times New Roman" w:cs="Times New Roman" w:eastAsia="Times New Roman" w:hAnsi="Times New Roman"/>
-          <w:sz w:val="24"/>
-          <w:szCs w:val="24"/>
-        </w:rPr>
-        <w:t xml:space="preserve">(3), 499–512. https://doi.org/10.1037/0021-9010.86.3.499</w:t>
+        <w:t xml:space="preserve">Scandinavian Journal of Work, Environment &amp; Health, 46</w:t>
+      </w:r>
+      <w:r>
+        <w:rPr>
+          <w:rFonts w:ascii="Times New Roman" w:cs="Times New Roman" w:eastAsia="Times New Roman" w:hAnsi="Times New Roman"/>
+          <w:sz w:val="24"/>
+          <w:szCs w:val="24"/>
+        </w:rPr>
+        <w:t xml:space="preserve">(4), 392–401. https://doi.org/10.5271/sjweh.3880</w:t>
       </w:r>
     </w:p>
     <w:p>
@@ -16962,7 +18639,7 @@
           <w:sz w:val="24"/>
           <w:szCs w:val="24"/>
         </w:rPr>
-        <w:t xml:space="preserve">Fløvik, L., Knardahl, S., &amp; Christensen, J. O. (2020). How leadership behaviors influence the effects of job predictability and perceived employability on employee mental health: A multilevel, prospective study. </w:t>
+        <w:t xml:space="preserve">Gonçalves, J. S., Moriguchi, C. S., Chaves, T. C., &amp; Sato, T. O. (2021). Cross-cultural adaptation and psychometric properties of the short version of COPSOQ II-Brazil. </w:t>
       </w:r>
       <w:r>
         <w:rPr>
@@ -16972,15 +18649,15 @@
           <w:sz w:val="24"/>
           <w:szCs w:val="24"/>
         </w:rPr>
-        <w:t xml:space="preserve">Scandinavian Journal of Work, Environment &amp; Health, 46</w:t>
-      </w:r>
-      <w:r>
-        <w:rPr>
-          <w:rFonts w:ascii="Times New Roman" w:cs="Times New Roman" w:eastAsia="Times New Roman" w:hAnsi="Times New Roman"/>
-          <w:sz w:val="24"/>
-          <w:szCs w:val="24"/>
-        </w:rPr>
-        <w:t xml:space="preserve">(4), 392–401. https://doi.org/10.5271/sjweh.3880</w:t>
+        <w:t xml:space="preserve">Revista de Saúde Pública, 55</w:t>
+      </w:r>
+      <w:r>
+        <w:rPr>
+          <w:rFonts w:ascii="Times New Roman" w:cs="Times New Roman" w:eastAsia="Times New Roman" w:hAnsi="Times New Roman"/>
+          <w:sz w:val="24"/>
+          <w:szCs w:val="24"/>
+        </w:rPr>
+        <w:t xml:space="preserve">, 69. https://doi.org/10.11606/s1518-8787.2021055003123</w:t>
       </w:r>
     </w:p>
     <w:p>
@@ -16994,7 +18671,7 @@
           <w:sz w:val="24"/>
           <w:szCs w:val="24"/>
         </w:rPr>
-        <w:t xml:space="preserve">Gonçalves, J. S., Moriguchi, C. S., Chaves, T. C., &amp; Sato, T. O. (2021). Cross-cultural adaptation and psychometric properties of the short version of COPSOQ II-Brazil. </w:t>
+        <w:t xml:space="preserve">Imboden, M. T., Wolfe, E., Evers, K., Ferrão, A., Mochari-Greenberger, H., Johnson, S., Kirsten, W., &amp; Seaverson, E. L. D. (2024). Evaluating workforce mental health and well-being: A review of assessments. </w:t>
       </w:r>
       <w:r>
         <w:rPr>
@@ -17004,15 +18681,15 @@
           <w:sz w:val="24"/>
           <w:szCs w:val="24"/>
         </w:rPr>
-        <w:t xml:space="preserve">Revista de Saúde Pública, 55</w:t>
-      </w:r>
-      <w:r>
-        <w:rPr>
-          <w:rFonts w:ascii="Times New Roman" w:cs="Times New Roman" w:eastAsia="Times New Roman" w:hAnsi="Times New Roman"/>
-          <w:sz w:val="24"/>
-          <w:szCs w:val="24"/>
-        </w:rPr>
-        <w:t xml:space="preserve">, 69. https://doi.org/10.11606/s1518-8787.2021055003123</w:t>
+        <w:t xml:space="preserve">American Journal of Health Promotion, 38</w:t>
+      </w:r>
+      <w:r>
+        <w:rPr>
+          <w:rFonts w:ascii="Times New Roman" w:cs="Times New Roman" w:eastAsia="Times New Roman" w:hAnsi="Times New Roman"/>
+          <w:sz w:val="24"/>
+          <w:szCs w:val="24"/>
+        </w:rPr>
+        <w:t xml:space="preserve">(4), 540–559. https://doi.org/10.1177/08901171231223786</w:t>
       </w:r>
     </w:p>
     <w:p>
@@ -17026,7 +18703,7 @@
           <w:sz w:val="24"/>
           <w:szCs w:val="24"/>
         </w:rPr>
-        <w:t xml:space="preserve">Imboden, M. T., Wolfe, E., Evers, K., Ferrão, A., Mochari-Greenberger, H., Johnson, S., Kirsten, W., &amp; Seaverson, E. L. D. (2024). Evaluating workforce mental health and well-being: A review of assessments. </w:t>
+        <w:t xml:space="preserve">International Organization for Standardization. (2021). </w:t>
       </w:r>
       <w:r>
         <w:rPr>
@@ -17036,15 +18713,15 @@
           <w:sz w:val="24"/>
           <w:szCs w:val="24"/>
         </w:rPr>
-        <w:t xml:space="preserve">American Journal of Health Promotion, 38</w:t>
-      </w:r>
-      <w:r>
-        <w:rPr>
-          <w:rFonts w:ascii="Times New Roman" w:cs="Times New Roman" w:eastAsia="Times New Roman" w:hAnsi="Times New Roman"/>
-          <w:sz w:val="24"/>
-          <w:szCs w:val="24"/>
-        </w:rPr>
-        <w:t xml:space="preserve">(4), 540–559. https://doi.org/10.1177/08901171231223786</w:t>
+        <w:t xml:space="preserve">Occupational health and safety management: Psychological health and safety at work: Guidelines for managing psychosocial risks</w:t>
+      </w:r>
+      <w:r>
+        <w:rPr>
+          <w:rFonts w:ascii="Times New Roman" w:cs="Times New Roman" w:eastAsia="Times New Roman" w:hAnsi="Times New Roman"/>
+          <w:sz w:val="24"/>
+          <w:szCs w:val="24"/>
+        </w:rPr>
+        <w:t xml:space="preserve"> (ISO Standard No. 45003:2021). https://www.iso.org/standard/64283.html</w:t>
       </w:r>
     </w:p>
     <w:p>
@@ -17058,7 +18735,7 @@
           <w:sz w:val="24"/>
           <w:szCs w:val="24"/>
         </w:rPr>
-        <w:t xml:space="preserve">International Organization for Standardization. (2021). </w:t>
+        <w:t xml:space="preserve">Jain, A., Torres, L. D., Teoh, K., &amp; Leka, S. (2022). The impact of national legislation on psychosocial risks on organisational action plans, psychosocial working conditions, and employee work-related stress in Europe. </w:t>
       </w:r>
       <w:r>
         <w:rPr>
@@ -17068,15 +18745,15 @@
           <w:sz w:val="24"/>
           <w:szCs w:val="24"/>
         </w:rPr>
-        <w:t xml:space="preserve">Occupational health and safety management: Psychological health and safety at work: Guidelines for managing psychosocial risks</w:t>
-      </w:r>
-      <w:r>
-        <w:rPr>
-          <w:rFonts w:ascii="Times New Roman" w:cs="Times New Roman" w:eastAsia="Times New Roman" w:hAnsi="Times New Roman"/>
-          <w:sz w:val="24"/>
-          <w:szCs w:val="24"/>
-        </w:rPr>
-        <w:t xml:space="preserve"> (ISO Standard No. 45003:2021). https://www.iso.org/standard/64283.html</w:t>
+        <w:t xml:space="preserve">Social Science &amp; Medicine, 302</w:t>
+      </w:r>
+      <w:r>
+        <w:rPr>
+          <w:rFonts w:ascii="Times New Roman" w:cs="Times New Roman" w:eastAsia="Times New Roman" w:hAnsi="Times New Roman"/>
+          <w:sz w:val="24"/>
+          <w:szCs w:val="24"/>
+        </w:rPr>
+        <w:t xml:space="preserve">, 114987. https://doi.org/10.1016/j.socscimed.2022.114987</w:t>
       </w:r>
     </w:p>
     <w:p>
@@ -17090,7 +18767,7 @@
           <w:sz w:val="24"/>
           <w:szCs w:val="24"/>
         </w:rPr>
-        <w:t xml:space="preserve">Jain, A., Torres, L. D., Teoh, K., &amp; Leka, S. (2022). The impact of national legislation on psychosocial risks on organisational action plans, psychosocial working conditions, and employee work-related stress in Europe. </w:t>
+        <w:t xml:space="preserve">Lima, A. T., Haas, D., Torreão, S., Schiffer, H., &amp; Anunciação, L. (2026). </w:t>
       </w:r>
       <w:r>
         <w:rPr>
@@ -17100,15 +18777,15 @@
           <w:sz w:val="24"/>
           <w:szCs w:val="24"/>
         </w:rPr>
-        <w:t xml:space="preserve">Social Science &amp; Medicine, 302</w:t>
-      </w:r>
-      <w:r>
-        <w:rPr>
-          <w:rFonts w:ascii="Times New Roman" w:cs="Times New Roman" w:eastAsia="Times New Roman" w:hAnsi="Times New Roman"/>
-          <w:sz w:val="24"/>
-          <w:szCs w:val="24"/>
-        </w:rPr>
-        <w:t xml:space="preserve">, 114987. https://doi.org/10.1016/j.socscimed.2022.114987</w:t>
+        <w:t xml:space="preserve">Psychosocial work factors and mental health symptoms under NR-1: A feasibility study</w:t>
+      </w:r>
+      <w:r>
+        <w:rPr>
+          <w:rFonts w:ascii="Times New Roman" w:cs="Times New Roman" w:eastAsia="Times New Roman" w:hAnsi="Times New Roman"/>
+          <w:sz w:val="24"/>
+          <w:szCs w:val="24"/>
+        </w:rPr>
+        <w:t xml:space="preserve"> [Manuscript submitted for publication]. Departamento de Psicologia, Pontifícia Universidade Católica do Rio de Janeiro.</w:t>
       </w:r>
     </w:p>
     <w:p>
@@ -17461,6 +19138,14 @@
           <w:szCs w:val="24"/>
         </w:rPr>
         <w:t xml:space="preserve"> https://www.who.int/publications/i/item/9789240053052</w:t>
+      </w:r>
+      <w:r>
+        <w:rPr>
+          <w:rFonts w:ascii="Times New Roman" w:cs="Times New Roman" w:eastAsia="Times New Roman" w:hAnsi="Times New Roman"/>
+          <w:sz w:val="24"/>
+          <w:szCs w:val="24"/>
+        </w:rPr>
+        <w:fldChar w:fldCharType="end"/>
       </w:r>
     </w:p>
     <w:sectPr>

</xml_diff>

<commit_message>
Brief report reframed: monitoring to guide tailored interventions
Co-Authored-By: Claude Opus 5.5 <noreply@anthropic.com>
Claude-Session: https://claude.ai/code/session_01RKBYJsspEG8XXPu9eJdzD5
</commit_message>
<xml_diff>
--- a/Results/AGEM - Time series manuscript.docx
+++ b/Results/AGEM - Time series manuscript.docx
@@ -28,7 +28,7 @@
           <w:sz w:val="24"/>
           <w:szCs w:val="24"/>
         </w:rPr>
-        <w:t xml:space="preserve">2026-10-17 - 11:07</w:t>
+        <w:t xml:space="preserve">2026-10-17 - 11:24</w:t>
       </w:r>
     </w:p>
     <w:p>
@@ -44,7 +44,7 @@
           <w:sz w:val="24"/>
           <w:szCs w:val="24"/>
         </w:rPr>
-        <w:t xml:space="preserve">Stability of Psychosocial Risk Indicators Across Anonymous Monitoring Waves in Two Brazilian Companies: A Brief Report</w:t>
+        <w:t xml:space="preserve">Repeated Monitoring of Psychosocial Risk to Guide Tailored Interventions Under NR-1: A Brief Report From Two Brazilian Companies</w:t>
       </w:r>
     </w:p>
     <w:p>
@@ -102,7 +102,7 @@
           <w:sz w:val="24"/>
           <w:szCs w:val="24"/>
         </w:rPr>
-        <w:t xml:space="preserve">Brazil’s amended Regulatory Standard No. 1 (NR-1) requires employers to manage psychosocial risks, which implies repeated assessment. This brief report describes the stability of psychosocial risk indicators across anonymous monitoring waves in two Brazilian companies. Leaders answered 8 items at three waves (</w:t>
+        <w:t xml:space="preserve">Brazil’s amended Regulatory Standard No. 1 (NR-1) requires employers to manage psychosocial risks through a cycle of assessment, action and review. This brief report describes psychosocial risk indicators across anonymous monitoring waves in two Brazilian companies and examines how repeated monitoring can identify targets for tailored interventions. Leaders answered 8 items at three waves (</w:t>
       </w:r>
       <w:r>
         <w:rPr>
@@ -138,7 +138,7 @@
           <w:sz w:val="24"/>
           <w:szCs w:val="24"/>
         </w:rPr>
-        <w:t xml:space="preserve"> = 111 and 105), between December 2025 and August 2026. Only items worded identically across waves were analyzed, and change was estimated with proportional odds models adjusted for company. Given the short interval, stability was expected. No leader item changed. Two of 38 employee items decreased: freedom to organize one’s activities (odds ratio = 0.52) and encouragement to use creativity and knowledge (odds ratio = 0.54). Across 46 tests, this is close to the number expected by chance. Changes between survey forms removed 12 of 20 leader items and 5 of 43 employee items. These preliminary findings indicate that monitoring under NR-1 requires fixed item wording, linkable anonymous responses and larger samples of leaders.</w:t>
+        <w:t xml:space="preserve"> = 111 and 105), between December 2025 and August 2026. Only items worded identically across waves were analyzed, and change was estimated with proportional odds models adjusted for company. Given the short interval, stability was expected. No leader item changed. Two of 38 employee items decreased: freedom to organize one’s activities (odds ratio = 0.52) and encouragement to use creativity and knowledge (odds ratio = 0.54). Across 46 tests, this is close to the number expected by chance. Changes between survey forms removed 12 of 20 leader items and 5 of 43 employee items. These preliminary findings identify autonomy as a target for tailored organizational interventions and indicate that monitoring under NR-1 requires fixed item wording, linkable anonymous responses and larger samples of leaders.</w:t>
       </w:r>
     </w:p>
     <w:p>
@@ -782,7 +782,7 @@
           <w:sz w:val="24"/>
           <w:szCs w:val="24"/>
         </w:rPr>
-        <w:t xml:space="preserve">. Risk management guidance describes assessment as a continuing cycle of identification, action and review </w:t>
+        <w:t xml:space="preserve">. Risk management guidance describes a continuing cycle in which risks are identified, actions are tailored to the risks found, and the same indicators are measured again to review the effect of those actions </w:t>
       </w:r>
       <w:r>
         <w:rPr>
@@ -830,7 +830,7 @@
           <w:sz w:val="24"/>
           <w:szCs w:val="24"/>
         </w:rPr>
-        <w:t xml:space="preserve">, which requires the same indicators to be measured repeatedly. Anonymous workforce surveys protect employees, but their responses cannot be linked over time </w:t>
+        <w:t xml:space="preserve">. This cycle requires indicators that are measured repeatedly and compared over time. Anonymous workforce surveys protect employees, but their responses cannot be linked over time </w:t>
       </w:r>
       <w:r>
         <w:rPr>
@@ -908,7 +908,7 @@
           <w:sz w:val="24"/>
           <w:szCs w:val="24"/>
         </w:rPr>
-        <w:t xml:space="preserve">Companies subject to NR-1 need evidence on whether the indicators they collect remain stable between assessments. The goal of this brief report is to describe the stability of psychosocial risk indicators across repeated anonymous monitoring waves among leaders and employees of two Brazilian companies. Because psychosocial risk factors reflect conditions of work design and organization </w:t>
+        <w:t xml:space="preserve">Companies subject to NR-1 need evidence on whether the indicators they collect remain stable between assessments. The goals of this brief report are to describe the stability of psychosocial risk indicators across repeated anonymous monitoring waves among leaders and employees of two Brazilian companies, and to identify the indicators that could guide tailored interventions. Because psychosocial risk factors reflect conditions of work design and organization </w:t>
       </w:r>
       <w:r>
         <w:rPr>
@@ -5684,6 +5684,164 @@
           <w:sz w:val="24"/>
           <w:szCs w:val="24"/>
         </w:rPr>
+        <w:t xml:space="preserve">Within the risk management cycle, these results point to where tailored interventions could be directed. The two items that changed describe autonomy, a job resource in the Job Demands-Resources model </w:t>
+      </w:r>
+      <w:r>
+        <w:rPr>
+          <w:rFonts w:ascii="Times New Roman" w:cs="Times New Roman" w:eastAsia="Times New Roman" w:hAnsi="Times New Roman"/>
+          <w:sz w:val="24"/>
+          <w:szCs w:val="24"/>
+        </w:rPr>
+        <w:fldChar w:fldCharType="begin"/>
+      </w:r>
+      <w:r>
+        <w:rPr>
+          <w:rFonts w:ascii="Times New Roman" w:cs="Times New Roman" w:eastAsia="Times New Roman" w:hAnsi="Times New Roman"/>
+          <w:sz w:val="24"/>
+          <w:szCs w:val="24"/>
+        </w:rPr>
+        <w:instrText xml:space="preserve"> ADDIN ZOTERO_ITEM CSL_CITATION {"citationID": "AGEM26", "properties": {"formattedCitation": "(Bakker &amp; Demerouti, 2007; Demerouti et al., 2001)", "plainCitation": "(Bakker &amp; Demerouti, 2007; Demerouti et al., 2001)", "noteIndex": 0}, "citationItems": [{"id": "bakker", "uris": ["http://zotero.org/users/local/agemts/items/BAKKER"], "itemData": {"id": "bakker", "type": "article-journal", "author": [{"family": "Bakker", "given": "AB"}, {"family": "Demerouti", "given": "E"}], "title": "The Job Demands-Resources model: state of the art", "container-title": "Journal of Managerial Psychology", "container-title-short": "J Manag Psychol", "issued": {"date-parts": [[2007]]}, "volume": "22", "issue": "3", "page": "309-328", "DOI": "10.1108/02683940710733115"}}, {"id": "demerouti", "uris": ["http://zotero.org/users/local/agemts/items/DEMEROUTI"], "itemData": {"id": "demerouti", "type": "article-journal", "author": [{"family": "Demerouti", "given": "E"}, {"family": "Bakker", "given": "AB"}, {"family": "Nachreiner", "given": "F"}, {"family": "Schaufeli", "given": "WB"}], "title": "The job demands-resources model of burnout", "container-title": "Journal of Applied Psychology", "container-title-short": "J Appl Psychol", "issued": {"date-parts": [[2001]]}, "volume": "86", "issue": "3", "page": "499-512", "DOI": "10.1037/0021-9010.86.3.499"}}], "schema": "https://github.com/citation-style-language/schema/raw/master/csl-citation.json"} </w:instrText>
+      </w:r>
+      <w:r>
+        <w:rPr>
+          <w:rFonts w:ascii="Times New Roman" w:cs="Times New Roman" w:eastAsia="Times New Roman" w:hAnsi="Times New Roman"/>
+          <w:sz w:val="24"/>
+          <w:szCs w:val="24"/>
+        </w:rPr>
+        <w:fldChar w:fldCharType="separate"/>
+      </w:r>
+      <w:r>
+        <w:rPr>
+          <w:rFonts w:ascii="Times New Roman" w:cs="Times New Roman" w:eastAsia="Times New Roman" w:hAnsi="Times New Roman"/>
+          <w:sz w:val="24"/>
+          <w:szCs w:val="24"/>
+        </w:rPr>
+        <w:t xml:space="preserve">(Bakker &amp; Demerouti, 2007; Demerouti et al., 2001)</w:t>
+      </w:r>
+      <w:r>
+        <w:rPr>
+          <w:rFonts w:ascii="Times New Roman" w:cs="Times New Roman" w:eastAsia="Times New Roman" w:hAnsi="Times New Roman"/>
+          <w:sz w:val="24"/>
+          <w:szCs w:val="24"/>
+        </w:rPr>
+        <w:fldChar w:fldCharType="end"/>
+      </w:r>
+      <w:r>
+        <w:rPr>
+          <w:rFonts w:ascii="Times New Roman" w:cs="Times New Roman" w:eastAsia="Times New Roman" w:hAnsi="Times New Roman"/>
+          <w:sz w:val="24"/>
+          <w:szCs w:val="24"/>
+        </w:rPr>
+        <w:t xml:space="preserve">, and persistent low job control has predicted later major depression </w:t>
+      </w:r>
+      <w:r>
+        <w:rPr>
+          <w:rFonts w:ascii="Times New Roman" w:cs="Times New Roman" w:eastAsia="Times New Roman" w:hAnsi="Times New Roman"/>
+          <w:sz w:val="24"/>
+          <w:szCs w:val="24"/>
+        </w:rPr>
+        <w:fldChar w:fldCharType="begin"/>
+      </w:r>
+      <w:r>
+        <w:rPr>
+          <w:rFonts w:ascii="Times New Roman" w:cs="Times New Roman" w:eastAsia="Times New Roman" w:hAnsi="Times New Roman"/>
+          <w:sz w:val="24"/>
+          <w:szCs w:val="24"/>
+        </w:rPr>
+        <w:instrText xml:space="preserve"> ADDIN ZOTERO_ITEM CSL_CITATION {"citationID": "AGEM27", "properties": {"formattedCitation": "(Taouk et al., 2024)", "plainCitation": "(Taouk et al., 2024)", "noteIndex": 0}, "citationItems": [{"id": "taouk", "uris": ["http://zotero.org/users/local/agemts/items/TAOUK"], "itemData": {"type": "article-journal", "author": [{"family": "Taouk", "given": "Y"}, {"family": "Aitken", "given": "Z"}, {"family": "LaMontagne", "given": "AD"}, {"family": "King", "given": "T"}], "title": "Persistent low job control and subsequent major depression: a prospective cohort study of Australian working males", "container-title": "Social Science &amp; Medicine", "issued": {"date-parts": [[2024]]}, "volume": "359", "page": "117283", "DOI": "10.1016/j.socscimed.2024.117283", "PMID": "39232379", "id": "taouk"}}], "schema": "https://github.com/citation-style-language/schema/raw/master/csl-citation.json"} </w:instrText>
+      </w:r>
+      <w:r>
+        <w:rPr>
+          <w:rFonts w:ascii="Times New Roman" w:cs="Times New Roman" w:eastAsia="Times New Roman" w:hAnsi="Times New Roman"/>
+          <w:sz w:val="24"/>
+          <w:szCs w:val="24"/>
+        </w:rPr>
+        <w:fldChar w:fldCharType="separate"/>
+      </w:r>
+      <w:r>
+        <w:rPr>
+          <w:rFonts w:ascii="Times New Roman" w:cs="Times New Roman" w:eastAsia="Times New Roman" w:hAnsi="Times New Roman"/>
+          <w:sz w:val="24"/>
+          <w:szCs w:val="24"/>
+        </w:rPr>
+        <w:t xml:space="preserve">(Taouk et al., 2024)</w:t>
+      </w:r>
+      <w:r>
+        <w:rPr>
+          <w:rFonts w:ascii="Times New Roman" w:cs="Times New Roman" w:eastAsia="Times New Roman" w:hAnsi="Times New Roman"/>
+          <w:sz w:val="24"/>
+          <w:szCs w:val="24"/>
+        </w:rPr>
+        <w:fldChar w:fldCharType="end"/>
+      </w:r>
+      <w:r>
+        <w:rPr>
+          <w:rFonts w:ascii="Times New Roman" w:cs="Times New Roman" w:eastAsia="Times New Roman" w:hAnsi="Times New Roman"/>
+          <w:sz w:val="24"/>
+          <w:szCs w:val="24"/>
+        </w:rPr>
+        <w:t xml:space="preserve">. Interventions aimed at autonomy would therefore act on the work environment rather than on individual workers, and organizational level interventions of this kind can improve the psychosocial work environment and the health of employees (Aust et al., 2023). Among leaders, agreement that the burden of responsibility is high rose descriptively from 19% to 44%, a result that did not reach significance but could be followed in later waves. Repeating the same measurement after such interventions would close the cycle by showing whether the targeted indicators changed </w:t>
+      </w:r>
+      <w:r>
+        <w:rPr>
+          <w:rFonts w:ascii="Times New Roman" w:cs="Times New Roman" w:eastAsia="Times New Roman" w:hAnsi="Times New Roman"/>
+          <w:sz w:val="24"/>
+          <w:szCs w:val="24"/>
+        </w:rPr>
+        <w:fldChar w:fldCharType="begin"/>
+      </w:r>
+      <w:r>
+        <w:rPr>
+          <w:rFonts w:ascii="Times New Roman" w:cs="Times New Roman" w:eastAsia="Times New Roman" w:hAnsi="Times New Roman"/>
+          <w:sz w:val="24"/>
+          <w:szCs w:val="24"/>
+        </w:rPr>
+        <w:instrText xml:space="preserve"> ADDIN ZOTERO_ITEM CSL_CITATION {"citationID": "AGEM28", "properties": {"formattedCitation": "(International Organization for Standardization, 2021)", "plainCitation": "(International Organization for Standardization, 2021)", "noteIndex": 0}, "citationItems": [{"id": "iso", "uris": ["http://zotero.org/users/local/agemts/items/ISO"], "itemData": {"id": "iso", "type": "standard", "author": [{"literal": "International Organization for Standardization"}], "title": "Occupational health and safety management: Psychological health and safety at work: Guidelines for managing psychosocial risks (ISO Standard No. 45003:2021)", "publisher": "ISO", "publisher-place": "Geneva", "issued": {"date-parts": [[2021]]}, "URL": "https://www.iso.org/standard/64283.html"}}], "schema": "https://github.com/citation-style-language/schema/raw/master/csl-citation.json"} </w:instrText>
+      </w:r>
+      <w:r>
+        <w:rPr>
+          <w:rFonts w:ascii="Times New Roman" w:cs="Times New Roman" w:eastAsia="Times New Roman" w:hAnsi="Times New Roman"/>
+          <w:sz w:val="24"/>
+          <w:szCs w:val="24"/>
+        </w:rPr>
+        <w:fldChar w:fldCharType="separate"/>
+      </w:r>
+      <w:r>
+        <w:rPr>
+          <w:rFonts w:ascii="Times New Roman" w:cs="Times New Roman" w:eastAsia="Times New Roman" w:hAnsi="Times New Roman"/>
+          <w:sz w:val="24"/>
+          <w:szCs w:val="24"/>
+        </w:rPr>
+        <w:t xml:space="preserve">(International Organization for Standardization, 2021)</w:t>
+      </w:r>
+      <w:r>
+        <w:rPr>
+          <w:rFonts w:ascii="Times New Roman" w:cs="Times New Roman" w:eastAsia="Times New Roman" w:hAnsi="Times New Roman"/>
+          <w:sz w:val="24"/>
+          <w:szCs w:val="24"/>
+        </w:rPr>
+        <w:fldChar w:fldCharType="end"/>
+      </w:r>
+      <w:r>
+        <w:rPr>
+          <w:rFonts w:ascii="Times New Roman" w:cs="Times New Roman" w:eastAsia="Times New Roman" w:hAnsi="Times New Roman"/>
+          <w:sz w:val="24"/>
+          <w:szCs w:val="24"/>
+        </w:rPr>
+        <w:t xml:space="preserve">.</w:t>
+      </w:r>
+    </w:p>
+    <w:p>
+      <w:pPr>
+        <w:spacing w:after="0" w:line="480"/>
+        <w:ind w:firstLine="720"/>
+      </w:pPr>
+      <w:r>
+        <w:rPr>
+          <w:rFonts w:ascii="Times New Roman" w:cs="Times New Roman" w:eastAsia="Times New Roman" w:hAnsi="Times New Roman"/>
+          <w:sz w:val="24"/>
+          <w:szCs w:val="24"/>
+        </w:rPr>
         <w:t xml:space="preserve">The data also show three requirements for monitoring under NR-1. First, item wording must be fixed before the first wave, because changes between forms removed 12 of the 20 leader items from the comparison. Second, anonymous responses need a linking code, because without one changes in the composition of the workforce cannot be separated from changes within workers. Third, samples of about 20 leaders per wave yield odds ratio intervals too wide to detect anything but large shifts.</w:t>
       </w:r>
     </w:p>
@@ -5730,7 +5888,7 @@
           <w:sz w:val="24"/>
           <w:szCs w:val="24"/>
         </w:rPr>
-        <w:instrText xml:space="preserve"> ADDIN ZOTERO_ITEM CSL_CITATION {"citationID": "AGEM26", "properties": {"formattedCitation": "(Lima et al., 2026)", "plainCitation": "(Lima et al., 2026)", "noteIndex": 0}, "citationItems": [{"id": "lima", "uris": ["http://zotero.org/users/local/agemts/items/LIMA"], "itemData": {"type": "manuscript", "author": [{"family": "Lima", "given": "AT"}, {"family": "Haas", "given": "D"}, {"family": "Torreão", "given": "S"}, {"family": "Schiffer", "given": "H"}, {"family": "Anunciação", "given": "L"}], "title": "Psychosocial work factors and mental health symptoms under NR-1: a feasibility study", "genre": "Manuscript submitted for publication", "publisher": "Departamento de Psicologia, Pontifícia Universidade Católica do Rio de Janeiro", "issued": {"date-parts": [[2026]]}, "id": "lima"}}], "schema": "https://github.com/citation-style-language/schema/raw/master/csl-citation.json"} </w:instrText>
+        <w:instrText xml:space="preserve"> ADDIN ZOTERO_ITEM CSL_CITATION {"citationID": "AGEM29", "properties": {"formattedCitation": "(Lima et al., 2026)", "plainCitation": "(Lima et al., 2026)", "noteIndex": 0}, "citationItems": [{"id": "lima", "uris": ["http://zotero.org/users/local/agemts/items/LIMA"], "itemData": {"type": "manuscript", "author": [{"family": "Lima", "given": "AT"}, {"family": "Haas", "given": "D"}, {"family": "Torreão", "given": "S"}, {"family": "Schiffer", "given": "H"}, {"family": "Anunciação", "given": "L"}], "title": "Psychosocial work factors and mental health symptoms under NR-1: a feasibility study", "genre": "Manuscript submitted for publication", "publisher": "Departamento de Psicologia, Pontifícia Universidade Católica do Rio de Janeiro", "issued": {"date-parts": [[2026]]}, "id": "lima"}}], "schema": "https://github.com/citation-style-language/schema/raw/master/csl-citation.json"} </w:instrText>
       </w:r>
       <w:r>
         <w:rPr>
@@ -5778,7 +5936,7 @@
           <w:sz w:val="24"/>
           <w:szCs w:val="24"/>
         </w:rPr>
-        <w:instrText xml:space="preserve"> ADDIN ZOTERO_ITEM CSL_CITATION {"citationID": "AGEM27", "properties": {"formattedCitation": "(Podsakoff et al., 2003)", "plainCitation": "(Podsakoff et al., 2003)", "noteIndex": 0}, "citationItems": [{"id": "podsakoff", "uris": ["http://zotero.org/users/local/agemts/items/PODSAKOFF"], "itemData": {"id": "podsakoff", "type": "article-journal", "author": [{"family": "Podsakoff", "given": "PM"}, {"family": "MacKenzie", "given": "SB"}, {"family": "Lee", "given": "JY"}, {"family": "Podsakoff", "given": "NP"}], "title": "Common method biases in behavioral research: a critical review of the literature and recommended remedies", "container-title": "Journal of Applied Psychology", "container-title-short": "J Appl Psychol", "issued": {"date-parts": [[2003]]}, "volume": "88", "issue": "5", "page": "879-903", "DOI": "10.1037/0021-9010.88.5.879"}}], "schema": "https://github.com/citation-style-language/schema/raw/master/csl-citation.json"} </w:instrText>
+        <w:instrText xml:space="preserve"> ADDIN ZOTERO_ITEM CSL_CITATION {"citationID": "AGEM30", "properties": {"formattedCitation": "(Podsakoff et al., 2003)", "plainCitation": "(Podsakoff et al., 2003)", "noteIndex": 0}, "citationItems": [{"id": "podsakoff", "uris": ["http://zotero.org/users/local/agemts/items/PODSAKOFF"], "itemData": {"id": "podsakoff", "type": "article-journal", "author": [{"family": "Podsakoff", "given": "PM"}, {"family": "MacKenzie", "given": "SB"}, {"family": "Lee", "given": "JY"}, {"family": "Podsakoff", "given": "NP"}], "title": "Common method biases in behavioral research: a critical review of the literature and recommended remedies", "container-title": "Journal of Applied Psychology", "container-title-short": "J Appl Psychol", "issued": {"date-parts": [[2003]]}, "volume": "88", "issue": "5", "page": "879-903", "DOI": "10.1037/0021-9010.88.5.879"}}], "schema": "https://github.com/citation-style-language/schema/raw/master/csl-citation.json"} </w:instrText>
       </w:r>
       <w:r>
         <w:rPr>
@@ -5840,7 +5998,7 @@
           <w:sz w:val="24"/>
           <w:szCs w:val="24"/>
         </w:rPr>
-        <w:t xml:space="preserve">Future monitoring should fix item wording, use anonymous linking codes, include more waves and companies, and use validated scales. In this preliminary report, psychosocial risk indicators among leaders and employees of two Brazilian companies were largely stable over four to eight months, as expected given the short interval.</w:t>
+        <w:t xml:space="preserve">Future studies should implement interventions tailored to the risks identified in monitoring, and evaluate them with fixed item wording, anonymous linking codes, more waves and companies, validated scales and a comparison group. In this preliminary report, psychosocial risk indicators among leaders and employees of two Brazilian companies were largely stable over four to eight months, as expected given the short interval, and the decrease in autonomy identified a target for tailored organizational interventions.</w:t>
       </w:r>
     </w:p>
     <w:p>

</xml_diff>